<commit_message>
docs: retira a citacao de Akashi e Neches (artigo nao lido) e ajusta os limiares em 3.9 (v8)
Co-Authored-By: Claude Opus 5.5 <noreply@anthropic.com>
</commit_message>
<xml_diff>
--- a/Transicao_pre-projeto-para-TCC-Completo_TCC_Iluminacao_SP_v8.docx
+++ b/Transicao_pre-projeto-para-TCC-Completo_TCC_Iluminacao_SP_v8.docx
@@ -1368,7 +1368,7 @@
           <w:r>
             <w:fldChar w:fldCharType="separate"/>
           </w:r>
-          <w:hyperlink w:anchor="_Toc241779009" w:history="1">
+          <w:hyperlink w:anchor="_Toc241779166" w:history="1">
             <w:r>
               <w:rPr>
                 <w:rStyle w:val="Hyperlink"/>
@@ -1396,7 +1396,7 @@
                 <w:noProof/>
                 <w:webHidden/>
               </w:rPr>
-              <w:instrText xml:space="preserve"> PAGEREF _Toc241779009 \h </w:instrText>
+              <w:instrText xml:space="preserve"> PAGEREF _Toc241779166 \h </w:instrText>
             </w:r>
             <w:r>
               <w:rPr>
@@ -1441,7 +1441,7 @@
               <w14:ligatures w14:val="standardContextual"/>
             </w:rPr>
           </w:pPr>
-          <w:hyperlink w:anchor="_Toc241779010" w:history="1">
+          <w:hyperlink w:anchor="_Toc241779167" w:history="1">
             <w:r>
               <w:rPr>
                 <w:rStyle w:val="Hyperlink"/>
@@ -1469,7 +1469,7 @@
                 <w:noProof/>
                 <w:webHidden/>
               </w:rPr>
-              <w:instrText xml:space="preserve"> PAGEREF _Toc241779010 \h </w:instrText>
+              <w:instrText xml:space="preserve"> PAGEREF _Toc241779167 \h </w:instrText>
             </w:r>
             <w:r>
               <w:rPr>
@@ -1514,7 +1514,7 @@
               <w14:ligatures w14:val="standardContextual"/>
             </w:rPr>
           </w:pPr>
-          <w:hyperlink w:anchor="_Toc241779011" w:history="1">
+          <w:hyperlink w:anchor="_Toc241779168" w:history="1">
             <w:r>
               <w:rPr>
                 <w:rStyle w:val="Hyperlink"/>
@@ -1542,7 +1542,7 @@
                 <w:noProof/>
                 <w:webHidden/>
               </w:rPr>
-              <w:instrText xml:space="preserve"> PAGEREF _Toc241779011 \h </w:instrText>
+              <w:instrText xml:space="preserve"> PAGEREF _Toc241779168 \h </w:instrText>
             </w:r>
             <w:r>
               <w:rPr>
@@ -1587,7 +1587,7 @@
               <w14:ligatures w14:val="standardContextual"/>
             </w:rPr>
           </w:pPr>
-          <w:hyperlink w:anchor="_Toc241779012" w:history="1">
+          <w:hyperlink w:anchor="_Toc241779169" w:history="1">
             <w:r>
               <w:rPr>
                 <w:rStyle w:val="Hyperlink"/>
@@ -1615,7 +1615,7 @@
                 <w:noProof/>
                 <w:webHidden/>
               </w:rPr>
-              <w:instrText xml:space="preserve"> PAGEREF _Toc241779012 \h </w:instrText>
+              <w:instrText xml:space="preserve"> PAGEREF _Toc241779169 \h </w:instrText>
             </w:r>
             <w:r>
               <w:rPr>
@@ -1660,7 +1660,7 @@
               <w14:ligatures w14:val="standardContextual"/>
             </w:rPr>
           </w:pPr>
-          <w:hyperlink w:anchor="_Toc241779013" w:history="1">
+          <w:hyperlink w:anchor="_Toc241779170" w:history="1">
             <w:r>
               <w:rPr>
                 <w:rStyle w:val="Hyperlink"/>
@@ -1688,7 +1688,7 @@
                 <w:noProof/>
                 <w:webHidden/>
               </w:rPr>
-              <w:instrText xml:space="preserve"> PAGEREF _Toc241779013 \h </w:instrText>
+              <w:instrText xml:space="preserve"> PAGEREF _Toc241779170 \h </w:instrText>
             </w:r>
             <w:r>
               <w:rPr>
@@ -1733,7 +1733,7 @@
               <w14:ligatures w14:val="standardContextual"/>
             </w:rPr>
           </w:pPr>
-          <w:hyperlink w:anchor="_Toc241779014" w:history="1">
+          <w:hyperlink w:anchor="_Toc241779171" w:history="1">
             <w:r>
               <w:rPr>
                 <w:rStyle w:val="Hyperlink"/>
@@ -1761,7 +1761,7 @@
                 <w:noProof/>
                 <w:webHidden/>
               </w:rPr>
-              <w:instrText xml:space="preserve"> PAGEREF _Toc241779014 \h </w:instrText>
+              <w:instrText xml:space="preserve"> PAGEREF _Toc241779171 \h </w:instrText>
             </w:r>
             <w:r>
               <w:rPr>
@@ -1806,7 +1806,7 @@
               <w14:ligatures w14:val="standardContextual"/>
             </w:rPr>
           </w:pPr>
-          <w:hyperlink w:anchor="_Toc241779015" w:history="1">
+          <w:hyperlink w:anchor="_Toc241779172" w:history="1">
             <w:r>
               <w:rPr>
                 <w:rStyle w:val="Hyperlink"/>
@@ -1834,7 +1834,7 @@
                 <w:noProof/>
                 <w:webHidden/>
               </w:rPr>
-              <w:instrText xml:space="preserve"> PAGEREF _Toc241779015 \h </w:instrText>
+              <w:instrText xml:space="preserve"> PAGEREF _Toc241779172 \h </w:instrText>
             </w:r>
             <w:r>
               <w:rPr>
@@ -1879,7 +1879,7 @@
               <w14:ligatures w14:val="standardContextual"/>
             </w:rPr>
           </w:pPr>
-          <w:hyperlink w:anchor="_Toc241779016" w:history="1">
+          <w:hyperlink w:anchor="_Toc241779173" w:history="1">
             <w:r>
               <w:rPr>
                 <w:rStyle w:val="Hyperlink"/>
@@ -1907,7 +1907,7 @@
                 <w:noProof/>
                 <w:webHidden/>
               </w:rPr>
-              <w:instrText xml:space="preserve"> PAGEREF _Toc241779016 \h </w:instrText>
+              <w:instrText xml:space="preserve"> PAGEREF _Toc241779173 \h </w:instrText>
             </w:r>
             <w:r>
               <w:rPr>
@@ -1952,7 +1952,7 @@
               <w14:ligatures w14:val="standardContextual"/>
             </w:rPr>
           </w:pPr>
-          <w:hyperlink w:anchor="_Toc241779017" w:history="1">
+          <w:hyperlink w:anchor="_Toc241779174" w:history="1">
             <w:r>
               <w:rPr>
                 <w:rStyle w:val="Hyperlink"/>
@@ -1980,7 +1980,7 @@
                 <w:noProof/>
                 <w:webHidden/>
               </w:rPr>
-              <w:instrText xml:space="preserve"> PAGEREF _Toc241779017 \h </w:instrText>
+              <w:instrText xml:space="preserve"> PAGEREF _Toc241779174 \h </w:instrText>
             </w:r>
             <w:r>
               <w:rPr>
@@ -2025,7 +2025,7 @@
               <w14:ligatures w14:val="standardContextual"/>
             </w:rPr>
           </w:pPr>
-          <w:hyperlink w:anchor="_Toc241779018" w:history="1">
+          <w:hyperlink w:anchor="_Toc241779175" w:history="1">
             <w:r>
               <w:rPr>
                 <w:rStyle w:val="Hyperlink"/>
@@ -2053,7 +2053,7 @@
                 <w:noProof/>
                 <w:webHidden/>
               </w:rPr>
-              <w:instrText xml:space="preserve"> PAGEREF _Toc241779018 \h </w:instrText>
+              <w:instrText xml:space="preserve"> PAGEREF _Toc241779175 \h </w:instrText>
             </w:r>
             <w:r>
               <w:rPr>
@@ -2098,7 +2098,7 @@
               <w14:ligatures w14:val="standardContextual"/>
             </w:rPr>
           </w:pPr>
-          <w:hyperlink w:anchor="_Toc241779019" w:history="1">
+          <w:hyperlink w:anchor="_Toc241779176" w:history="1">
             <w:r>
               <w:rPr>
                 <w:rStyle w:val="Hyperlink"/>
@@ -2126,7 +2126,7 @@
                 <w:noProof/>
                 <w:webHidden/>
               </w:rPr>
-              <w:instrText xml:space="preserve"> PAGEREF _Toc241779019 \h </w:instrText>
+              <w:instrText xml:space="preserve"> PAGEREF _Toc241779176 \h </w:instrText>
             </w:r>
             <w:r>
               <w:rPr>
@@ -2171,7 +2171,7 @@
               <w14:ligatures w14:val="standardContextual"/>
             </w:rPr>
           </w:pPr>
-          <w:hyperlink w:anchor="_Toc241779020" w:history="1">
+          <w:hyperlink w:anchor="_Toc241779177" w:history="1">
             <w:r>
               <w:rPr>
                 <w:rStyle w:val="Hyperlink"/>
@@ -2199,7 +2199,7 @@
                 <w:noProof/>
                 <w:webHidden/>
               </w:rPr>
-              <w:instrText xml:space="preserve"> PAGEREF _Toc241779020 \h </w:instrText>
+              <w:instrText xml:space="preserve"> PAGEREF _Toc241779177 \h </w:instrText>
             </w:r>
             <w:r>
               <w:rPr>
@@ -2244,7 +2244,7 @@
               <w14:ligatures w14:val="standardContextual"/>
             </w:rPr>
           </w:pPr>
-          <w:hyperlink w:anchor="_Toc241779021" w:history="1">
+          <w:hyperlink w:anchor="_Toc241779178" w:history="1">
             <w:r>
               <w:rPr>
                 <w:rStyle w:val="Hyperlink"/>
@@ -2272,7 +2272,7 @@
                 <w:noProof/>
                 <w:webHidden/>
               </w:rPr>
-              <w:instrText xml:space="preserve"> PAGEREF _Toc241779021 \h </w:instrText>
+              <w:instrText xml:space="preserve"> PAGEREF _Toc241779178 \h </w:instrText>
             </w:r>
             <w:r>
               <w:rPr>
@@ -2319,7 +2319,7 @@
               <w14:ligatures w14:val="standardContextual"/>
             </w:rPr>
           </w:pPr>
-          <w:hyperlink w:anchor="_Toc241779022" w:history="1">
+          <w:hyperlink w:anchor="_Toc241779179" w:history="1">
             <w:r>
               <w:rPr>
                 <w:rStyle w:val="Hyperlink"/>
@@ -2347,7 +2347,7 @@
                 <w:noProof/>
                 <w:webHidden/>
               </w:rPr>
-              <w:instrText xml:space="preserve"> PAGEREF _Toc241779022 \h </w:instrText>
+              <w:instrText xml:space="preserve"> PAGEREF _Toc241779179 \h </w:instrText>
             </w:r>
             <w:r>
               <w:rPr>
@@ -2392,7 +2392,7 @@
               <w14:ligatures w14:val="standardContextual"/>
             </w:rPr>
           </w:pPr>
-          <w:hyperlink w:anchor="_Toc241779023" w:history="1">
+          <w:hyperlink w:anchor="_Toc241779180" w:history="1">
             <w:r>
               <w:rPr>
                 <w:rStyle w:val="Hyperlink"/>
@@ -2420,7 +2420,7 @@
                 <w:noProof/>
                 <w:webHidden/>
               </w:rPr>
-              <w:instrText xml:space="preserve"> PAGEREF _Toc241779023 \h </w:instrText>
+              <w:instrText xml:space="preserve"> PAGEREF _Toc241779180 \h </w:instrText>
             </w:r>
             <w:r>
               <w:rPr>
@@ -2465,7 +2465,7 @@
               <w14:ligatures w14:val="standardContextual"/>
             </w:rPr>
           </w:pPr>
-          <w:hyperlink w:anchor="_Toc241779024" w:history="1">
+          <w:hyperlink w:anchor="_Toc241779181" w:history="1">
             <w:r>
               <w:rPr>
                 <w:rStyle w:val="Hyperlink"/>
@@ -2493,7 +2493,7 @@
                 <w:noProof/>
                 <w:webHidden/>
               </w:rPr>
-              <w:instrText xml:space="preserve"> PAGEREF _Toc241779024 \h </w:instrText>
+              <w:instrText xml:space="preserve"> PAGEREF _Toc241779181 \h </w:instrText>
             </w:r>
             <w:r>
               <w:rPr>
@@ -2538,7 +2538,7 @@
               <w14:ligatures w14:val="standardContextual"/>
             </w:rPr>
           </w:pPr>
-          <w:hyperlink w:anchor="_Toc241779025" w:history="1">
+          <w:hyperlink w:anchor="_Toc241779182" w:history="1">
             <w:r>
               <w:rPr>
                 <w:rStyle w:val="Hyperlink"/>
@@ -2566,7 +2566,7 @@
                 <w:noProof/>
                 <w:webHidden/>
               </w:rPr>
-              <w:instrText xml:space="preserve"> PAGEREF _Toc241779025 \h </w:instrText>
+              <w:instrText xml:space="preserve"> PAGEREF _Toc241779182 \h </w:instrText>
             </w:r>
             <w:r>
               <w:rPr>
@@ -2611,7 +2611,7 @@
               <w14:ligatures w14:val="standardContextual"/>
             </w:rPr>
           </w:pPr>
-          <w:hyperlink w:anchor="_Toc241779026" w:history="1">
+          <w:hyperlink w:anchor="_Toc241779183" w:history="1">
             <w:r>
               <w:rPr>
                 <w:rStyle w:val="Hyperlink"/>
@@ -2639,7 +2639,7 @@
                 <w:noProof/>
                 <w:webHidden/>
               </w:rPr>
-              <w:instrText xml:space="preserve"> PAGEREF _Toc241779026 \h </w:instrText>
+              <w:instrText xml:space="preserve"> PAGEREF _Toc241779183 \h </w:instrText>
             </w:r>
             <w:r>
               <w:rPr>
@@ -2684,7 +2684,7 @@
               <w14:ligatures w14:val="standardContextual"/>
             </w:rPr>
           </w:pPr>
-          <w:hyperlink w:anchor="_Toc241779027" w:history="1">
+          <w:hyperlink w:anchor="_Toc241779184" w:history="1">
             <w:r>
               <w:rPr>
                 <w:rStyle w:val="Hyperlink"/>
@@ -2712,7 +2712,7 @@
                 <w:noProof/>
                 <w:webHidden/>
               </w:rPr>
-              <w:instrText xml:space="preserve"> PAGEREF _Toc241779027 \h </w:instrText>
+              <w:instrText xml:space="preserve"> PAGEREF _Toc241779184 \h </w:instrText>
             </w:r>
             <w:r>
               <w:rPr>
@@ -2757,7 +2757,7 @@
               <w14:ligatures w14:val="standardContextual"/>
             </w:rPr>
           </w:pPr>
-          <w:hyperlink w:anchor="_Toc241779028" w:history="1">
+          <w:hyperlink w:anchor="_Toc241779185" w:history="1">
             <w:r>
               <w:rPr>
                 <w:rStyle w:val="Hyperlink"/>
@@ -2785,7 +2785,7 @@
                 <w:noProof/>
                 <w:webHidden/>
               </w:rPr>
-              <w:instrText xml:space="preserve"> PAGEREF _Toc241779028 \h </w:instrText>
+              <w:instrText xml:space="preserve"> PAGEREF _Toc241779185 \h </w:instrText>
             </w:r>
             <w:r>
               <w:rPr>
@@ -2830,7 +2830,7 @@
               <w14:ligatures w14:val="standardContextual"/>
             </w:rPr>
           </w:pPr>
-          <w:hyperlink w:anchor="_Toc241779029" w:history="1">
+          <w:hyperlink w:anchor="_Toc241779186" w:history="1">
             <w:r>
               <w:rPr>
                 <w:rStyle w:val="Hyperlink"/>
@@ -2858,7 +2858,7 @@
                 <w:noProof/>
                 <w:webHidden/>
               </w:rPr>
-              <w:instrText xml:space="preserve"> PAGEREF _Toc241779029 \h </w:instrText>
+              <w:instrText xml:space="preserve"> PAGEREF _Toc241779186 \h </w:instrText>
             </w:r>
             <w:r>
               <w:rPr>
@@ -2903,7 +2903,7 @@
               <w14:ligatures w14:val="standardContextual"/>
             </w:rPr>
           </w:pPr>
-          <w:hyperlink w:anchor="_Toc241779030" w:history="1">
+          <w:hyperlink w:anchor="_Toc241779187" w:history="1">
             <w:r>
               <w:rPr>
                 <w:rStyle w:val="Hyperlink"/>
@@ -2931,7 +2931,7 @@
                 <w:noProof/>
                 <w:webHidden/>
               </w:rPr>
-              <w:instrText xml:space="preserve"> PAGEREF _Toc241779030 \h </w:instrText>
+              <w:instrText xml:space="preserve"> PAGEREF _Toc241779187 \h </w:instrText>
             </w:r>
             <w:r>
               <w:rPr>
@@ -2976,7 +2976,7 @@
               <w14:ligatures w14:val="standardContextual"/>
             </w:rPr>
           </w:pPr>
-          <w:hyperlink w:anchor="_Toc241779031" w:history="1">
+          <w:hyperlink w:anchor="_Toc241779188" w:history="1">
             <w:r>
               <w:rPr>
                 <w:rStyle w:val="Hyperlink"/>
@@ -3004,7 +3004,7 @@
                 <w:noProof/>
                 <w:webHidden/>
               </w:rPr>
-              <w:instrText xml:space="preserve"> PAGEREF _Toc241779031 \h </w:instrText>
+              <w:instrText xml:space="preserve"> PAGEREF _Toc241779188 \h </w:instrText>
             </w:r>
             <w:r>
               <w:rPr>
@@ -3049,7 +3049,7 @@
               <w14:ligatures w14:val="standardContextual"/>
             </w:rPr>
           </w:pPr>
-          <w:hyperlink w:anchor="_Toc241779032" w:history="1">
+          <w:hyperlink w:anchor="_Toc241779189" w:history="1">
             <w:r>
               <w:rPr>
                 <w:rStyle w:val="Hyperlink"/>
@@ -3077,7 +3077,7 @@
                 <w:noProof/>
                 <w:webHidden/>
               </w:rPr>
-              <w:instrText xml:space="preserve"> PAGEREF _Toc241779032 \h </w:instrText>
+              <w:instrText xml:space="preserve"> PAGEREF _Toc241779189 \h </w:instrText>
             </w:r>
             <w:r>
               <w:rPr>
@@ -3124,7 +3124,7 @@
               <w14:ligatures w14:val="standardContextual"/>
             </w:rPr>
           </w:pPr>
-          <w:hyperlink w:anchor="_Toc241779033" w:history="1">
+          <w:hyperlink w:anchor="_Toc241779190" w:history="1">
             <w:r>
               <w:rPr>
                 <w:rStyle w:val="Hyperlink"/>
@@ -3152,7 +3152,7 @@
                 <w:noProof/>
                 <w:webHidden/>
               </w:rPr>
-              <w:instrText xml:space="preserve"> PAGEREF _Toc241779033 \h </w:instrText>
+              <w:instrText xml:space="preserve"> PAGEREF _Toc241779190 \h </w:instrText>
             </w:r>
             <w:r>
               <w:rPr>
@@ -3197,7 +3197,7 @@
               <w14:ligatures w14:val="standardContextual"/>
             </w:rPr>
           </w:pPr>
-          <w:hyperlink w:anchor="_Toc241779034" w:history="1">
+          <w:hyperlink w:anchor="_Toc241779191" w:history="1">
             <w:r>
               <w:rPr>
                 <w:rStyle w:val="Hyperlink"/>
@@ -3225,7 +3225,7 @@
                 <w:noProof/>
                 <w:webHidden/>
               </w:rPr>
-              <w:instrText xml:space="preserve"> PAGEREF _Toc241779034 \h </w:instrText>
+              <w:instrText xml:space="preserve"> PAGEREF _Toc241779191 \h </w:instrText>
             </w:r>
             <w:r>
               <w:rPr>
@@ -3270,7 +3270,7 @@
               <w14:ligatures w14:val="standardContextual"/>
             </w:rPr>
           </w:pPr>
-          <w:hyperlink w:anchor="_Toc241779035" w:history="1">
+          <w:hyperlink w:anchor="_Toc241779192" w:history="1">
             <w:r>
               <w:rPr>
                 <w:rStyle w:val="Hyperlink"/>
@@ -3298,7 +3298,7 @@
                 <w:noProof/>
                 <w:webHidden/>
               </w:rPr>
-              <w:instrText xml:space="preserve"> PAGEREF _Toc241779035 \h </w:instrText>
+              <w:instrText xml:space="preserve"> PAGEREF _Toc241779192 \h </w:instrText>
             </w:r>
             <w:r>
               <w:rPr>
@@ -3343,7 +3343,7 @@
               <w14:ligatures w14:val="standardContextual"/>
             </w:rPr>
           </w:pPr>
-          <w:hyperlink w:anchor="_Toc241779036" w:history="1">
+          <w:hyperlink w:anchor="_Toc241779193" w:history="1">
             <w:r>
               <w:rPr>
                 <w:rStyle w:val="Hyperlink"/>
@@ -3371,7 +3371,7 @@
                 <w:noProof/>
                 <w:webHidden/>
               </w:rPr>
-              <w:instrText xml:space="preserve"> PAGEREF _Toc241779036 \h </w:instrText>
+              <w:instrText xml:space="preserve"> PAGEREF _Toc241779193 \h </w:instrText>
             </w:r>
             <w:r>
               <w:rPr>
@@ -3416,7 +3416,7 @@
               <w14:ligatures w14:val="standardContextual"/>
             </w:rPr>
           </w:pPr>
-          <w:hyperlink w:anchor="_Toc241779037" w:history="1">
+          <w:hyperlink w:anchor="_Toc241779194" w:history="1">
             <w:r>
               <w:rPr>
                 <w:rStyle w:val="Hyperlink"/>
@@ -3444,7 +3444,7 @@
                 <w:noProof/>
                 <w:webHidden/>
               </w:rPr>
-              <w:instrText xml:space="preserve"> PAGEREF _Toc241779037 \h </w:instrText>
+              <w:instrText xml:space="preserve"> PAGEREF _Toc241779194 \h </w:instrText>
             </w:r>
             <w:r>
               <w:rPr>
@@ -3489,7 +3489,7 @@
               <w14:ligatures w14:val="standardContextual"/>
             </w:rPr>
           </w:pPr>
-          <w:hyperlink w:anchor="_Toc241779038" w:history="1">
+          <w:hyperlink w:anchor="_Toc241779195" w:history="1">
             <w:r>
               <w:rPr>
                 <w:rStyle w:val="Hyperlink"/>
@@ -3517,7 +3517,7 @@
                 <w:noProof/>
                 <w:webHidden/>
               </w:rPr>
-              <w:instrText xml:space="preserve"> PAGEREF _Toc241779038 \h </w:instrText>
+              <w:instrText xml:space="preserve"> PAGEREF _Toc241779195 \h </w:instrText>
             </w:r>
             <w:r>
               <w:rPr>
@@ -3562,7 +3562,7 @@
               <w14:ligatures w14:val="standardContextual"/>
             </w:rPr>
           </w:pPr>
-          <w:hyperlink w:anchor="_Toc241779039" w:history="1">
+          <w:hyperlink w:anchor="_Toc241779196" w:history="1">
             <w:r>
               <w:rPr>
                 <w:rStyle w:val="Hyperlink"/>
@@ -3590,7 +3590,7 @@
                 <w:noProof/>
                 <w:webHidden/>
               </w:rPr>
-              <w:instrText xml:space="preserve"> PAGEREF _Toc241779039 \h </w:instrText>
+              <w:instrText xml:space="preserve"> PAGEREF _Toc241779196 \h </w:instrText>
             </w:r>
             <w:r>
               <w:rPr>
@@ -3635,7 +3635,7 @@
               <w14:ligatures w14:val="standardContextual"/>
             </w:rPr>
           </w:pPr>
-          <w:hyperlink w:anchor="_Toc241779040" w:history="1">
+          <w:hyperlink w:anchor="_Toc241779197" w:history="1">
             <w:r>
               <w:rPr>
                 <w:rStyle w:val="Hyperlink"/>
@@ -3663,7 +3663,7 @@
                 <w:noProof/>
                 <w:webHidden/>
               </w:rPr>
-              <w:instrText xml:space="preserve"> PAGEREF _Toc241779040 \h </w:instrText>
+              <w:instrText xml:space="preserve"> PAGEREF _Toc241779197 \h </w:instrText>
             </w:r>
             <w:r>
               <w:rPr>
@@ -3708,7 +3708,7 @@
               <w14:ligatures w14:val="standardContextual"/>
             </w:rPr>
           </w:pPr>
-          <w:hyperlink w:anchor="_Toc241779041" w:history="1">
+          <w:hyperlink w:anchor="_Toc241779198" w:history="1">
             <w:r>
               <w:rPr>
                 <w:rStyle w:val="Hyperlink"/>
@@ -3736,7 +3736,7 @@
                 <w:noProof/>
                 <w:webHidden/>
               </w:rPr>
-              <w:instrText xml:space="preserve"> PAGEREF _Toc241779041 \h </w:instrText>
+              <w:instrText xml:space="preserve"> PAGEREF _Toc241779198 \h </w:instrText>
             </w:r>
             <w:r>
               <w:rPr>
@@ -3781,7 +3781,7 @@
               <w14:ligatures w14:val="standardContextual"/>
             </w:rPr>
           </w:pPr>
-          <w:hyperlink w:anchor="_Toc241779042" w:history="1">
+          <w:hyperlink w:anchor="_Toc241779199" w:history="1">
             <w:r>
               <w:rPr>
                 <w:rStyle w:val="Hyperlink"/>
@@ -3809,7 +3809,7 @@
                 <w:noProof/>
                 <w:webHidden/>
               </w:rPr>
-              <w:instrText xml:space="preserve"> PAGEREF _Toc241779042 \h </w:instrText>
+              <w:instrText xml:space="preserve"> PAGEREF _Toc241779199 \h </w:instrText>
             </w:r>
             <w:r>
               <w:rPr>
@@ -3854,7 +3854,7 @@
               <w14:ligatures w14:val="standardContextual"/>
             </w:rPr>
           </w:pPr>
-          <w:hyperlink w:anchor="_Toc241779043" w:history="1">
+          <w:hyperlink w:anchor="_Toc241779200" w:history="1">
             <w:r>
               <w:rPr>
                 <w:rStyle w:val="Hyperlink"/>
@@ -3882,7 +3882,7 @@
                 <w:noProof/>
                 <w:webHidden/>
               </w:rPr>
-              <w:instrText xml:space="preserve"> PAGEREF _Toc241779043 \h </w:instrText>
+              <w:instrText xml:space="preserve"> PAGEREF _Toc241779200 \h </w:instrText>
             </w:r>
             <w:r>
               <w:rPr>
@@ -3927,7 +3927,7 @@
               <w14:ligatures w14:val="standardContextual"/>
             </w:rPr>
           </w:pPr>
-          <w:hyperlink w:anchor="_Toc241779044" w:history="1">
+          <w:hyperlink w:anchor="_Toc241779201" w:history="1">
             <w:r>
               <w:rPr>
                 <w:rStyle w:val="Hyperlink"/>
@@ -3955,7 +3955,7 @@
                 <w:noProof/>
                 <w:webHidden/>
               </w:rPr>
-              <w:instrText xml:space="preserve"> PAGEREF _Toc241779044 \h </w:instrText>
+              <w:instrText xml:space="preserve"> PAGEREF _Toc241779201 \h </w:instrText>
             </w:r>
             <w:r>
               <w:rPr>
@@ -4000,7 +4000,7 @@
               <w14:ligatures w14:val="standardContextual"/>
             </w:rPr>
           </w:pPr>
-          <w:hyperlink w:anchor="_Toc241779045" w:history="1">
+          <w:hyperlink w:anchor="_Toc241779202" w:history="1">
             <w:r>
               <w:rPr>
                 <w:rStyle w:val="Hyperlink"/>
@@ -4028,7 +4028,7 @@
                 <w:noProof/>
                 <w:webHidden/>
               </w:rPr>
-              <w:instrText xml:space="preserve"> PAGEREF _Toc241779045 \h </w:instrText>
+              <w:instrText xml:space="preserve"> PAGEREF _Toc241779202 \h </w:instrText>
             </w:r>
             <w:r>
               <w:rPr>
@@ -4073,7 +4073,7 @@
               <w14:ligatures w14:val="standardContextual"/>
             </w:rPr>
           </w:pPr>
-          <w:hyperlink w:anchor="_Toc241779046" w:history="1">
+          <w:hyperlink w:anchor="_Toc241779203" w:history="1">
             <w:r>
               <w:rPr>
                 <w:rStyle w:val="Hyperlink"/>
@@ -4101,7 +4101,7 @@
                 <w:noProof/>
                 <w:webHidden/>
               </w:rPr>
-              <w:instrText xml:space="preserve"> PAGEREF _Toc241779046 \h </w:instrText>
+              <w:instrText xml:space="preserve"> PAGEREF _Toc241779203 \h </w:instrText>
             </w:r>
             <w:r>
               <w:rPr>
@@ -4146,7 +4146,7 @@
               <w14:ligatures w14:val="standardContextual"/>
             </w:rPr>
           </w:pPr>
-          <w:hyperlink w:anchor="_Toc241779047" w:history="1">
+          <w:hyperlink w:anchor="_Toc241779204" w:history="1">
             <w:r>
               <w:rPr>
                 <w:rStyle w:val="Hyperlink"/>
@@ -4174,7 +4174,7 @@
                 <w:noProof/>
                 <w:webHidden/>
               </w:rPr>
-              <w:instrText xml:space="preserve"> PAGEREF _Toc241779047 \h </w:instrText>
+              <w:instrText xml:space="preserve"> PAGEREF _Toc241779204 \h </w:instrText>
             </w:r>
             <w:r>
               <w:rPr>
@@ -4219,7 +4219,7 @@
               <w14:ligatures w14:val="standardContextual"/>
             </w:rPr>
           </w:pPr>
-          <w:hyperlink w:anchor="_Toc241779048" w:history="1">
+          <w:hyperlink w:anchor="_Toc241779205" w:history="1">
             <w:r>
               <w:rPr>
                 <w:rStyle w:val="Hyperlink"/>
@@ -4247,7 +4247,7 @@
                 <w:noProof/>
                 <w:webHidden/>
               </w:rPr>
-              <w:instrText xml:space="preserve"> PAGEREF _Toc241779048 \h </w:instrText>
+              <w:instrText xml:space="preserve"> PAGEREF _Toc241779205 \h </w:instrText>
             </w:r>
             <w:r>
               <w:rPr>
@@ -4292,7 +4292,7 @@
               <w14:ligatures w14:val="standardContextual"/>
             </w:rPr>
           </w:pPr>
-          <w:hyperlink w:anchor="_Toc241779049" w:history="1">
+          <w:hyperlink w:anchor="_Toc241779206" w:history="1">
             <w:r>
               <w:rPr>
                 <w:rStyle w:val="Hyperlink"/>
@@ -4320,7 +4320,7 @@
                 <w:noProof/>
                 <w:webHidden/>
               </w:rPr>
-              <w:instrText xml:space="preserve"> PAGEREF _Toc241779049 \h </w:instrText>
+              <w:instrText xml:space="preserve"> PAGEREF _Toc241779206 \h </w:instrText>
             </w:r>
             <w:r>
               <w:rPr>
@@ -4365,7 +4365,7 @@
               <w14:ligatures w14:val="standardContextual"/>
             </w:rPr>
           </w:pPr>
-          <w:hyperlink w:anchor="_Toc241779050" w:history="1">
+          <w:hyperlink w:anchor="_Toc241779207" w:history="1">
             <w:r>
               <w:rPr>
                 <w:rStyle w:val="Hyperlink"/>
@@ -4393,7 +4393,7 @@
                 <w:noProof/>
                 <w:webHidden/>
               </w:rPr>
-              <w:instrText xml:space="preserve"> PAGEREF _Toc241779050 \h </w:instrText>
+              <w:instrText xml:space="preserve"> PAGEREF _Toc241779207 \h </w:instrText>
             </w:r>
             <w:r>
               <w:rPr>
@@ -4438,7 +4438,7 @@
               <w14:ligatures w14:val="standardContextual"/>
             </w:rPr>
           </w:pPr>
-          <w:hyperlink w:anchor="_Toc241779051" w:history="1">
+          <w:hyperlink w:anchor="_Toc241779208" w:history="1">
             <w:r>
               <w:rPr>
                 <w:rStyle w:val="Hyperlink"/>
@@ -4466,7 +4466,7 @@
                 <w:noProof/>
                 <w:webHidden/>
               </w:rPr>
-              <w:instrText xml:space="preserve"> PAGEREF _Toc241779051 \h </w:instrText>
+              <w:instrText xml:space="preserve"> PAGEREF _Toc241779208 \h </w:instrText>
             </w:r>
             <w:r>
               <w:rPr>
@@ -4513,7 +4513,7 @@
               <w14:ligatures w14:val="standardContextual"/>
             </w:rPr>
           </w:pPr>
-          <w:hyperlink w:anchor="_Toc241779052" w:history="1">
+          <w:hyperlink w:anchor="_Toc241779209" w:history="1">
             <w:r>
               <w:rPr>
                 <w:rStyle w:val="Hyperlink"/>
@@ -4541,7 +4541,7 @@
                 <w:noProof/>
                 <w:webHidden/>
               </w:rPr>
-              <w:instrText xml:space="preserve"> PAGEREF _Toc241779052 \h </w:instrText>
+              <w:instrText xml:space="preserve"> PAGEREF _Toc241779209 \h </w:instrText>
             </w:r>
             <w:r>
               <w:rPr>
@@ -4586,7 +4586,7 @@
               <w14:ligatures w14:val="standardContextual"/>
             </w:rPr>
           </w:pPr>
-          <w:hyperlink w:anchor="_Toc241779053" w:history="1">
+          <w:hyperlink w:anchor="_Toc241779210" w:history="1">
             <w:r>
               <w:rPr>
                 <w:rStyle w:val="Hyperlink"/>
@@ -4614,7 +4614,7 @@
                 <w:noProof/>
                 <w:webHidden/>
               </w:rPr>
-              <w:instrText xml:space="preserve"> PAGEREF _Toc241779053 \h </w:instrText>
+              <w:instrText xml:space="preserve"> PAGEREF _Toc241779210 \h </w:instrText>
             </w:r>
             <w:r>
               <w:rPr>
@@ -4659,7 +4659,7 @@
               <w14:ligatures w14:val="standardContextual"/>
             </w:rPr>
           </w:pPr>
-          <w:hyperlink w:anchor="_Toc241779054" w:history="1">
+          <w:hyperlink w:anchor="_Toc241779211" w:history="1">
             <w:r>
               <w:rPr>
                 <w:rStyle w:val="Hyperlink"/>
@@ -4687,7 +4687,7 @@
                 <w:noProof/>
                 <w:webHidden/>
               </w:rPr>
-              <w:instrText xml:space="preserve"> PAGEREF _Toc241779054 \h </w:instrText>
+              <w:instrText xml:space="preserve"> PAGEREF _Toc241779211 \h </w:instrText>
             </w:r>
             <w:r>
               <w:rPr>
@@ -4732,7 +4732,7 @@
               <w14:ligatures w14:val="standardContextual"/>
             </w:rPr>
           </w:pPr>
-          <w:hyperlink w:anchor="_Toc241779055" w:history="1">
+          <w:hyperlink w:anchor="_Toc241779212" w:history="1">
             <w:r>
               <w:rPr>
                 <w:rStyle w:val="Hyperlink"/>
@@ -4760,7 +4760,7 @@
                 <w:noProof/>
                 <w:webHidden/>
               </w:rPr>
-              <w:instrText xml:space="preserve"> PAGEREF _Toc241779055 \h </w:instrText>
+              <w:instrText xml:space="preserve"> PAGEREF _Toc241779212 \h </w:instrText>
             </w:r>
             <w:r>
               <w:rPr>
@@ -4805,7 +4805,7 @@
               <w14:ligatures w14:val="standardContextual"/>
             </w:rPr>
           </w:pPr>
-          <w:hyperlink w:anchor="_Toc241779056" w:history="1">
+          <w:hyperlink w:anchor="_Toc241779213" w:history="1">
             <w:r>
               <w:rPr>
                 <w:rStyle w:val="Hyperlink"/>
@@ -4833,7 +4833,7 @@
                 <w:noProof/>
                 <w:webHidden/>
               </w:rPr>
-              <w:instrText xml:space="preserve"> PAGEREF _Toc241779056 \h </w:instrText>
+              <w:instrText xml:space="preserve"> PAGEREF _Toc241779213 \h </w:instrText>
             </w:r>
             <w:r>
               <w:rPr>
@@ -4878,7 +4878,7 @@
               <w14:ligatures w14:val="standardContextual"/>
             </w:rPr>
           </w:pPr>
-          <w:hyperlink w:anchor="_Toc241779057" w:history="1">
+          <w:hyperlink w:anchor="_Toc241779214" w:history="1">
             <w:r>
               <w:rPr>
                 <w:rStyle w:val="Hyperlink"/>
@@ -4906,7 +4906,7 @@
                 <w:noProof/>
                 <w:webHidden/>
               </w:rPr>
-              <w:instrText xml:space="preserve"> PAGEREF _Toc241779057 \h </w:instrText>
+              <w:instrText xml:space="preserve"> PAGEREF _Toc241779214 \h </w:instrText>
             </w:r>
             <w:r>
               <w:rPr>
@@ -4951,7 +4951,7 @@
               <w14:ligatures w14:val="standardContextual"/>
             </w:rPr>
           </w:pPr>
-          <w:hyperlink w:anchor="_Toc241779058" w:history="1">
+          <w:hyperlink w:anchor="_Toc241779215" w:history="1">
             <w:r>
               <w:rPr>
                 <w:rStyle w:val="Hyperlink"/>
@@ -4979,7 +4979,7 @@
                 <w:noProof/>
                 <w:webHidden/>
               </w:rPr>
-              <w:instrText xml:space="preserve"> PAGEREF _Toc241779058 \h </w:instrText>
+              <w:instrText xml:space="preserve"> PAGEREF _Toc241779215 \h </w:instrText>
             </w:r>
             <w:r>
               <w:rPr>
@@ -5024,7 +5024,7 @@
               <w14:ligatures w14:val="standardContextual"/>
             </w:rPr>
           </w:pPr>
-          <w:hyperlink w:anchor="_Toc241779059" w:history="1">
+          <w:hyperlink w:anchor="_Toc241779216" w:history="1">
             <w:r>
               <w:rPr>
                 <w:rStyle w:val="Hyperlink"/>
@@ -5052,7 +5052,7 @@
                 <w:noProof/>
                 <w:webHidden/>
               </w:rPr>
-              <w:instrText xml:space="preserve"> PAGEREF _Toc241779059 \h </w:instrText>
+              <w:instrText xml:space="preserve"> PAGEREF _Toc241779216 \h </w:instrText>
             </w:r>
             <w:r>
               <w:rPr>
@@ -5097,7 +5097,7 @@
               <w14:ligatures w14:val="standardContextual"/>
             </w:rPr>
           </w:pPr>
-          <w:hyperlink w:anchor="_Toc241779060" w:history="1">
+          <w:hyperlink w:anchor="_Toc241779217" w:history="1">
             <w:r>
               <w:rPr>
                 <w:rStyle w:val="Hyperlink"/>
@@ -5125,7 +5125,7 @@
                 <w:noProof/>
                 <w:webHidden/>
               </w:rPr>
-              <w:instrText xml:space="preserve"> PAGEREF _Toc241779060 \h </w:instrText>
+              <w:instrText xml:space="preserve"> PAGEREF _Toc241779217 \h </w:instrText>
             </w:r>
             <w:r>
               <w:rPr>
@@ -5170,7 +5170,7 @@
               <w14:ligatures w14:val="standardContextual"/>
             </w:rPr>
           </w:pPr>
-          <w:hyperlink w:anchor="_Toc241779061" w:history="1">
+          <w:hyperlink w:anchor="_Toc241779218" w:history="1">
             <w:r>
               <w:rPr>
                 <w:rStyle w:val="Hyperlink"/>
@@ -5198,7 +5198,7 @@
                 <w:noProof/>
                 <w:webHidden/>
               </w:rPr>
-              <w:instrText xml:space="preserve"> PAGEREF _Toc241779061 \h </w:instrText>
+              <w:instrText xml:space="preserve"> PAGEREF _Toc241779218 \h </w:instrText>
             </w:r>
             <w:r>
               <w:rPr>
@@ -5243,7 +5243,7 @@
               <w14:ligatures w14:val="standardContextual"/>
             </w:rPr>
           </w:pPr>
-          <w:hyperlink w:anchor="_Toc241779062" w:history="1">
+          <w:hyperlink w:anchor="_Toc241779219" w:history="1">
             <w:r>
               <w:rPr>
                 <w:rStyle w:val="Hyperlink"/>
@@ -5271,7 +5271,7 @@
                 <w:noProof/>
                 <w:webHidden/>
               </w:rPr>
-              <w:instrText xml:space="preserve"> PAGEREF _Toc241779062 \h </w:instrText>
+              <w:instrText xml:space="preserve"> PAGEREF _Toc241779219 \h </w:instrText>
             </w:r>
             <w:r>
               <w:rPr>
@@ -5316,7 +5316,7 @@
               <w14:ligatures w14:val="standardContextual"/>
             </w:rPr>
           </w:pPr>
-          <w:hyperlink w:anchor="_Toc241779063" w:history="1">
+          <w:hyperlink w:anchor="_Toc241779220" w:history="1">
             <w:r>
               <w:rPr>
                 <w:rStyle w:val="Hyperlink"/>
@@ -5344,7 +5344,7 @@
                 <w:noProof/>
                 <w:webHidden/>
               </w:rPr>
-              <w:instrText xml:space="preserve"> PAGEREF _Toc241779063 \h </w:instrText>
+              <w:instrText xml:space="preserve"> PAGEREF _Toc241779220 \h </w:instrText>
             </w:r>
             <w:r>
               <w:rPr>
@@ -5389,7 +5389,7 @@
               <w14:ligatures w14:val="standardContextual"/>
             </w:rPr>
           </w:pPr>
-          <w:hyperlink w:anchor="_Toc241779064" w:history="1">
+          <w:hyperlink w:anchor="_Toc241779221" w:history="1">
             <w:r>
               <w:rPr>
                 <w:rStyle w:val="Hyperlink"/>
@@ -5417,7 +5417,7 @@
                 <w:noProof/>
                 <w:webHidden/>
               </w:rPr>
-              <w:instrText xml:space="preserve"> PAGEREF _Toc241779064 \h </w:instrText>
+              <w:instrText xml:space="preserve"> PAGEREF _Toc241779221 \h </w:instrText>
             </w:r>
             <w:r>
               <w:rPr>
@@ -5462,7 +5462,7 @@
               <w14:ligatures w14:val="standardContextual"/>
             </w:rPr>
           </w:pPr>
-          <w:hyperlink w:anchor="_Toc241779065" w:history="1">
+          <w:hyperlink w:anchor="_Toc241779222" w:history="1">
             <w:r>
               <w:rPr>
                 <w:rStyle w:val="Hyperlink"/>
@@ -5490,7 +5490,7 @@
                 <w:noProof/>
                 <w:webHidden/>
               </w:rPr>
-              <w:instrText xml:space="preserve"> PAGEREF _Toc241779065 \h </w:instrText>
+              <w:instrText xml:space="preserve"> PAGEREF _Toc241779222 \h </w:instrText>
             </w:r>
             <w:r>
               <w:rPr>
@@ -5535,7 +5535,7 @@
               <w14:ligatures w14:val="standardContextual"/>
             </w:rPr>
           </w:pPr>
-          <w:hyperlink w:anchor="_Toc241779066" w:history="1">
+          <w:hyperlink w:anchor="_Toc241779223" w:history="1">
             <w:r>
               <w:rPr>
                 <w:rStyle w:val="Hyperlink"/>
@@ -5563,7 +5563,7 @@
                 <w:noProof/>
                 <w:webHidden/>
               </w:rPr>
-              <w:instrText xml:space="preserve"> PAGEREF _Toc241779066 \h </w:instrText>
+              <w:instrText xml:space="preserve"> PAGEREF _Toc241779223 \h </w:instrText>
             </w:r>
             <w:r>
               <w:rPr>
@@ -5608,7 +5608,7 @@
               <w14:ligatures w14:val="standardContextual"/>
             </w:rPr>
           </w:pPr>
-          <w:hyperlink w:anchor="_Toc241779067" w:history="1">
+          <w:hyperlink w:anchor="_Toc241779224" w:history="1">
             <w:r>
               <w:rPr>
                 <w:rStyle w:val="Hyperlink"/>
@@ -5636,7 +5636,7 @@
                 <w:noProof/>
                 <w:webHidden/>
               </w:rPr>
-              <w:instrText xml:space="preserve"> PAGEREF _Toc241779067 \h </w:instrText>
+              <w:instrText xml:space="preserve"> PAGEREF _Toc241779224 \h </w:instrText>
             </w:r>
             <w:r>
               <w:rPr>
@@ -5683,7 +5683,7 @@
               <w14:ligatures w14:val="standardContextual"/>
             </w:rPr>
           </w:pPr>
-          <w:hyperlink w:anchor="_Toc241779068" w:history="1">
+          <w:hyperlink w:anchor="_Toc241779225" w:history="1">
             <w:r>
               <w:rPr>
                 <w:rStyle w:val="Hyperlink"/>
@@ -5711,7 +5711,7 @@
                 <w:noProof/>
                 <w:webHidden/>
               </w:rPr>
-              <w:instrText xml:space="preserve"> PAGEREF _Toc241779068 \h </w:instrText>
+              <w:instrText xml:space="preserve"> PAGEREF _Toc241779225 \h </w:instrText>
             </w:r>
             <w:r>
               <w:rPr>
@@ -5756,7 +5756,7 @@
               <w14:ligatures w14:val="standardContextual"/>
             </w:rPr>
           </w:pPr>
-          <w:hyperlink w:anchor="_Toc241779069" w:history="1">
+          <w:hyperlink w:anchor="_Toc241779226" w:history="1">
             <w:r>
               <w:rPr>
                 <w:rStyle w:val="Hyperlink"/>
@@ -5784,7 +5784,7 @@
                 <w:noProof/>
                 <w:webHidden/>
               </w:rPr>
-              <w:instrText xml:space="preserve"> PAGEREF _Toc241779069 \h </w:instrText>
+              <w:instrText xml:space="preserve"> PAGEREF _Toc241779226 \h </w:instrText>
             </w:r>
             <w:r>
               <w:rPr>
@@ -5829,7 +5829,7 @@
               <w14:ligatures w14:val="standardContextual"/>
             </w:rPr>
           </w:pPr>
-          <w:hyperlink w:anchor="_Toc241779070" w:history="1">
+          <w:hyperlink w:anchor="_Toc241779227" w:history="1">
             <w:r>
               <w:rPr>
                 <w:rStyle w:val="Hyperlink"/>
@@ -5857,7 +5857,7 @@
                 <w:noProof/>
                 <w:webHidden/>
               </w:rPr>
-              <w:instrText xml:space="preserve"> PAGEREF _Toc241779070 \h </w:instrText>
+              <w:instrText xml:space="preserve"> PAGEREF _Toc241779227 \h </w:instrText>
             </w:r>
             <w:r>
               <w:rPr>
@@ -5902,7 +5902,7 @@
               <w14:ligatures w14:val="standardContextual"/>
             </w:rPr>
           </w:pPr>
-          <w:hyperlink w:anchor="_Toc241779071" w:history="1">
+          <w:hyperlink w:anchor="_Toc241779228" w:history="1">
             <w:r>
               <w:rPr>
                 <w:rStyle w:val="Hyperlink"/>
@@ -5930,7 +5930,7 @@
                 <w:noProof/>
                 <w:webHidden/>
               </w:rPr>
-              <w:instrText xml:space="preserve"> PAGEREF _Toc241779071 \h </w:instrText>
+              <w:instrText xml:space="preserve"> PAGEREF _Toc241779228 \h </w:instrText>
             </w:r>
             <w:r>
               <w:rPr>
@@ -5975,7 +5975,7 @@
               <w14:ligatures w14:val="standardContextual"/>
             </w:rPr>
           </w:pPr>
-          <w:hyperlink w:anchor="_Toc241779072" w:history="1">
+          <w:hyperlink w:anchor="_Toc241779229" w:history="1">
             <w:r>
               <w:rPr>
                 <w:rStyle w:val="Hyperlink"/>
@@ -6003,7 +6003,7 @@
                 <w:noProof/>
                 <w:webHidden/>
               </w:rPr>
-              <w:instrText xml:space="preserve"> PAGEREF _Toc241779072 \h </w:instrText>
+              <w:instrText xml:space="preserve"> PAGEREF _Toc241779229 \h </w:instrText>
             </w:r>
             <w:r>
               <w:rPr>
@@ -6048,7 +6048,7 @@
               <w14:ligatures w14:val="standardContextual"/>
             </w:rPr>
           </w:pPr>
-          <w:hyperlink w:anchor="_Toc241779073" w:history="1">
+          <w:hyperlink w:anchor="_Toc241779230" w:history="1">
             <w:r>
               <w:rPr>
                 <w:rStyle w:val="Hyperlink"/>
@@ -6076,7 +6076,7 @@
                 <w:noProof/>
                 <w:webHidden/>
               </w:rPr>
-              <w:instrText xml:space="preserve"> PAGEREF _Toc241779073 \h </w:instrText>
+              <w:instrText xml:space="preserve"> PAGEREF _Toc241779230 \h </w:instrText>
             </w:r>
             <w:r>
               <w:rPr>
@@ -6121,7 +6121,7 @@
               <w14:ligatures w14:val="standardContextual"/>
             </w:rPr>
           </w:pPr>
-          <w:hyperlink w:anchor="_Toc241779074" w:history="1">
+          <w:hyperlink w:anchor="_Toc241779231" w:history="1">
             <w:r>
               <w:rPr>
                 <w:rStyle w:val="Hyperlink"/>
@@ -6149,7 +6149,7 @@
                 <w:noProof/>
                 <w:webHidden/>
               </w:rPr>
-              <w:instrText xml:space="preserve"> PAGEREF _Toc241779074 \h </w:instrText>
+              <w:instrText xml:space="preserve"> PAGEREF _Toc241779231 \h </w:instrText>
             </w:r>
             <w:r>
               <w:rPr>
@@ -6196,7 +6196,7 @@
               <w14:ligatures w14:val="standardContextual"/>
             </w:rPr>
           </w:pPr>
-          <w:hyperlink w:anchor="_Toc241779075" w:history="1">
+          <w:hyperlink w:anchor="_Toc241779232" w:history="1">
             <w:r>
               <w:rPr>
                 <w:rStyle w:val="Hyperlink"/>
@@ -6224,7 +6224,7 @@
                 <w:noProof/>
                 <w:webHidden/>
               </w:rPr>
-              <w:instrText xml:space="preserve"> PAGEREF _Toc241779075 \h </w:instrText>
+              <w:instrText xml:space="preserve"> PAGEREF _Toc241779232 \h </w:instrText>
             </w:r>
             <w:r>
               <w:rPr>
@@ -6269,7 +6269,7 @@
               <w14:ligatures w14:val="standardContextual"/>
             </w:rPr>
           </w:pPr>
-          <w:hyperlink w:anchor="_Toc241779076" w:history="1">
+          <w:hyperlink w:anchor="_Toc241779233" w:history="1">
             <w:r>
               <w:rPr>
                 <w:rStyle w:val="Hyperlink"/>
@@ -6297,7 +6297,7 @@
                 <w:noProof/>
                 <w:webHidden/>
               </w:rPr>
-              <w:instrText xml:space="preserve"> PAGEREF _Toc241779076 \h </w:instrText>
+              <w:instrText xml:space="preserve"> PAGEREF _Toc241779233 \h </w:instrText>
             </w:r>
             <w:r>
               <w:rPr>
@@ -6342,7 +6342,7 @@
               <w14:ligatures w14:val="standardContextual"/>
             </w:rPr>
           </w:pPr>
-          <w:hyperlink w:anchor="_Toc241779077" w:history="1">
+          <w:hyperlink w:anchor="_Toc241779234" w:history="1">
             <w:r>
               <w:rPr>
                 <w:rStyle w:val="Hyperlink"/>
@@ -6370,7 +6370,7 @@
                 <w:noProof/>
                 <w:webHidden/>
               </w:rPr>
-              <w:instrText xml:space="preserve"> PAGEREF _Toc241779077 \h </w:instrText>
+              <w:instrText xml:space="preserve"> PAGEREF _Toc241779234 \h </w:instrText>
             </w:r>
             <w:r>
               <w:rPr>
@@ -6415,7 +6415,7 @@
               <w14:ligatures w14:val="standardContextual"/>
             </w:rPr>
           </w:pPr>
-          <w:hyperlink w:anchor="_Toc241779078" w:history="1">
+          <w:hyperlink w:anchor="_Toc241779235" w:history="1">
             <w:r>
               <w:rPr>
                 <w:rStyle w:val="Hyperlink"/>
@@ -6443,7 +6443,7 @@
                 <w:noProof/>
                 <w:webHidden/>
               </w:rPr>
-              <w:instrText xml:space="preserve"> PAGEREF _Toc241779078 \h </w:instrText>
+              <w:instrText xml:space="preserve"> PAGEREF _Toc241779235 \h </w:instrText>
             </w:r>
             <w:r>
               <w:rPr>
@@ -6488,7 +6488,7 @@
               <w14:ligatures w14:val="standardContextual"/>
             </w:rPr>
           </w:pPr>
-          <w:hyperlink w:anchor="_Toc241779079" w:history="1">
+          <w:hyperlink w:anchor="_Toc241779236" w:history="1">
             <w:r>
               <w:rPr>
                 <w:rStyle w:val="Hyperlink"/>
@@ -6516,7 +6516,7 @@
                 <w:noProof/>
                 <w:webHidden/>
               </w:rPr>
-              <w:instrText xml:space="preserve"> PAGEREF _Toc241779079 \h </w:instrText>
+              <w:instrText xml:space="preserve"> PAGEREF _Toc241779236 \h </w:instrText>
             </w:r>
             <w:r>
               <w:rPr>
@@ -6563,7 +6563,7 @@
               <w14:ligatures w14:val="standardContextual"/>
             </w:rPr>
           </w:pPr>
-          <w:hyperlink w:anchor="_Toc241779080" w:history="1">
+          <w:hyperlink w:anchor="_Toc241779237" w:history="1">
             <w:r>
               <w:rPr>
                 <w:rStyle w:val="Hyperlink"/>
@@ -6591,7 +6591,7 @@
                 <w:noProof/>
                 <w:webHidden/>
               </w:rPr>
-              <w:instrText xml:space="preserve"> PAGEREF _Toc241779080 \h </w:instrText>
+              <w:instrText xml:space="preserve"> PAGEREF _Toc241779237 \h </w:instrText>
             </w:r>
             <w:r>
               <w:rPr>
@@ -6636,7 +6636,7 @@
               <w14:ligatures w14:val="standardContextual"/>
             </w:rPr>
           </w:pPr>
-          <w:hyperlink w:anchor="_Toc241779081" w:history="1">
+          <w:hyperlink w:anchor="_Toc241779238" w:history="1">
             <w:r>
               <w:rPr>
                 <w:rStyle w:val="Hyperlink"/>
@@ -6664,7 +6664,7 @@
                 <w:noProof/>
                 <w:webHidden/>
               </w:rPr>
-              <w:instrText xml:space="preserve"> PAGEREF _Toc241779081 \h </w:instrText>
+              <w:instrText xml:space="preserve"> PAGEREF _Toc241779238 \h </w:instrText>
             </w:r>
             <w:r>
               <w:rPr>
@@ -6711,7 +6711,7 @@
               <w14:ligatures w14:val="standardContextual"/>
             </w:rPr>
           </w:pPr>
-          <w:hyperlink w:anchor="_Toc241779082" w:history="1">
+          <w:hyperlink w:anchor="_Toc241779239" w:history="1">
             <w:r>
               <w:rPr>
                 <w:rStyle w:val="Hyperlink"/>
@@ -6739,7 +6739,7 @@
                 <w:noProof/>
                 <w:webHidden/>
               </w:rPr>
-              <w:instrText xml:space="preserve"> PAGEREF _Toc241779082 \h </w:instrText>
+              <w:instrText xml:space="preserve"> PAGEREF _Toc241779239 \h </w:instrText>
             </w:r>
             <w:r>
               <w:rPr>
@@ -6786,7 +6786,7 @@
               <w14:ligatures w14:val="standardContextual"/>
             </w:rPr>
           </w:pPr>
-          <w:hyperlink w:anchor="_Toc241779083" w:history="1">
+          <w:hyperlink w:anchor="_Toc241779240" w:history="1">
             <w:r>
               <w:rPr>
                 <w:rStyle w:val="Hyperlink"/>
@@ -6814,7 +6814,7 @@
                 <w:noProof/>
                 <w:webHidden/>
               </w:rPr>
-              <w:instrText xml:space="preserve"> PAGEREF _Toc241779083 \h </w:instrText>
+              <w:instrText xml:space="preserve"> PAGEREF _Toc241779240 \h </w:instrText>
             </w:r>
             <w:r>
               <w:rPr>
@@ -6861,7 +6861,7 @@
               <w14:ligatures w14:val="standardContextual"/>
             </w:rPr>
           </w:pPr>
-          <w:hyperlink w:anchor="_Toc241779084" w:history="1">
+          <w:hyperlink w:anchor="_Toc241779241" w:history="1">
             <w:r>
               <w:rPr>
                 <w:rStyle w:val="Hyperlink"/>
@@ -6889,7 +6889,7 @@
                 <w:noProof/>
                 <w:webHidden/>
               </w:rPr>
-              <w:instrText xml:space="preserve"> PAGEREF _Toc241779084 \h </w:instrText>
+              <w:instrText xml:space="preserve"> PAGEREF _Toc241779241 \h </w:instrText>
             </w:r>
             <w:r>
               <w:rPr>
@@ -6948,7 +6948,7 @@
           <w:lang w:val="pt-BR"/>
         </w:rPr>
       </w:pPr>
-      <w:bookmarkStart w:id="0" w:name="_Toc241779009"/>
+      <w:bookmarkStart w:id="0" w:name="_Toc241779166"/>
       <w:r>
         <w:rPr>
           <w:lang w:val="pt-BR"/>
@@ -6966,7 +6966,7 @@
           <w:lang w:val="pt-BR"/>
         </w:rPr>
       </w:pPr>
-      <w:bookmarkStart w:id="1" w:name="_Toc241779010"/>
+      <w:bookmarkStart w:id="1" w:name="_Toc241779167"/>
       <w:r>
         <w:rPr>
           <w:lang w:val="pt-BR"/>
@@ -7031,7 +7031,7 @@
           <w:lang w:val="pt-BR"/>
         </w:rPr>
       </w:pPr>
-      <w:bookmarkStart w:id="2" w:name="_Toc241779011"/>
+      <w:bookmarkStart w:id="2" w:name="_Toc241779168"/>
       <w:r>
         <w:rPr>
           <w:lang w:val="pt-BR"/>
@@ -7064,7 +7064,7 @@
           <w:lang w:val="pt-BR"/>
         </w:rPr>
       </w:pPr>
-      <w:bookmarkStart w:id="3" w:name="_Toc241779012"/>
+      <w:bookmarkStart w:id="3" w:name="_Toc241779169"/>
       <w:r>
         <w:rPr>
           <w:lang w:val="pt-BR"/>
@@ -7120,7 +7120,7 @@
           <w:lang w:val="pt-BR"/>
         </w:rPr>
       </w:pPr>
-      <w:bookmarkStart w:id="4" w:name="_Toc241779013"/>
+      <w:bookmarkStart w:id="4" w:name="_Toc241779170"/>
       <w:r>
         <w:rPr>
           <w:lang w:val="pt-BR"/>
@@ -7169,7 +7169,7 @@
           <w:lang w:val="pt-BR"/>
         </w:rPr>
       </w:pPr>
-      <w:bookmarkStart w:id="5" w:name="_Toc241779014"/>
+      <w:bookmarkStart w:id="5" w:name="_Toc241779171"/>
       <w:r>
         <w:rPr>
           <w:lang w:val="pt-BR"/>
@@ -7235,7 +7235,7 @@
           <w:lang w:val="pt-BR"/>
         </w:rPr>
       </w:pPr>
-      <w:bookmarkStart w:id="6" w:name="_Toc241779015"/>
+      <w:bookmarkStart w:id="6" w:name="_Toc241779172"/>
       <w:r>
         <w:rPr>
           <w:lang w:val="pt-BR"/>
@@ -7317,7 +7317,7 @@
           <w:lang w:val="pt-BR"/>
         </w:rPr>
       </w:pPr>
-      <w:bookmarkStart w:id="7" w:name="_Toc241779016"/>
+      <w:bookmarkStart w:id="7" w:name="_Toc241779173"/>
       <w:r>
         <w:rPr>
           <w:lang w:val="pt-BR"/>
@@ -7433,7 +7433,7 @@
           <w:lang w:val="pt-BR"/>
         </w:rPr>
       </w:pPr>
-      <w:bookmarkStart w:id="8" w:name="_Toc241779017"/>
+      <w:bookmarkStart w:id="8" w:name="_Toc241779174"/>
       <w:r>
         <w:rPr>
           <w:lang w:val="pt-BR"/>
@@ -7450,7 +7450,7 @@
           <w:lang w:val="pt-BR"/>
         </w:rPr>
       </w:pPr>
-      <w:bookmarkStart w:id="9" w:name="_Toc241779018"/>
+      <w:bookmarkStart w:id="9" w:name="_Toc241779175"/>
       <w:r>
         <w:rPr>
           <w:lang w:val="pt-BR"/>
@@ -7483,7 +7483,7 @@
           <w:lang w:val="pt-BR"/>
         </w:rPr>
       </w:pPr>
-      <w:bookmarkStart w:id="10" w:name="_Toc241779019"/>
+      <w:bookmarkStart w:id="10" w:name="_Toc241779176"/>
       <w:r>
         <w:rPr>
           <w:lang w:val="pt-BR"/>
@@ -7697,7 +7697,7 @@
           <w:lang w:val="pt-BR"/>
         </w:rPr>
       </w:pPr>
-      <w:bookmarkStart w:id="11" w:name="_Toc241779020"/>
+      <w:bookmarkStart w:id="11" w:name="_Toc241779177"/>
       <w:r>
         <w:rPr>
           <w:lang w:val="pt-BR"/>
@@ -7817,7 +7817,7 @@
           <w:lang w:val="pt-BR"/>
         </w:rPr>
       </w:pPr>
-      <w:bookmarkStart w:id="12" w:name="_Toc241779021"/>
+      <w:bookmarkStart w:id="12" w:name="_Toc241779178"/>
       <w:r>
         <w:rPr>
           <w:lang w:val="pt-BR"/>
@@ -7868,7 +7868,7 @@
           <w:lang w:val="pt-BR"/>
         </w:rPr>
       </w:pPr>
-      <w:bookmarkStart w:id="13" w:name="_Toc241779022"/>
+      <w:bookmarkStart w:id="13" w:name="_Toc241779179"/>
       <w:r>
         <w:rPr>
           <w:lang w:val="pt-BR"/>
@@ -7886,7 +7886,7 @@
           <w:lang w:val="pt-BR"/>
         </w:rPr>
       </w:pPr>
-      <w:bookmarkStart w:id="14" w:name="_Toc241779023"/>
+      <w:bookmarkStart w:id="14" w:name="_Toc241779180"/>
       <w:r>
         <w:rPr>
           <w:lang w:val="pt-BR"/>
@@ -8006,7 +8006,7 @@
           <w:lang w:val="pt-BR"/>
         </w:rPr>
       </w:pPr>
-      <w:bookmarkStart w:id="15" w:name="_Toc241779024"/>
+      <w:bookmarkStart w:id="15" w:name="_Toc241779181"/>
       <w:r>
         <w:rPr>
           <w:lang w:val="pt-BR"/>
@@ -8165,7 +8165,7 @@
           <w:lang w:val="pt-BR"/>
         </w:rPr>
       </w:pPr>
-      <w:bookmarkStart w:id="16" w:name="_Toc241779025"/>
+      <w:bookmarkStart w:id="16" w:name="_Toc241779182"/>
       <w:r>
         <w:rPr>
           <w:lang w:val="pt-BR"/>
@@ -8857,7 +8857,7 @@
           <w:lang w:val="pt-BR"/>
         </w:rPr>
       </w:pPr>
-      <w:bookmarkStart w:id="17" w:name="_Toc241779026"/>
+      <w:bookmarkStart w:id="17" w:name="_Toc241779183"/>
       <w:r>
         <w:rPr>
           <w:lang w:val="pt-BR"/>
@@ -8939,7 +8939,7 @@
           <w:lang w:val="pt-BR"/>
         </w:rPr>
       </w:pPr>
-      <w:bookmarkStart w:id="18" w:name="_Toc241779027"/>
+      <w:bookmarkStart w:id="18" w:name="_Toc241779184"/>
       <w:r>
         <w:rPr>
           <w:lang w:val="pt-BR"/>
@@ -9082,7 +9082,7 @@
           <w:lang w:val="pt-BR"/>
         </w:rPr>
       </w:pPr>
-      <w:bookmarkStart w:id="19" w:name="_Toc241779028"/>
+      <w:bookmarkStart w:id="19" w:name="_Toc241779185"/>
       <w:r>
         <w:rPr>
           <w:lang w:val="pt-BR"/>
@@ -9186,7 +9186,7 @@
           <w:lang w:val="pt-BR"/>
         </w:rPr>
       </w:pPr>
-      <w:bookmarkStart w:id="20" w:name="_Toc241779029"/>
+      <w:bookmarkStart w:id="20" w:name="_Toc241779186"/>
       <w:r>
         <w:rPr>
           <w:lang w:val="pt-BR"/>
@@ -9274,7 +9274,7 @@
           <w:lang w:val="pt-BR"/>
         </w:rPr>
       </w:pPr>
-      <w:bookmarkStart w:id="21" w:name="_Toc241779030"/>
+      <w:bookmarkStart w:id="21" w:name="_Toc241779187"/>
       <w:r>
         <w:rPr>
           <w:lang w:val="pt-BR"/>
@@ -9417,7 +9417,7 @@
           <w:lang w:val="pt-BR"/>
         </w:rPr>
       </w:pPr>
-      <w:bookmarkStart w:id="22" w:name="_Toc241779031"/>
+      <w:bookmarkStart w:id="22" w:name="_Toc241779188"/>
       <w:r>
         <w:rPr>
           <w:lang w:val="pt-BR"/>
@@ -9537,7 +9537,7 @@
           <w:lang w:val="pt-BR"/>
         </w:rPr>
       </w:pPr>
-      <w:bookmarkStart w:id="23" w:name="_Toc241779032"/>
+      <w:bookmarkStart w:id="23" w:name="_Toc241779189"/>
       <w:r>
         <w:rPr>
           <w:lang w:val="pt-BR"/>
@@ -9643,7 +9643,7 @@
           <w:lang w:val="pt-BR"/>
         </w:rPr>
       </w:pPr>
-      <w:bookmarkStart w:id="24" w:name="_Toc241779033"/>
+      <w:bookmarkStart w:id="24" w:name="_Toc241779190"/>
       <w:r>
         <w:rPr>
           <w:lang w:val="pt-BR"/>
@@ -9661,7 +9661,7 @@
           <w:lang w:val="pt-BR"/>
         </w:rPr>
       </w:pPr>
-      <w:bookmarkStart w:id="25" w:name="_Toc241779034"/>
+      <w:bookmarkStart w:id="25" w:name="_Toc241779191"/>
       <w:r>
         <w:rPr>
           <w:lang w:val="pt-BR"/>
@@ -9694,7 +9694,7 @@
           <w:lang w:val="pt-BR"/>
         </w:rPr>
       </w:pPr>
-      <w:bookmarkStart w:id="26" w:name="_Toc241779035"/>
+      <w:bookmarkStart w:id="26" w:name="_Toc241779192"/>
       <w:r>
         <w:rPr>
           <w:lang w:val="pt-BR"/>
@@ -9917,7 +9917,7 @@
           <w:lang w:val="pt-BR"/>
         </w:rPr>
       </w:pPr>
-      <w:bookmarkStart w:id="27" w:name="_Toc241779036"/>
+      <w:bookmarkStart w:id="27" w:name="_Toc241779193"/>
       <w:r>
         <w:rPr>
           <w:lang w:val="pt-BR"/>
@@ -12070,7 +12070,7 @@
           <w:lang w:val="pt-BR"/>
         </w:rPr>
       </w:pPr>
-      <w:bookmarkStart w:id="28" w:name="_Toc241779037"/>
+      <w:bookmarkStart w:id="28" w:name="_Toc241779194"/>
       <w:r>
         <w:rPr>
           <w:lang w:val="pt-BR"/>
@@ -12736,7 +12736,7 @@
           <w:lang w:val="pt-BR"/>
         </w:rPr>
       </w:pPr>
-      <w:bookmarkStart w:id="29" w:name="_Toc241779038"/>
+      <w:bookmarkStart w:id="29" w:name="_Toc241779195"/>
       <w:r>
         <w:rPr>
           <w:lang w:val="pt-BR"/>
@@ -13460,7 +13460,7 @@
           <w:lang w:val="pt-BR"/>
         </w:rPr>
       </w:pPr>
-      <w:bookmarkStart w:id="30" w:name="_Toc241779039"/>
+      <w:bookmarkStart w:id="30" w:name="_Toc241779196"/>
       <w:r>
         <w:rPr>
           <w:lang w:val="pt-BR"/>
@@ -14288,7 +14288,7 @@
           <w:lang w:val="pt-BR"/>
         </w:rPr>
       </w:pPr>
-      <w:bookmarkStart w:id="31" w:name="_Toc241779040"/>
+      <w:bookmarkStart w:id="31" w:name="_Toc241779197"/>
       <w:r>
         <w:rPr>
           <w:lang w:val="pt-BR"/>
@@ -14350,7 +14350,7 @@
           <w:lang w:val="pt-BR"/>
         </w:rPr>
       </w:pPr>
-      <w:bookmarkStart w:id="32" w:name="_Toc241779041"/>
+      <w:bookmarkStart w:id="32" w:name="_Toc241779198"/>
       <w:r>
         <w:rPr>
           <w:lang w:val="pt-BR"/>
@@ -14506,7 +14506,7 @@
           <w:lang w:val="pt-BR"/>
         </w:rPr>
       </w:pPr>
-      <w:bookmarkStart w:id="33" w:name="_Toc241779042"/>
+      <w:bookmarkStart w:id="33" w:name="_Toc241779199"/>
       <w:r>
         <w:rPr>
           <w:lang w:val="pt-BR"/>
@@ -14630,7 +14630,7 @@
           <w:lang w:val="pt-BR"/>
         </w:rPr>
       </w:pPr>
-      <w:bookmarkStart w:id="34" w:name="_Toc241779043"/>
+      <w:bookmarkStart w:id="34" w:name="_Toc241779200"/>
       <w:r>
         <w:rPr>
           <w:lang w:val="pt-BR"/>
@@ -14644,7 +14644,7 @@
         <w:pStyle w:val="Heading3"/>
         <w:spacing w:before="320" w:after="200" w:line="360" w:lineRule="auto"/>
       </w:pPr>
-      <w:bookmarkStart w:id="35" w:name="_Toc241779044"/>
+      <w:bookmarkStart w:id="35" w:name="_Toc241779201"/>
       <w:r>
         <w:rPr>
           <w:lang w:val="pt-BR"/>
@@ -14758,7 +14758,7 @@
         <w:pStyle w:val="Heading3"/>
         <w:spacing w:before="320" w:after="200" w:line="360" w:lineRule="auto"/>
       </w:pPr>
-      <w:bookmarkStart w:id="36" w:name="_Toc241779045"/>
+      <w:bookmarkStart w:id="36" w:name="_Toc241779202"/>
       <w:r>
         <w:rPr>
           <w:lang w:val="pt-BR"/>
@@ -14887,7 +14887,7 @@
           <w:lang w:val="pt-BR"/>
         </w:rPr>
       </w:pPr>
-      <w:bookmarkStart w:id="37" w:name="_Toc241779046"/>
+      <w:bookmarkStart w:id="37" w:name="_Toc241779203"/>
       <w:r>
         <w:rPr>
           <w:lang w:val="pt-BR"/>
@@ -15041,7 +15041,7 @@
           <w:lang w:val="pt-BR"/>
         </w:rPr>
       </w:pPr>
-      <w:bookmarkStart w:id="38" w:name="_Toc241779047"/>
+      <w:bookmarkStart w:id="38" w:name="_Toc241779204"/>
       <w:r>
         <w:rPr>
           <w:lang w:val="pt-BR"/>
@@ -15822,7 +15822,7 @@
           <w:lang w:val="pt-BR"/>
         </w:rPr>
       </w:pPr>
-      <w:bookmarkStart w:id="39" w:name="_Toc241779048"/>
+      <w:bookmarkStart w:id="39" w:name="_Toc241779205"/>
       <w:r>
         <w:rPr>
           <w:lang w:val="pt-BR"/>
@@ -16372,7 +16372,7 @@
           <w:lang w:val="pt-BR"/>
         </w:rPr>
       </w:pPr>
-      <w:bookmarkStart w:id="40" w:name="_Toc241779049"/>
+      <w:bookmarkStart w:id="40" w:name="_Toc241779206"/>
       <w:r>
         <w:rPr>
           <w:lang w:val="pt-BR"/>
@@ -16553,14 +16553,14 @@
         <w:rPr>
           <w:lang w:val="pt-BR"/>
         </w:rPr>
-        <w:t xml:space="preserve">Um último confronto trata só da forma da resposta, com dado real de resolução sub-horária. São oito noites reais da série de 15 min de Zurique (3.6), do ano de teste, de quatro pontos sorteados, e três concorrentes com a mesma previsão e as mesmas regras: a inferência nebulosa, a tabela em degraus e uma tabela com histerese de descida, que sobe de faixa no tercil, na hora, e só desce quando o volume cai 0,05 abaixo dele — a correção simples que se aplicaria à tabela. Conta-se o número de passos do ciclo em que o nível emitido varia ao menos 15 % em relação ao anterior, limite inferior da faixa de 15 % a 20 % em que metade dos observadores, ocupados em tarefa, não detecta uma redução de iluminância (AKASHI; NECHES, 2004), e, </w:t>
+        <w:t xml:space="preserve">Um último confronto trata só da forma da resposta, com dado real de resolução sub-horária. São oito noites reais da série de 15 min de Zurique (3.6), do ano de teste, de quatro pontos sorteados, e três concorrentes com a mesma previsão e as mesmas regras: a inferência nebulosa, a tabela em degraus e uma tabela com histerese de descida, que sobe de faixa no tercil, na hora, e só desce quando o volume cai 0,05 abaixo dele — a correção simples que se aplicaria à tabela. Conta-se o número de passos do ciclo em que o nível emitido varia ao menos 6 % em relação ao anterior, valor acima do qual um aumento de iluminância é percebido por observador atento (SHIKAKURA; MORIKAWA; NAKAMURA, 2003), e, como limiar mais largo, ao menos </w:t>
       </w:r>
       <w:r>
         <w:rPr>
           <w:lang w:val="pt-BR"/>
         </w:rPr>
         <w:lastRenderedPageBreak/>
-        <w:t>como limiar rigoroso, ao menos 6 %, acima do qual um aumento é percebido por observador atento (SHIKAKURA; MORIKAWA; NAKAMURA, 2003). Os dois limiares provêm de estudos em ambiente de escritório, com iluminâncias muito superiores às de uma via, e o primeiro refere-se a reduções, ao passo que as mudanças aqui contadas são elevações; não se localizou valor medido para via pública. O critério, fixado antes da execução, considera a inferência nebulosa não substituível se apresentar ao menos 20 % menos mudanças perceptíveis que a melhor das tabelas, nos dois limiares, sem consumir mais de 2 pontos percentuais de energia além dela e sem mais minutos abaixo do nível pedido. Nesses cenários a previsão é a do modelo em operação, treinado com a série de Melbourne; sua precisão sobre os dados de Zurique não é avaliada, e ela é a mesma para os três concorrentes.</w:t>
+        <w:t>15 %, valor adotado pelos autores. O estudo de referência foi conduzido em ambiente de escritório, com iluminâncias muito superiores às de uma via; não se localizou valor medido para via pública. O critério, fixado antes da execução, considera a inferência nebulosa não substituível se apresentar ao menos 20 % menos mudanças perceptíveis que a melhor das tabelas, nos dois limiares, sem consumir mais de 2 pontos percentuais de energia além dela e sem mais minutos abaixo do nível pedido. Nesses cenários a previsão é a do modelo em operação, treinado com a série de Melbourne; sua precisão sobre os dados de Zurique não é avaliada, e ela é a mesma para os três concorrentes.</w:t>
       </w:r>
     </w:p>
     <w:p>
@@ -16616,7 +16616,7 @@
           <w:lang w:val="pt-BR"/>
         </w:rPr>
       </w:pPr>
-      <w:bookmarkStart w:id="41" w:name="_Toc241779050"/>
+      <w:bookmarkStart w:id="41" w:name="_Toc241779207"/>
       <w:r>
         <w:rPr>
           <w:lang w:val="pt-BR"/>
@@ -16635,7 +16635,6 @@
         <w:rPr>
           <w:lang w:val="pt-BR"/>
         </w:rPr>
-        <w:lastRenderedPageBreak/>
         <w:t xml:space="preserve">O sistema não captura, não processa e não armazena imagem, som ou qualquer dado que permita identificar pessoa. </w:t>
       </w:r>
       <w:r>
@@ -16659,6 +16658,7 @@
         <w:rPr>
           <w:lang w:val="pt-BR"/>
         </w:rPr>
+        <w:lastRenderedPageBreak/>
         <w:t>A interface de dados urbanos publica apenas descritores agregados do estado da via — média de pessoas presentes no trecho num período, ocorrência reportada —, sem referência a indivíduo: contagem, e não identificação.</w:t>
       </w:r>
     </w:p>
@@ -16751,14 +16751,7 @@
         <w:rPr>
           <w:lang w:val="pt-BR"/>
         </w:rPr>
-        <w:t xml:space="preserve">O risco de desvio de finalidade não é hipotético, e há caso documentado que convém registrar. Em San Diego, nos Estados Unidos, cerca de três mil e trezentos postes receberam sensores e câmeras com finalidade declarada de planejamento urbano e de mobilidade, expressamente não policial. A partir de 2018 o departamento de polícia passou a acessar as imagens, chegando a cerca de quatrocentos acessos até 2020, inicialmente sob alegação de crimes graves e depois também de vandalismo e descarte irregular de resíduos; a reação pública levou à desativação do programa em 2020 e à edição de norma municipal de vigilância (PERRY, 2020). O episódio é a </w:t>
-      </w:r>
-      <w:r>
-        <w:rPr>
-          <w:lang w:val="pt-BR"/>
-        </w:rPr>
-        <w:lastRenderedPageBreak/>
-        <w:t>razão pela qual a fronteira entre dado agregado e dado de identificação, neste trabalho, é requisito de interface e não recomendação de uso.</w:t>
+        <w:t>O risco de desvio de finalidade não é hipotético, e há caso documentado que convém registrar. Em San Diego, nos Estados Unidos, cerca de três mil e trezentos postes receberam sensores e câmeras com finalidade declarada de planejamento urbano e de mobilidade, expressamente não policial. A partir de 2018 o departamento de polícia passou a acessar as imagens, chegando a cerca de quatrocentos acessos até 2020, inicialmente sob alegação de crimes graves e depois também de vandalismo e descarte irregular de resíduos; a reação pública levou à desativação do programa em 2020 e à edição de norma municipal de vigilância (PERRY, 2020). O episódio é a razão pela qual a fronteira entre dado agregado e dado de identificação, neste trabalho, é requisito de interface e não recomendação de uso.</w:t>
       </w:r>
     </w:p>
     <w:p>
@@ -16774,6 +16767,7 @@
         <w:rPr>
           <w:lang w:val="pt-BR"/>
         </w:rPr>
+        <w:lastRenderedPageBreak/>
         <w:t>A ressalva merece registro explícito, e não nota de rodapé. A literatura acadêmica que examina a plataforma municipal de videomonitoramento concentra-se justamente sobre o reconhecimento facial e seus efeitos discriminatórios, apontando identificação desproporcional de pessoas negras como suspeitas (OLIVEIRA; FAGUNDES; SPOLLE, 2025). Propor que outro serviço municipal consuma dados dessa plataforma sem enfrentar essa crítica seria metodologicamente frágil. A resposta deste trabalho é de projeto, e não de discurso: a especificação de integração produzida como resultado define, como requisito, que a interface publique exclusivamente descritores agregados do estado da via, e que identificadores biométricos, imagens e placas não componham o contrato de dados. A camada de decisão aqui construída não teria como consumi-los ainda que fossem oferecidos, porque suas variáveis de entrada são grandezas de via e não atributos de pessoa.</w:t>
       </w:r>
     </w:p>
@@ -16785,7 +16779,7 @@
           <w:lang w:val="pt-BR"/>
         </w:rPr>
       </w:pPr>
-      <w:bookmarkStart w:id="42" w:name="_Toc241779051"/>
+      <w:bookmarkStart w:id="42" w:name="_Toc241779208"/>
       <w:r>
         <w:rPr>
           <w:lang w:val="pt-BR"/>
@@ -16823,14 +16817,7 @@
         <w:rPr>
           <w:lang w:val="pt-BR"/>
         </w:rPr>
-        <w:t xml:space="preserve">A hipótese que sustenta o cálculo é a proporcionalidade entre o ciclo de trabalho e a potência média consumida, e ela é adequada ao arranjo adotado: a modulação por largura de pulso chaveia a corrente plena do segmento, de modo que a potência média é o produto da potência em condução pela fração de tempo em que há condução. A mesma proporcionalidade vale, aproximadamente, para o fluxo luminoso, o que oferece verificação cruzada útil — a estimativa derivada do ciclo comandado pode ser confrontada com a derivada da iluminância medida, e a divergência entre as duas é reportada junto ao resultado. A comparação entre as duas </w:t>
-      </w:r>
-      <w:r>
-        <w:rPr>
-          <w:lang w:val="pt-BR"/>
-        </w:rPr>
-        <w:lastRenderedPageBreak/>
-        <w:t>estimativas é também exibida em tempo real no painel, calculada pelo mesmo módulo que produz os resultados do Capítulo 5.</w:t>
+        <w:t>A hipótese que sustenta o cálculo é a proporcionalidade entre o ciclo de trabalho e a potência média consumida, e ela é adequada ao arranjo adotado: a modulação por largura de pulso chaveia a corrente plena do segmento, de modo que a potência média é o produto da potência em condução pela fração de tempo em que há condução. A mesma proporcionalidade vale, aproximadamente, para o fluxo luminoso, o que oferece verificação cruzada útil — a estimativa derivada do ciclo comandado pode ser confrontada com a derivada da iluminância medida, e a divergência entre as duas é reportada junto ao resultado. A comparação entre as duas estimativas é também exibida em tempo real no painel, calculada pelo mesmo módulo que produz os resultados do Capítulo 5.</w:t>
       </w:r>
     </w:p>
     <w:p>
@@ -16846,6 +16833,7 @@
         <w:rPr>
           <w:lang w:val="pt-BR"/>
         </w:rPr>
+        <w:lastRenderedPageBreak/>
         <w:t>A potência do segmento de bancada, da ordem de um watt, não tem significado para quem raciocina em termos do parque municipal. A estimativa é, por isso, expressa também para uma luminária de referência. A projeção é legítima pela propriedade estabelecida em 3.3: a camada de decisão emite um nível adimensional, e a mesma trajetória de níveis que comanda a bancada comandaria uma luminária viária. A luminária de referência não é um modelo comercial — o modelo instalado nas vias de pedestres do município não é informação divulgada. Ela é derivada dos parâmetros que o Caderno de Encargos da concessão impõe a toda luminária do parque (SÃO PAULO, 2015), e adota a potência mínima da faixa contratual, conforme o Quadro 9.</w:t>
       </w:r>
     </w:p>
@@ -17350,14 +17338,14 @@
         <w:rPr>
           <w:lang w:val="pt-BR"/>
         </w:rPr>
-        <w:t xml:space="preserve">Com a luminária de referência, a energia não precisa ser inferida da telemetria da bancada: decorre do próprio registro de decisões. Entre duas decisões consecutivas, o nível emitido segue trajetória linear por partes, imposta pela camada de verificação — a elevação é imediata, e a atenuação é rampeada à taxa máxima de um décimo do fluxo pleno por minuto até atingir o novo nível, no qual permanece. A integral dessa trajetória tem forma fechada. Sejam a e b os níveis anterior e novo, expressos como fração do fluxo pleno, P a potência nominal em watts e Δt o intervalo até a decisão seguinte, em minutos. Numa atenuação, a rampa dura d = (a − b)/0,1 minutos, e a energia consumida no intervalo, em watt-hora, é E = P × [(a + b)/2 × d + b × (Δt − d)] / 60. Numa elevação, E = P × b × Δt / 60. Quando a decisão seguinte </w:t>
+        <w:t xml:space="preserve">Com a luminária de referência, a energia não precisa ser inferida da telemetria da bancada: decorre do próprio registro de decisões. Entre duas decisões consecutivas, o nível emitido segue trajetória linear por partes, imposta pela camada de verificação — a elevação é imediata, e a atenuação é rampeada à taxa máxima de um décimo do fluxo pleno por minuto até atingir o novo nível, no qual permanece. A integral dessa trajetória tem forma fechada. Sejam a e b os níveis anterior e novo, expressos como fração do fluxo pleno, P a potência nominal em watts e Δt o intervalo até a decisão seguinte, em minutos. Numa atenuação, a rampa dura d = (a − b)/0,1 minutos, e a energia consumida no intervalo, em watt-hora, é E = P × [(a + b)/2 × d + b × (Δt − d)] / 60. Numa elevação, E = P × b × Δt / 60. Quando a decisão seguinte chega antes do fim da rampa, integra-se apenas o trecho percorrido. Cada decisão registrada produz, assim, um valor de energia, e a energia de um cenário é a soma </w:t>
       </w:r>
       <w:r>
         <w:rPr>
           <w:lang w:val="pt-BR"/>
         </w:rPr>
         <w:lastRenderedPageBreak/>
-        <w:t>chega antes do fim da rampa, integra-se apenas o trecho percorrido. Cada decisão registrada produz, assim, um valor de energia, e a energia de um cenário é a soma desses valores. A título de ordem de grandeza, a descida completa de P3 a P5, que a norma obriga a durar ao menos cinco minutos, consome 2,50 Wh na luminária de referência, contra 3,33 Wh no mesmo intervalo em fluxo pleno.</w:t>
+        <w:t>desses valores. A título de ordem de grandeza, a descida completa de P3 a P5, que a norma obriga a durar ao menos cinco minutos, consome 2,50 Wh na luminária de referência, contra 3,33 Wh no mesmo intervalo em fluxo pleno.</w:t>
       </w:r>
     </w:p>
     <w:p>
@@ -17418,14 +17406,14 @@
         <w:rPr>
           <w:lang w:val="pt-BR"/>
         </w:rPr>
-        <w:t xml:space="preserve">Uma advertência metodológica precede o resultado. Consumo, isoladamente, não é critério de mérito em iluminação pública: o regime de menor consumo é o de luz apagada, e qualquer comparação que premie apenas a redução premiará o regime </w:t>
+        <w:t xml:space="preserve">Uma advertência metodológica precede o resultado. Consumo, isoladamente, não é critério de mérito em iluminação pública: o regime de menor consumo é o de luz apagada, e qualquer comparação que premie apenas a redução premiará o regime menos seguro. A avaliação é, por isso, conjunta, e reporta dois valores para cada regime — a energia estimada e a aderência da iluminação à demanda observada, </w:t>
       </w:r>
       <w:r>
         <w:rPr>
           <w:lang w:val="pt-BR"/>
         </w:rPr>
         <w:lastRenderedPageBreak/>
-        <w:t>menos seguro. A avaliação é, por isso, conjunta, e reporta dois valores para cada regime — a energia estimada e a aderência da iluminação à demanda observada, medida como a fração dos ciclos em que o nível entregue se situou dentro do envelope esperado do cenário, nos termos de 3.9. O que o trabalho busca estabelecer não é o consumo mínimo, e sim o consumo aderente à condição observada, sem que em nenhum momento os limites da norma sejam transgredidos.</w:t>
+        <w:t>medida como a fração dos ciclos em que o nível entregue se situou dentro do envelope esperado do cenário, nos termos de 3.9. O que o trabalho busca estabelecer não é o consumo mínimo, e sim o consumo aderente à condição observada, sem que em nenhum momento os limites da norma sejam transgredidos.</w:t>
       </w:r>
     </w:p>
     <w:p>
@@ -17453,7 +17441,7 @@
           <w:lang w:val="pt-BR"/>
         </w:rPr>
       </w:pPr>
-      <w:bookmarkStart w:id="43" w:name="_Toc241779052"/>
+      <w:bookmarkStart w:id="43" w:name="_Toc241779209"/>
       <w:r>
         <w:rPr>
           <w:lang w:val="pt-BR"/>
@@ -17487,7 +17475,7 @@
           <w:lang w:val="pt-BR"/>
         </w:rPr>
       </w:pPr>
-      <w:bookmarkStart w:id="44" w:name="_Toc241779053"/>
+      <w:bookmarkStart w:id="44" w:name="_Toc241779210"/>
       <w:r>
         <w:rPr>
           <w:lang w:val="pt-BR"/>
@@ -17521,7 +17509,7 @@
           <w:lang w:val="pt-BR"/>
         </w:rPr>
       </w:pPr>
-      <w:bookmarkStart w:id="45" w:name="_Toc241779054"/>
+      <w:bookmarkStart w:id="45" w:name="_Toc241779211"/>
       <w:r>
         <w:rPr>
           <w:lang w:val="pt-BR"/>
@@ -17555,7 +17543,7 @@
           <w:lang w:val="pt-BR"/>
         </w:rPr>
       </w:pPr>
-      <w:bookmarkStart w:id="46" w:name="_Toc241779055"/>
+      <w:bookmarkStart w:id="46" w:name="_Toc241779212"/>
       <w:r>
         <w:rPr>
           <w:lang w:val="pt-BR"/>
@@ -18535,7 +18523,7 @@
           <w:lang w:val="pt-BR"/>
         </w:rPr>
       </w:pPr>
-      <w:bookmarkStart w:id="47" w:name="_Toc241779056"/>
+      <w:bookmarkStart w:id="47" w:name="_Toc241779213"/>
       <w:r>
         <w:rPr>
           <w:lang w:val="pt-BR"/>
@@ -19585,7 +19573,7 @@
           <w:lang w:val="pt-BR"/>
         </w:rPr>
       </w:pPr>
-      <w:bookmarkStart w:id="48" w:name="_Toc241779057"/>
+      <w:bookmarkStart w:id="48" w:name="_Toc241779214"/>
       <w:r>
         <w:rPr>
           <w:lang w:val="pt-BR"/>
@@ -19620,7 +19608,7 @@
           <w:lang w:val="pt-BR"/>
         </w:rPr>
       </w:pPr>
-      <w:bookmarkStart w:id="49" w:name="_Toc241779058"/>
+      <w:bookmarkStart w:id="49" w:name="_Toc241779215"/>
       <w:r>
         <w:rPr>
           <w:lang w:val="pt-BR"/>
@@ -21168,7 +21156,7 @@
           <w:lang w:val="pt-BR"/>
         </w:rPr>
       </w:pPr>
-      <w:bookmarkStart w:id="50" w:name="_Toc241779059"/>
+      <w:bookmarkStart w:id="50" w:name="_Toc241779216"/>
       <w:r>
         <w:rPr>
           <w:lang w:val="pt-BR"/>
@@ -21341,7 +21329,7 @@
           <w:lang w:val="pt-BR"/>
         </w:rPr>
       </w:pPr>
-      <w:bookmarkStart w:id="51" w:name="_Toc241779060"/>
+      <w:bookmarkStart w:id="51" w:name="_Toc241779217"/>
       <w:r>
         <w:rPr>
           <w:lang w:val="pt-BR"/>
@@ -22359,7 +22347,7 @@
           <w:lang w:val="pt-BR"/>
         </w:rPr>
       </w:pPr>
-      <w:bookmarkStart w:id="52" w:name="_Toc241779061"/>
+      <w:bookmarkStart w:id="52" w:name="_Toc241779218"/>
       <w:r>
         <w:rPr>
           <w:lang w:val="pt-BR"/>
@@ -22376,7 +22364,7 @@
           <w:lang w:val="pt-BR"/>
         </w:rPr>
       </w:pPr>
-      <w:bookmarkStart w:id="53" w:name="_Toc241779062"/>
+      <w:bookmarkStart w:id="53" w:name="_Toc241779219"/>
       <w:r>
         <w:rPr>
           <w:lang w:val="pt-BR"/>
@@ -23593,7 +23581,7 @@
           <w:lang w:val="pt-BR"/>
         </w:rPr>
       </w:pPr>
-      <w:bookmarkStart w:id="54" w:name="_Toc241779063"/>
+      <w:bookmarkStart w:id="54" w:name="_Toc241779220"/>
       <w:r>
         <w:rPr>
           <w:lang w:val="pt-BR"/>
@@ -23764,7 +23752,7 @@
           <w:lang w:val="pt-BR"/>
         </w:rPr>
       </w:pPr>
-      <w:bookmarkStart w:id="55" w:name="_Toc241779064"/>
+      <w:bookmarkStart w:id="55" w:name="_Toc241779221"/>
       <w:r>
         <w:rPr>
           <w:lang w:val="pt-BR"/>
@@ -24901,7 +24889,7 @@
           <w:lang w:val="pt-BR"/>
         </w:rPr>
       </w:pPr>
-      <w:bookmarkStart w:id="56" w:name="_Toc241779065"/>
+      <w:bookmarkStart w:id="56" w:name="_Toc241779222"/>
       <w:r>
         <w:rPr>
           <w:lang w:val="pt-BR"/>
@@ -26774,7 +26762,7 @@
           <w:lang w:val="pt-BR"/>
         </w:rPr>
       </w:pPr>
-      <w:bookmarkStart w:id="57" w:name="_Toc241779066"/>
+      <w:bookmarkStart w:id="57" w:name="_Toc241779223"/>
       <w:r>
         <w:rPr>
           <w:lang w:val="pt-BR"/>
@@ -26808,7 +26796,7 @@
           <w:lang w:val="pt-BR"/>
         </w:rPr>
       </w:pPr>
-      <w:bookmarkStart w:id="58" w:name="_Toc241779067"/>
+      <w:bookmarkStart w:id="58" w:name="_Toc241779224"/>
       <w:r>
         <w:rPr>
           <w:lang w:val="pt-BR"/>
@@ -26843,7 +26831,7 @@
           <w:lang w:val="pt-BR"/>
         </w:rPr>
       </w:pPr>
-      <w:bookmarkStart w:id="59" w:name="_Toc241779068"/>
+      <w:bookmarkStart w:id="59" w:name="_Toc241779225"/>
       <w:r>
         <w:rPr>
           <w:lang w:val="pt-BR"/>
@@ -26878,7 +26866,7 @@
           <w:lang w:val="pt-BR"/>
         </w:rPr>
       </w:pPr>
-      <w:bookmarkStart w:id="60" w:name="_Toc241779069"/>
+      <w:bookmarkStart w:id="60" w:name="_Toc241779226"/>
       <w:r>
         <w:rPr>
           <w:lang w:val="pt-BR"/>
@@ -26926,7 +26914,7 @@
           <w:lang w:val="pt-BR"/>
         </w:rPr>
       </w:pPr>
-      <w:bookmarkStart w:id="61" w:name="_Toc241779070"/>
+      <w:bookmarkStart w:id="61" w:name="_Toc241779227"/>
       <w:r>
         <w:rPr>
           <w:lang w:val="pt-BR"/>
@@ -26960,7 +26948,7 @@
           <w:lang w:val="pt-BR"/>
         </w:rPr>
       </w:pPr>
-      <w:bookmarkStart w:id="62" w:name="_Toc241779071"/>
+      <w:bookmarkStart w:id="62" w:name="_Toc241779228"/>
       <w:r>
         <w:rPr>
           <w:lang w:val="pt-BR"/>
@@ -26995,7 +26983,7 @@
           <w:lang w:val="pt-BR"/>
         </w:rPr>
       </w:pPr>
-      <w:bookmarkStart w:id="63" w:name="_Toc241779072"/>
+      <w:bookmarkStart w:id="63" w:name="_Toc241779229"/>
       <w:r>
         <w:rPr>
           <w:lang w:val="pt-BR"/>
@@ -27545,7 +27533,7 @@
           <w:lang w:val="pt-BR"/>
         </w:rPr>
       </w:pPr>
-      <w:bookmarkStart w:id="64" w:name="_Toc241779073"/>
+      <w:bookmarkStart w:id="64" w:name="_Toc241779230"/>
       <w:r>
         <w:rPr>
           <w:lang w:val="pt-BR"/>
@@ -27576,7 +27564,7 @@
         <w:pStyle w:val="Heading2"/>
         <w:spacing w:before="360" w:after="240" w:line="360" w:lineRule="auto"/>
       </w:pPr>
-      <w:bookmarkStart w:id="65" w:name="_Toc241779074"/>
+      <w:bookmarkStart w:id="65" w:name="_Toc241779231"/>
       <w:r>
         <w:rPr>
           <w:lang w:val="pt-BR"/>
@@ -28190,7 +28178,7 @@
           <w:lang w:val="pt-BR"/>
         </w:rPr>
         <w:lastRenderedPageBreak/>
-        <w:t>acompanhou cada variação do volume. Em conferência posterior ao protocolo, com o limiar de 20 %, acima do qual mais da metade dos observadores detecta a redução no estudo de referência, as três empatam, com 3 mudanças cada; as maiores elevações da tabela são de 50 %, e as da inferência nebulosa, de 42 %.</w:t>
+        <w:t>acompanhou cada variação do volume. Em conferência posterior ao protocolo, com limiares de 20 % e de 30 % — este último o valor acima do qual, no mesmo estudo, o aumento é percebido também por observador ocupado em tarefa —, as contagens são de 3, 3 e 3 e de 2, 3 e 3; as maiores elevações da tabela são de 50 %, e as da inferência nebulosa, de 42 %.</w:t>
       </w:r>
     </w:p>
     <w:p>
@@ -28604,7 +28592,7 @@
           <w:lang w:val="pt-BR"/>
         </w:rPr>
       </w:pPr>
-      <w:bookmarkStart w:id="66" w:name="_Toc241779075"/>
+      <w:bookmarkStart w:id="66" w:name="_Toc241779232"/>
       <w:r>
         <w:rPr>
           <w:lang w:val="pt-BR"/>
@@ -28622,7 +28610,7 @@
           <w:lang w:val="pt-BR"/>
         </w:rPr>
       </w:pPr>
-      <w:bookmarkStart w:id="67" w:name="_Toc241779076"/>
+      <w:bookmarkStart w:id="67" w:name="_Toc241779233"/>
       <w:r>
         <w:rPr>
           <w:lang w:val="pt-BR"/>
@@ -28656,7 +28644,7 @@
           <w:lang w:val="pt-BR"/>
         </w:rPr>
       </w:pPr>
-      <w:bookmarkStart w:id="68" w:name="_Toc241779077"/>
+      <w:bookmarkStart w:id="68" w:name="_Toc241779234"/>
       <w:r>
         <w:rPr>
           <w:lang w:val="pt-BR"/>
@@ -28690,7 +28678,7 @@
           <w:lang w:val="pt-BR"/>
         </w:rPr>
       </w:pPr>
-      <w:bookmarkStart w:id="69" w:name="_Toc241779078"/>
+      <w:bookmarkStart w:id="69" w:name="_Toc241779235"/>
       <w:r>
         <w:rPr>
           <w:lang w:val="pt-BR"/>
@@ -29292,7 +29280,7 @@
           <w:lang w:val="pt-BR"/>
         </w:rPr>
       </w:pPr>
-      <w:bookmarkStart w:id="70" w:name="_Toc241779079"/>
+      <w:bookmarkStart w:id="70" w:name="_Toc241779236"/>
       <w:r>
         <w:rPr>
           <w:lang w:val="pt-BR"/>
@@ -29327,7 +29315,7 @@
           <w:lang w:val="pt-BR"/>
         </w:rPr>
       </w:pPr>
-      <w:bookmarkStart w:id="71" w:name="_Toc241779080"/>
+      <w:bookmarkStart w:id="71" w:name="_Toc241779237"/>
       <w:r>
         <w:rPr>
           <w:lang w:val="pt-BR"/>
@@ -29362,7 +29350,7 @@
           <w:lang w:val="pt-BR"/>
         </w:rPr>
       </w:pPr>
-      <w:bookmarkStart w:id="72" w:name="_Toc241779081"/>
+      <w:bookmarkStart w:id="72" w:name="_Toc241779238"/>
       <w:r>
         <w:rPr>
           <w:lang w:val="pt-BR"/>
@@ -29612,7 +29600,7 @@
           <w:lang w:val="pt-BR"/>
         </w:rPr>
       </w:pPr>
-      <w:bookmarkStart w:id="73" w:name="_Toc241779082"/>
+      <w:bookmarkStart w:id="73" w:name="_Toc241779239"/>
       <w:r>
         <w:rPr>
           <w:lang w:val="pt-BR"/>
@@ -29653,17 +29641,6 @@
     <w:p>
       <w:pPr>
         <w:spacing w:after="240"/>
-      </w:pPr>
-      <w:r>
-        <w:rPr>
-          <w:lang w:val="pt-BR"/>
-        </w:rPr>
-        <w:t>AKASHI, Yukio; NECHES, J. Detectability and acceptability of illuminance reduction for load shedding. Journal of the Illuminating Engineering Society, v. 33, n. 1, p. 3-13, 2004.</w:t>
-      </w:r>
-    </w:p>
-    <w:p>
-      <w:pPr>
-        <w:spacing w:after="240"/>
         <w:rPr>
           <w:lang w:val="pt-BR"/>
         </w:rPr>
@@ -29875,11 +29852,7 @@
         <w:t xml:space="preserve">BELLONI, Elisa; BURATTI, Cinzia; LUNGHI, Lorenzo; MARTIRANO, Luigi. </w:t>
       </w:r>
       <w:r>
-        <w:t xml:space="preserve">A new street lighting control algorithm based on forecasted traffic data for electricity </w:t>
-      </w:r>
-      <w:r>
-        <w:lastRenderedPageBreak/>
-        <w:t xml:space="preserve">consumption reduction. </w:t>
+        <w:t xml:space="preserve">A new street lighting control algorithm based on forecasted traffic data for electricity consumption reduction. </w:t>
       </w:r>
       <w:r>
         <w:rPr>
@@ -29921,7 +29894,14 @@
         <w:rPr>
           <w:lang w:val="pt-BR"/>
         </w:rPr>
-        <w:t>. Lei Geral de Proteção de Dados Pessoais (LGPD). Brasília: Presidência da República, 2018. Disponível em: https://www.planalto.gov.br/ccivil_03/_ato2015-2018/2018/lei/l13709.htm. Acesso em: 13 set. 2026.</w:t>
+        <w:t xml:space="preserve">. Lei Geral de Proteção de Dados Pessoais (LGPD). Brasília: Presidência da República, 2018. Disponível em: </w:t>
+      </w:r>
+      <w:r>
+        <w:rPr>
+          <w:lang w:val="pt-BR"/>
+        </w:rPr>
+        <w:lastRenderedPageBreak/>
+        <w:t>https://www.planalto.gov.br/ccivil_03/_ato2015-2018/2018/lei/l13709.htm. Acesso em: 13 set. 2026.</w:t>
       </w:r>
     </w:p>
     <w:p>
@@ -30144,27 +30124,21 @@
         <w:rPr>
           <w:lang w:val="pt-BR"/>
         </w:rPr>
-        <w:t xml:space="preserve">[S. l.]: Curran Associates, 2022. Disponível em: </w:t>
-      </w:r>
+        <w:t>[S. l.]: Curran Associates, 2022. Disponível em: https://proceedings.neurips.cc/paper_files/paper/2022/hash/0378c7692da36807bdec87ab043cdadc-Abstract-Datasets_and_Benchmarks.html. Acesso em: 15 set. 2026.</w:t>
+      </w:r>
+    </w:p>
+    <w:p>
+      <w:pPr>
+        <w:spacing w:after="240"/>
+        <w:rPr>
+          <w:lang w:val="pt-BR"/>
+        </w:rPr>
+      </w:pPr>
       <w:r>
         <w:rPr>
           <w:lang w:val="pt-BR"/>
         </w:rPr>
         <w:lastRenderedPageBreak/>
-        <w:t>https://proceedings.neurips.cc/paper_files/paper/2022/hash/0378c7692da36807bdec87ab043cdadc-Abstract-Datasets_and_Benchmarks.html. Acesso em: 15 set. 2026.</w:t>
-      </w:r>
-    </w:p>
-    <w:p>
-      <w:pPr>
-        <w:spacing w:after="240"/>
-        <w:rPr>
-          <w:lang w:val="pt-BR"/>
-        </w:rPr>
-      </w:pPr>
-      <w:r>
-        <w:rPr>
-          <w:lang w:val="pt-BR"/>
-        </w:rPr>
         <w:t xml:space="preserve">HIROKI, Stella Marina Yurí. Mobilidade, participação e dados: o caso da aplicação do Waze for Cities Data na cidade de Joinville (SC). </w:t>
       </w:r>
       <w:r>
@@ -30398,8 +30372,14 @@
         <w:rPr>
           <w:lang w:val="pt-BR"/>
         </w:rPr>
+        <w:t xml:space="preserve">OLIVEIRA, Cyntia Barbosa; FAGUNDES, Mari Cristina de Freitas; SPOLLE, Marcus Vinicius. Racismo digital e gestão populacional: uma análise sobre câmeras com </w:t>
+      </w:r>
+      <w:r>
+        <w:rPr>
+          <w:lang w:val="pt-BR"/>
+        </w:rPr>
         <w:lastRenderedPageBreak/>
-        <w:t xml:space="preserve">OLIVEIRA, Cyntia Barbosa; FAGUNDES, Mari Cristina de Freitas; SPOLLE, Marcus Vinicius. Racismo digital e gestão populacional: uma análise sobre câmeras com reconhecimento facial. </w:t>
+        <w:t xml:space="preserve">reconhecimento facial. </w:t>
       </w:r>
       <w:r>
         <w:rPr>
@@ -30637,14 +30617,14 @@
         <w:rPr>
           <w:lang w:val="pt-BR"/>
         </w:rPr>
-        <w:t xml:space="preserve">. São Paulo: Prefeitura do Município de </w:t>
+        <w:t>. São Paulo: Prefeitura do Município de São Paulo, 2018b. Disponível em: https://prefeitura.sp.gov.br/w/noticia/prefeitura-</w:t>
       </w:r>
       <w:r>
         <w:rPr>
           <w:lang w:val="pt-BR"/>
         </w:rPr>
         <w:lastRenderedPageBreak/>
-        <w:t>São Paulo, 2018b. Disponível em: https://prefeitura.sp.gov.br/w/noticia/prefeitura-assina-contrato-com-consorcio-responsavel-pela-modernizacao-da-iluminacao-publica. Acesso em: 12 set. 2026.</w:t>
+        <w:t>assina-contrato-com-consorcio-responsavel-pela-modernizacao-da-iluminacao-publica. Acesso em: 12 set. 2026.</w:t>
       </w:r>
     </w:p>
     <w:p>
@@ -30834,14 +30814,14 @@
         <w:rPr>
           <w:lang w:val="pt-BR"/>
         </w:rPr>
-        <w:t xml:space="preserve">SÃO PAULO (Município). Smart Sampa chega a 50 mil câmeras e já supera em 25% o previsto no Programa de Metas. São Paulo: Secretaria Municipal de Segurança Urbana, 1 abr. 2026b. Disponível em: </w:t>
+        <w:t>SÃO PAULO (Município). Smart Sampa chega a 50 mil câmeras e já supera em 25% o previsto no Programa de Metas. São Paulo: Secretaria Municipal de Segurança Urbana, 1 abr. 2026b. Disponível em: https://prefeitura.sp.gov.br/web/seguranca_urbana/w/smart-sampa-chega-a-50-mil-</w:t>
       </w:r>
       <w:r>
         <w:rPr>
           <w:lang w:val="pt-BR"/>
         </w:rPr>
         <w:lastRenderedPageBreak/>
-        <w:t>https://prefeitura.sp.gov.br/web/seguranca_urbana/w/smart-sampa-chega-a-50-mil-câmeras-e-já-supera-em-25-o-previsto-no-programa-de-metas. Acesso em: 27 set. 2026.</w:t>
+        <w:t>câmeras-e-já-supera-em-25-o-previsto-no-programa-de-metas. Acesso em: 27 set. 2026.</w:t>
       </w:r>
     </w:p>
     <w:p>
@@ -30916,7 +30896,7 @@
           <w:lang w:val="pt-BR"/>
         </w:rPr>
       </w:pPr>
-      <w:bookmarkStart w:id="74" w:name="_Toc241779083"/>
+      <w:bookmarkStart w:id="74" w:name="_Toc241779240"/>
       <w:r>
         <w:rPr>
           <w:lang w:val="pt-BR"/>
@@ -32419,7 +32399,7 @@
         <w:spacing w:before="480" w:after="280" w:line="360" w:lineRule="auto"/>
         <w:jc w:val="center"/>
       </w:pPr>
-      <w:bookmarkStart w:id="75" w:name="_Toc241779084"/>
+      <w:bookmarkStart w:id="75" w:name="_Toc241779241"/>
       <w:r>
         <w:rPr>
           <w:lang w:val="pt-BR"/>

</xml_diff>

<commit_message>
docs: limiares de percepcao reorganizados em 3.9 e 5.6 (fixados x conferencia posterior)
Co-Authored-By: Claude Opus 5.5 <noreply@anthropic.com>
</commit_message>
<xml_diff>
--- a/Transicao_pre-projeto-para-TCC-Completo_TCC_Iluminacao_SP_v8.docx
+++ b/Transicao_pre-projeto-para-TCC-Completo_TCC_Iluminacao_SP_v8.docx
@@ -1368,7 +1368,7 @@
           <w:r>
             <w:fldChar w:fldCharType="separate"/>
           </w:r>
-          <w:hyperlink w:anchor="_Toc241779166" w:history="1">
+          <w:hyperlink w:anchor="_Toc241779651" w:history="1">
             <w:r>
               <w:rPr>
                 <w:rStyle w:val="Hyperlink"/>
@@ -1396,7 +1396,7 @@
                 <w:noProof/>
                 <w:webHidden/>
               </w:rPr>
-              <w:instrText xml:space="preserve"> PAGEREF _Toc241779166 \h </w:instrText>
+              <w:instrText xml:space="preserve"> PAGEREF _Toc241779651 \h </w:instrText>
             </w:r>
             <w:r>
               <w:rPr>
@@ -1441,7 +1441,7 @@
               <w14:ligatures w14:val="standardContextual"/>
             </w:rPr>
           </w:pPr>
-          <w:hyperlink w:anchor="_Toc241779167" w:history="1">
+          <w:hyperlink w:anchor="_Toc241779652" w:history="1">
             <w:r>
               <w:rPr>
                 <w:rStyle w:val="Hyperlink"/>
@@ -1469,7 +1469,7 @@
                 <w:noProof/>
                 <w:webHidden/>
               </w:rPr>
-              <w:instrText xml:space="preserve"> PAGEREF _Toc241779167 \h </w:instrText>
+              <w:instrText xml:space="preserve"> PAGEREF _Toc241779652 \h </w:instrText>
             </w:r>
             <w:r>
               <w:rPr>
@@ -1514,7 +1514,7 @@
               <w14:ligatures w14:val="standardContextual"/>
             </w:rPr>
           </w:pPr>
-          <w:hyperlink w:anchor="_Toc241779168" w:history="1">
+          <w:hyperlink w:anchor="_Toc241779653" w:history="1">
             <w:r>
               <w:rPr>
                 <w:rStyle w:val="Hyperlink"/>
@@ -1542,7 +1542,7 @@
                 <w:noProof/>
                 <w:webHidden/>
               </w:rPr>
-              <w:instrText xml:space="preserve"> PAGEREF _Toc241779168 \h </w:instrText>
+              <w:instrText xml:space="preserve"> PAGEREF _Toc241779653 \h </w:instrText>
             </w:r>
             <w:r>
               <w:rPr>
@@ -1587,7 +1587,7 @@
               <w14:ligatures w14:val="standardContextual"/>
             </w:rPr>
           </w:pPr>
-          <w:hyperlink w:anchor="_Toc241779169" w:history="1">
+          <w:hyperlink w:anchor="_Toc241779654" w:history="1">
             <w:r>
               <w:rPr>
                 <w:rStyle w:val="Hyperlink"/>
@@ -1615,7 +1615,7 @@
                 <w:noProof/>
                 <w:webHidden/>
               </w:rPr>
-              <w:instrText xml:space="preserve"> PAGEREF _Toc241779169 \h </w:instrText>
+              <w:instrText xml:space="preserve"> PAGEREF _Toc241779654 \h </w:instrText>
             </w:r>
             <w:r>
               <w:rPr>
@@ -1660,7 +1660,7 @@
               <w14:ligatures w14:val="standardContextual"/>
             </w:rPr>
           </w:pPr>
-          <w:hyperlink w:anchor="_Toc241779170" w:history="1">
+          <w:hyperlink w:anchor="_Toc241779655" w:history="1">
             <w:r>
               <w:rPr>
                 <w:rStyle w:val="Hyperlink"/>
@@ -1688,7 +1688,7 @@
                 <w:noProof/>
                 <w:webHidden/>
               </w:rPr>
-              <w:instrText xml:space="preserve"> PAGEREF _Toc241779170 \h </w:instrText>
+              <w:instrText xml:space="preserve"> PAGEREF _Toc241779655 \h </w:instrText>
             </w:r>
             <w:r>
               <w:rPr>
@@ -1733,7 +1733,7 @@
               <w14:ligatures w14:val="standardContextual"/>
             </w:rPr>
           </w:pPr>
-          <w:hyperlink w:anchor="_Toc241779171" w:history="1">
+          <w:hyperlink w:anchor="_Toc241779656" w:history="1">
             <w:r>
               <w:rPr>
                 <w:rStyle w:val="Hyperlink"/>
@@ -1761,7 +1761,7 @@
                 <w:noProof/>
                 <w:webHidden/>
               </w:rPr>
-              <w:instrText xml:space="preserve"> PAGEREF _Toc241779171 \h </w:instrText>
+              <w:instrText xml:space="preserve"> PAGEREF _Toc241779656 \h </w:instrText>
             </w:r>
             <w:r>
               <w:rPr>
@@ -1806,7 +1806,7 @@
               <w14:ligatures w14:val="standardContextual"/>
             </w:rPr>
           </w:pPr>
-          <w:hyperlink w:anchor="_Toc241779172" w:history="1">
+          <w:hyperlink w:anchor="_Toc241779657" w:history="1">
             <w:r>
               <w:rPr>
                 <w:rStyle w:val="Hyperlink"/>
@@ -1834,7 +1834,7 @@
                 <w:noProof/>
                 <w:webHidden/>
               </w:rPr>
-              <w:instrText xml:space="preserve"> PAGEREF _Toc241779172 \h </w:instrText>
+              <w:instrText xml:space="preserve"> PAGEREF _Toc241779657 \h </w:instrText>
             </w:r>
             <w:r>
               <w:rPr>
@@ -1879,7 +1879,7 @@
               <w14:ligatures w14:val="standardContextual"/>
             </w:rPr>
           </w:pPr>
-          <w:hyperlink w:anchor="_Toc241779173" w:history="1">
+          <w:hyperlink w:anchor="_Toc241779658" w:history="1">
             <w:r>
               <w:rPr>
                 <w:rStyle w:val="Hyperlink"/>
@@ -1907,7 +1907,7 @@
                 <w:noProof/>
                 <w:webHidden/>
               </w:rPr>
-              <w:instrText xml:space="preserve"> PAGEREF _Toc241779173 \h </w:instrText>
+              <w:instrText xml:space="preserve"> PAGEREF _Toc241779658 \h </w:instrText>
             </w:r>
             <w:r>
               <w:rPr>
@@ -1952,7 +1952,7 @@
               <w14:ligatures w14:val="standardContextual"/>
             </w:rPr>
           </w:pPr>
-          <w:hyperlink w:anchor="_Toc241779174" w:history="1">
+          <w:hyperlink w:anchor="_Toc241779659" w:history="1">
             <w:r>
               <w:rPr>
                 <w:rStyle w:val="Hyperlink"/>
@@ -1980,7 +1980,7 @@
                 <w:noProof/>
                 <w:webHidden/>
               </w:rPr>
-              <w:instrText xml:space="preserve"> PAGEREF _Toc241779174 \h </w:instrText>
+              <w:instrText xml:space="preserve"> PAGEREF _Toc241779659 \h </w:instrText>
             </w:r>
             <w:r>
               <w:rPr>
@@ -2025,7 +2025,7 @@
               <w14:ligatures w14:val="standardContextual"/>
             </w:rPr>
           </w:pPr>
-          <w:hyperlink w:anchor="_Toc241779175" w:history="1">
+          <w:hyperlink w:anchor="_Toc241779660" w:history="1">
             <w:r>
               <w:rPr>
                 <w:rStyle w:val="Hyperlink"/>
@@ -2053,7 +2053,7 @@
                 <w:noProof/>
                 <w:webHidden/>
               </w:rPr>
-              <w:instrText xml:space="preserve"> PAGEREF _Toc241779175 \h </w:instrText>
+              <w:instrText xml:space="preserve"> PAGEREF _Toc241779660 \h </w:instrText>
             </w:r>
             <w:r>
               <w:rPr>
@@ -2098,7 +2098,7 @@
               <w14:ligatures w14:val="standardContextual"/>
             </w:rPr>
           </w:pPr>
-          <w:hyperlink w:anchor="_Toc241779176" w:history="1">
+          <w:hyperlink w:anchor="_Toc241779661" w:history="1">
             <w:r>
               <w:rPr>
                 <w:rStyle w:val="Hyperlink"/>
@@ -2126,7 +2126,7 @@
                 <w:noProof/>
                 <w:webHidden/>
               </w:rPr>
-              <w:instrText xml:space="preserve"> PAGEREF _Toc241779176 \h </w:instrText>
+              <w:instrText xml:space="preserve"> PAGEREF _Toc241779661 \h </w:instrText>
             </w:r>
             <w:r>
               <w:rPr>
@@ -2171,7 +2171,7 @@
               <w14:ligatures w14:val="standardContextual"/>
             </w:rPr>
           </w:pPr>
-          <w:hyperlink w:anchor="_Toc241779177" w:history="1">
+          <w:hyperlink w:anchor="_Toc241779662" w:history="1">
             <w:r>
               <w:rPr>
                 <w:rStyle w:val="Hyperlink"/>
@@ -2199,7 +2199,7 @@
                 <w:noProof/>
                 <w:webHidden/>
               </w:rPr>
-              <w:instrText xml:space="preserve"> PAGEREF _Toc241779177 \h </w:instrText>
+              <w:instrText xml:space="preserve"> PAGEREF _Toc241779662 \h </w:instrText>
             </w:r>
             <w:r>
               <w:rPr>
@@ -2244,7 +2244,7 @@
               <w14:ligatures w14:val="standardContextual"/>
             </w:rPr>
           </w:pPr>
-          <w:hyperlink w:anchor="_Toc241779178" w:history="1">
+          <w:hyperlink w:anchor="_Toc241779663" w:history="1">
             <w:r>
               <w:rPr>
                 <w:rStyle w:val="Hyperlink"/>
@@ -2272,7 +2272,7 @@
                 <w:noProof/>
                 <w:webHidden/>
               </w:rPr>
-              <w:instrText xml:space="preserve"> PAGEREF _Toc241779178 \h </w:instrText>
+              <w:instrText xml:space="preserve"> PAGEREF _Toc241779663 \h </w:instrText>
             </w:r>
             <w:r>
               <w:rPr>
@@ -2319,7 +2319,7 @@
               <w14:ligatures w14:val="standardContextual"/>
             </w:rPr>
           </w:pPr>
-          <w:hyperlink w:anchor="_Toc241779179" w:history="1">
+          <w:hyperlink w:anchor="_Toc241779664" w:history="1">
             <w:r>
               <w:rPr>
                 <w:rStyle w:val="Hyperlink"/>
@@ -2347,7 +2347,7 @@
                 <w:noProof/>
                 <w:webHidden/>
               </w:rPr>
-              <w:instrText xml:space="preserve"> PAGEREF _Toc241779179 \h </w:instrText>
+              <w:instrText xml:space="preserve"> PAGEREF _Toc241779664 \h </w:instrText>
             </w:r>
             <w:r>
               <w:rPr>
@@ -2392,7 +2392,7 @@
               <w14:ligatures w14:val="standardContextual"/>
             </w:rPr>
           </w:pPr>
-          <w:hyperlink w:anchor="_Toc241779180" w:history="1">
+          <w:hyperlink w:anchor="_Toc241779665" w:history="1">
             <w:r>
               <w:rPr>
                 <w:rStyle w:val="Hyperlink"/>
@@ -2420,7 +2420,7 @@
                 <w:noProof/>
                 <w:webHidden/>
               </w:rPr>
-              <w:instrText xml:space="preserve"> PAGEREF _Toc241779180 \h </w:instrText>
+              <w:instrText xml:space="preserve"> PAGEREF _Toc241779665 \h </w:instrText>
             </w:r>
             <w:r>
               <w:rPr>
@@ -2465,7 +2465,7 @@
               <w14:ligatures w14:val="standardContextual"/>
             </w:rPr>
           </w:pPr>
-          <w:hyperlink w:anchor="_Toc241779181" w:history="1">
+          <w:hyperlink w:anchor="_Toc241779666" w:history="1">
             <w:r>
               <w:rPr>
                 <w:rStyle w:val="Hyperlink"/>
@@ -2493,7 +2493,7 @@
                 <w:noProof/>
                 <w:webHidden/>
               </w:rPr>
-              <w:instrText xml:space="preserve"> PAGEREF _Toc241779181 \h </w:instrText>
+              <w:instrText xml:space="preserve"> PAGEREF _Toc241779666 \h </w:instrText>
             </w:r>
             <w:r>
               <w:rPr>
@@ -2538,7 +2538,7 @@
               <w14:ligatures w14:val="standardContextual"/>
             </w:rPr>
           </w:pPr>
-          <w:hyperlink w:anchor="_Toc241779182" w:history="1">
+          <w:hyperlink w:anchor="_Toc241779667" w:history="1">
             <w:r>
               <w:rPr>
                 <w:rStyle w:val="Hyperlink"/>
@@ -2566,7 +2566,7 @@
                 <w:noProof/>
                 <w:webHidden/>
               </w:rPr>
-              <w:instrText xml:space="preserve"> PAGEREF _Toc241779182 \h </w:instrText>
+              <w:instrText xml:space="preserve"> PAGEREF _Toc241779667 \h </w:instrText>
             </w:r>
             <w:r>
               <w:rPr>
@@ -2611,7 +2611,7 @@
               <w14:ligatures w14:val="standardContextual"/>
             </w:rPr>
           </w:pPr>
-          <w:hyperlink w:anchor="_Toc241779183" w:history="1">
+          <w:hyperlink w:anchor="_Toc241779668" w:history="1">
             <w:r>
               <w:rPr>
                 <w:rStyle w:val="Hyperlink"/>
@@ -2639,7 +2639,7 @@
                 <w:noProof/>
                 <w:webHidden/>
               </w:rPr>
-              <w:instrText xml:space="preserve"> PAGEREF _Toc241779183 \h </w:instrText>
+              <w:instrText xml:space="preserve"> PAGEREF _Toc241779668 \h </w:instrText>
             </w:r>
             <w:r>
               <w:rPr>
@@ -2684,7 +2684,7 @@
               <w14:ligatures w14:val="standardContextual"/>
             </w:rPr>
           </w:pPr>
-          <w:hyperlink w:anchor="_Toc241779184" w:history="1">
+          <w:hyperlink w:anchor="_Toc241779669" w:history="1">
             <w:r>
               <w:rPr>
                 <w:rStyle w:val="Hyperlink"/>
@@ -2712,7 +2712,7 @@
                 <w:noProof/>
                 <w:webHidden/>
               </w:rPr>
-              <w:instrText xml:space="preserve"> PAGEREF _Toc241779184 \h </w:instrText>
+              <w:instrText xml:space="preserve"> PAGEREF _Toc241779669 \h </w:instrText>
             </w:r>
             <w:r>
               <w:rPr>
@@ -2757,7 +2757,7 @@
               <w14:ligatures w14:val="standardContextual"/>
             </w:rPr>
           </w:pPr>
-          <w:hyperlink w:anchor="_Toc241779185" w:history="1">
+          <w:hyperlink w:anchor="_Toc241779670" w:history="1">
             <w:r>
               <w:rPr>
                 <w:rStyle w:val="Hyperlink"/>
@@ -2785,7 +2785,7 @@
                 <w:noProof/>
                 <w:webHidden/>
               </w:rPr>
-              <w:instrText xml:space="preserve"> PAGEREF _Toc241779185 \h </w:instrText>
+              <w:instrText xml:space="preserve"> PAGEREF _Toc241779670 \h </w:instrText>
             </w:r>
             <w:r>
               <w:rPr>
@@ -2830,7 +2830,7 @@
               <w14:ligatures w14:val="standardContextual"/>
             </w:rPr>
           </w:pPr>
-          <w:hyperlink w:anchor="_Toc241779186" w:history="1">
+          <w:hyperlink w:anchor="_Toc241779671" w:history="1">
             <w:r>
               <w:rPr>
                 <w:rStyle w:val="Hyperlink"/>
@@ -2858,7 +2858,7 @@
                 <w:noProof/>
                 <w:webHidden/>
               </w:rPr>
-              <w:instrText xml:space="preserve"> PAGEREF _Toc241779186 \h </w:instrText>
+              <w:instrText xml:space="preserve"> PAGEREF _Toc241779671 \h </w:instrText>
             </w:r>
             <w:r>
               <w:rPr>
@@ -2903,7 +2903,7 @@
               <w14:ligatures w14:val="standardContextual"/>
             </w:rPr>
           </w:pPr>
-          <w:hyperlink w:anchor="_Toc241779187" w:history="1">
+          <w:hyperlink w:anchor="_Toc241779672" w:history="1">
             <w:r>
               <w:rPr>
                 <w:rStyle w:val="Hyperlink"/>
@@ -2931,7 +2931,7 @@
                 <w:noProof/>
                 <w:webHidden/>
               </w:rPr>
-              <w:instrText xml:space="preserve"> PAGEREF _Toc241779187 \h </w:instrText>
+              <w:instrText xml:space="preserve"> PAGEREF _Toc241779672 \h </w:instrText>
             </w:r>
             <w:r>
               <w:rPr>
@@ -2976,7 +2976,7 @@
               <w14:ligatures w14:val="standardContextual"/>
             </w:rPr>
           </w:pPr>
-          <w:hyperlink w:anchor="_Toc241779188" w:history="1">
+          <w:hyperlink w:anchor="_Toc241779673" w:history="1">
             <w:r>
               <w:rPr>
                 <w:rStyle w:val="Hyperlink"/>
@@ -3004,7 +3004,7 @@
                 <w:noProof/>
                 <w:webHidden/>
               </w:rPr>
-              <w:instrText xml:space="preserve"> PAGEREF _Toc241779188 \h </w:instrText>
+              <w:instrText xml:space="preserve"> PAGEREF _Toc241779673 \h </w:instrText>
             </w:r>
             <w:r>
               <w:rPr>
@@ -3049,7 +3049,7 @@
               <w14:ligatures w14:val="standardContextual"/>
             </w:rPr>
           </w:pPr>
-          <w:hyperlink w:anchor="_Toc241779189" w:history="1">
+          <w:hyperlink w:anchor="_Toc241779674" w:history="1">
             <w:r>
               <w:rPr>
                 <w:rStyle w:val="Hyperlink"/>
@@ -3077,7 +3077,7 @@
                 <w:noProof/>
                 <w:webHidden/>
               </w:rPr>
-              <w:instrText xml:space="preserve"> PAGEREF _Toc241779189 \h </w:instrText>
+              <w:instrText xml:space="preserve"> PAGEREF _Toc241779674 \h </w:instrText>
             </w:r>
             <w:r>
               <w:rPr>
@@ -3124,7 +3124,7 @@
               <w14:ligatures w14:val="standardContextual"/>
             </w:rPr>
           </w:pPr>
-          <w:hyperlink w:anchor="_Toc241779190" w:history="1">
+          <w:hyperlink w:anchor="_Toc241779675" w:history="1">
             <w:r>
               <w:rPr>
                 <w:rStyle w:val="Hyperlink"/>
@@ -3152,7 +3152,7 @@
                 <w:noProof/>
                 <w:webHidden/>
               </w:rPr>
-              <w:instrText xml:space="preserve"> PAGEREF _Toc241779190 \h </w:instrText>
+              <w:instrText xml:space="preserve"> PAGEREF _Toc241779675 \h </w:instrText>
             </w:r>
             <w:r>
               <w:rPr>
@@ -3197,7 +3197,7 @@
               <w14:ligatures w14:val="standardContextual"/>
             </w:rPr>
           </w:pPr>
-          <w:hyperlink w:anchor="_Toc241779191" w:history="1">
+          <w:hyperlink w:anchor="_Toc241779676" w:history="1">
             <w:r>
               <w:rPr>
                 <w:rStyle w:val="Hyperlink"/>
@@ -3225,7 +3225,7 @@
                 <w:noProof/>
                 <w:webHidden/>
               </w:rPr>
-              <w:instrText xml:space="preserve"> PAGEREF _Toc241779191 \h </w:instrText>
+              <w:instrText xml:space="preserve"> PAGEREF _Toc241779676 \h </w:instrText>
             </w:r>
             <w:r>
               <w:rPr>
@@ -3270,7 +3270,7 @@
               <w14:ligatures w14:val="standardContextual"/>
             </w:rPr>
           </w:pPr>
-          <w:hyperlink w:anchor="_Toc241779192" w:history="1">
+          <w:hyperlink w:anchor="_Toc241779677" w:history="1">
             <w:r>
               <w:rPr>
                 <w:rStyle w:val="Hyperlink"/>
@@ -3298,7 +3298,7 @@
                 <w:noProof/>
                 <w:webHidden/>
               </w:rPr>
-              <w:instrText xml:space="preserve"> PAGEREF _Toc241779192 \h </w:instrText>
+              <w:instrText xml:space="preserve"> PAGEREF _Toc241779677 \h </w:instrText>
             </w:r>
             <w:r>
               <w:rPr>
@@ -3343,7 +3343,7 @@
               <w14:ligatures w14:val="standardContextual"/>
             </w:rPr>
           </w:pPr>
-          <w:hyperlink w:anchor="_Toc241779193" w:history="1">
+          <w:hyperlink w:anchor="_Toc241779678" w:history="1">
             <w:r>
               <w:rPr>
                 <w:rStyle w:val="Hyperlink"/>
@@ -3371,7 +3371,7 @@
                 <w:noProof/>
                 <w:webHidden/>
               </w:rPr>
-              <w:instrText xml:space="preserve"> PAGEREF _Toc241779193 \h </w:instrText>
+              <w:instrText xml:space="preserve"> PAGEREF _Toc241779678 \h </w:instrText>
             </w:r>
             <w:r>
               <w:rPr>
@@ -3416,7 +3416,7 @@
               <w14:ligatures w14:val="standardContextual"/>
             </w:rPr>
           </w:pPr>
-          <w:hyperlink w:anchor="_Toc241779194" w:history="1">
+          <w:hyperlink w:anchor="_Toc241779679" w:history="1">
             <w:r>
               <w:rPr>
                 <w:rStyle w:val="Hyperlink"/>
@@ -3444,7 +3444,7 @@
                 <w:noProof/>
                 <w:webHidden/>
               </w:rPr>
-              <w:instrText xml:space="preserve"> PAGEREF _Toc241779194 \h </w:instrText>
+              <w:instrText xml:space="preserve"> PAGEREF _Toc241779679 \h </w:instrText>
             </w:r>
             <w:r>
               <w:rPr>
@@ -3489,7 +3489,7 @@
               <w14:ligatures w14:val="standardContextual"/>
             </w:rPr>
           </w:pPr>
-          <w:hyperlink w:anchor="_Toc241779195" w:history="1">
+          <w:hyperlink w:anchor="_Toc241779680" w:history="1">
             <w:r>
               <w:rPr>
                 <w:rStyle w:val="Hyperlink"/>
@@ -3517,7 +3517,7 @@
                 <w:noProof/>
                 <w:webHidden/>
               </w:rPr>
-              <w:instrText xml:space="preserve"> PAGEREF _Toc241779195 \h </w:instrText>
+              <w:instrText xml:space="preserve"> PAGEREF _Toc241779680 \h </w:instrText>
             </w:r>
             <w:r>
               <w:rPr>
@@ -3562,7 +3562,7 @@
               <w14:ligatures w14:val="standardContextual"/>
             </w:rPr>
           </w:pPr>
-          <w:hyperlink w:anchor="_Toc241779196" w:history="1">
+          <w:hyperlink w:anchor="_Toc241779681" w:history="1">
             <w:r>
               <w:rPr>
                 <w:rStyle w:val="Hyperlink"/>
@@ -3590,7 +3590,7 @@
                 <w:noProof/>
                 <w:webHidden/>
               </w:rPr>
-              <w:instrText xml:space="preserve"> PAGEREF _Toc241779196 \h </w:instrText>
+              <w:instrText xml:space="preserve"> PAGEREF _Toc241779681 \h </w:instrText>
             </w:r>
             <w:r>
               <w:rPr>
@@ -3635,7 +3635,7 @@
               <w14:ligatures w14:val="standardContextual"/>
             </w:rPr>
           </w:pPr>
-          <w:hyperlink w:anchor="_Toc241779197" w:history="1">
+          <w:hyperlink w:anchor="_Toc241779682" w:history="1">
             <w:r>
               <w:rPr>
                 <w:rStyle w:val="Hyperlink"/>
@@ -3663,7 +3663,7 @@
                 <w:noProof/>
                 <w:webHidden/>
               </w:rPr>
-              <w:instrText xml:space="preserve"> PAGEREF _Toc241779197 \h </w:instrText>
+              <w:instrText xml:space="preserve"> PAGEREF _Toc241779682 \h </w:instrText>
             </w:r>
             <w:r>
               <w:rPr>
@@ -3708,7 +3708,7 @@
               <w14:ligatures w14:val="standardContextual"/>
             </w:rPr>
           </w:pPr>
-          <w:hyperlink w:anchor="_Toc241779198" w:history="1">
+          <w:hyperlink w:anchor="_Toc241779683" w:history="1">
             <w:r>
               <w:rPr>
                 <w:rStyle w:val="Hyperlink"/>
@@ -3736,7 +3736,7 @@
                 <w:noProof/>
                 <w:webHidden/>
               </w:rPr>
-              <w:instrText xml:space="preserve"> PAGEREF _Toc241779198 \h </w:instrText>
+              <w:instrText xml:space="preserve"> PAGEREF _Toc241779683 \h </w:instrText>
             </w:r>
             <w:r>
               <w:rPr>
@@ -3781,7 +3781,7 @@
               <w14:ligatures w14:val="standardContextual"/>
             </w:rPr>
           </w:pPr>
-          <w:hyperlink w:anchor="_Toc241779199" w:history="1">
+          <w:hyperlink w:anchor="_Toc241779684" w:history="1">
             <w:r>
               <w:rPr>
                 <w:rStyle w:val="Hyperlink"/>
@@ -3809,7 +3809,7 @@
                 <w:noProof/>
                 <w:webHidden/>
               </w:rPr>
-              <w:instrText xml:space="preserve"> PAGEREF _Toc241779199 \h </w:instrText>
+              <w:instrText xml:space="preserve"> PAGEREF _Toc241779684 \h </w:instrText>
             </w:r>
             <w:r>
               <w:rPr>
@@ -3854,7 +3854,7 @@
               <w14:ligatures w14:val="standardContextual"/>
             </w:rPr>
           </w:pPr>
-          <w:hyperlink w:anchor="_Toc241779200" w:history="1">
+          <w:hyperlink w:anchor="_Toc241779685" w:history="1">
             <w:r>
               <w:rPr>
                 <w:rStyle w:val="Hyperlink"/>
@@ -3882,7 +3882,7 @@
                 <w:noProof/>
                 <w:webHidden/>
               </w:rPr>
-              <w:instrText xml:space="preserve"> PAGEREF _Toc241779200 \h </w:instrText>
+              <w:instrText xml:space="preserve"> PAGEREF _Toc241779685 \h </w:instrText>
             </w:r>
             <w:r>
               <w:rPr>
@@ -3927,7 +3927,7 @@
               <w14:ligatures w14:val="standardContextual"/>
             </w:rPr>
           </w:pPr>
-          <w:hyperlink w:anchor="_Toc241779201" w:history="1">
+          <w:hyperlink w:anchor="_Toc241779686" w:history="1">
             <w:r>
               <w:rPr>
                 <w:rStyle w:val="Hyperlink"/>
@@ -3955,7 +3955,7 @@
                 <w:noProof/>
                 <w:webHidden/>
               </w:rPr>
-              <w:instrText xml:space="preserve"> PAGEREF _Toc241779201 \h </w:instrText>
+              <w:instrText xml:space="preserve"> PAGEREF _Toc241779686 \h </w:instrText>
             </w:r>
             <w:r>
               <w:rPr>
@@ -4000,7 +4000,7 @@
               <w14:ligatures w14:val="standardContextual"/>
             </w:rPr>
           </w:pPr>
-          <w:hyperlink w:anchor="_Toc241779202" w:history="1">
+          <w:hyperlink w:anchor="_Toc241779687" w:history="1">
             <w:r>
               <w:rPr>
                 <w:rStyle w:val="Hyperlink"/>
@@ -4028,7 +4028,7 @@
                 <w:noProof/>
                 <w:webHidden/>
               </w:rPr>
-              <w:instrText xml:space="preserve"> PAGEREF _Toc241779202 \h </w:instrText>
+              <w:instrText xml:space="preserve"> PAGEREF _Toc241779687 \h </w:instrText>
             </w:r>
             <w:r>
               <w:rPr>
@@ -4073,7 +4073,7 @@
               <w14:ligatures w14:val="standardContextual"/>
             </w:rPr>
           </w:pPr>
-          <w:hyperlink w:anchor="_Toc241779203" w:history="1">
+          <w:hyperlink w:anchor="_Toc241779688" w:history="1">
             <w:r>
               <w:rPr>
                 <w:rStyle w:val="Hyperlink"/>
@@ -4101,7 +4101,7 @@
                 <w:noProof/>
                 <w:webHidden/>
               </w:rPr>
-              <w:instrText xml:space="preserve"> PAGEREF _Toc241779203 \h </w:instrText>
+              <w:instrText xml:space="preserve"> PAGEREF _Toc241779688 \h </w:instrText>
             </w:r>
             <w:r>
               <w:rPr>
@@ -4146,7 +4146,7 @@
               <w14:ligatures w14:val="standardContextual"/>
             </w:rPr>
           </w:pPr>
-          <w:hyperlink w:anchor="_Toc241779204" w:history="1">
+          <w:hyperlink w:anchor="_Toc241779689" w:history="1">
             <w:r>
               <w:rPr>
                 <w:rStyle w:val="Hyperlink"/>
@@ -4174,7 +4174,7 @@
                 <w:noProof/>
                 <w:webHidden/>
               </w:rPr>
-              <w:instrText xml:space="preserve"> PAGEREF _Toc241779204 \h </w:instrText>
+              <w:instrText xml:space="preserve"> PAGEREF _Toc241779689 \h </w:instrText>
             </w:r>
             <w:r>
               <w:rPr>
@@ -4219,7 +4219,7 @@
               <w14:ligatures w14:val="standardContextual"/>
             </w:rPr>
           </w:pPr>
-          <w:hyperlink w:anchor="_Toc241779205" w:history="1">
+          <w:hyperlink w:anchor="_Toc241779690" w:history="1">
             <w:r>
               <w:rPr>
                 <w:rStyle w:val="Hyperlink"/>
@@ -4247,7 +4247,7 @@
                 <w:noProof/>
                 <w:webHidden/>
               </w:rPr>
-              <w:instrText xml:space="preserve"> PAGEREF _Toc241779205 \h </w:instrText>
+              <w:instrText xml:space="preserve"> PAGEREF _Toc241779690 \h </w:instrText>
             </w:r>
             <w:r>
               <w:rPr>
@@ -4292,7 +4292,7 @@
               <w14:ligatures w14:val="standardContextual"/>
             </w:rPr>
           </w:pPr>
-          <w:hyperlink w:anchor="_Toc241779206" w:history="1">
+          <w:hyperlink w:anchor="_Toc241779691" w:history="1">
             <w:r>
               <w:rPr>
                 <w:rStyle w:val="Hyperlink"/>
@@ -4320,7 +4320,7 @@
                 <w:noProof/>
                 <w:webHidden/>
               </w:rPr>
-              <w:instrText xml:space="preserve"> PAGEREF _Toc241779206 \h </w:instrText>
+              <w:instrText xml:space="preserve"> PAGEREF _Toc241779691 \h </w:instrText>
             </w:r>
             <w:r>
               <w:rPr>
@@ -4365,7 +4365,7 @@
               <w14:ligatures w14:val="standardContextual"/>
             </w:rPr>
           </w:pPr>
-          <w:hyperlink w:anchor="_Toc241779207" w:history="1">
+          <w:hyperlink w:anchor="_Toc241779692" w:history="1">
             <w:r>
               <w:rPr>
                 <w:rStyle w:val="Hyperlink"/>
@@ -4393,7 +4393,7 @@
                 <w:noProof/>
                 <w:webHidden/>
               </w:rPr>
-              <w:instrText xml:space="preserve"> PAGEREF _Toc241779207 \h </w:instrText>
+              <w:instrText xml:space="preserve"> PAGEREF _Toc241779692 \h </w:instrText>
             </w:r>
             <w:r>
               <w:rPr>
@@ -4438,7 +4438,7 @@
               <w14:ligatures w14:val="standardContextual"/>
             </w:rPr>
           </w:pPr>
-          <w:hyperlink w:anchor="_Toc241779208" w:history="1">
+          <w:hyperlink w:anchor="_Toc241779693" w:history="1">
             <w:r>
               <w:rPr>
                 <w:rStyle w:val="Hyperlink"/>
@@ -4466,7 +4466,7 @@
                 <w:noProof/>
                 <w:webHidden/>
               </w:rPr>
-              <w:instrText xml:space="preserve"> PAGEREF _Toc241779208 \h </w:instrText>
+              <w:instrText xml:space="preserve"> PAGEREF _Toc241779693 \h </w:instrText>
             </w:r>
             <w:r>
               <w:rPr>
@@ -4513,7 +4513,7 @@
               <w14:ligatures w14:val="standardContextual"/>
             </w:rPr>
           </w:pPr>
-          <w:hyperlink w:anchor="_Toc241779209" w:history="1">
+          <w:hyperlink w:anchor="_Toc241779694" w:history="1">
             <w:r>
               <w:rPr>
                 <w:rStyle w:val="Hyperlink"/>
@@ -4541,7 +4541,7 @@
                 <w:noProof/>
                 <w:webHidden/>
               </w:rPr>
-              <w:instrText xml:space="preserve"> PAGEREF _Toc241779209 \h </w:instrText>
+              <w:instrText xml:space="preserve"> PAGEREF _Toc241779694 \h </w:instrText>
             </w:r>
             <w:r>
               <w:rPr>
@@ -4586,7 +4586,7 @@
               <w14:ligatures w14:val="standardContextual"/>
             </w:rPr>
           </w:pPr>
-          <w:hyperlink w:anchor="_Toc241779210" w:history="1">
+          <w:hyperlink w:anchor="_Toc241779695" w:history="1">
             <w:r>
               <w:rPr>
                 <w:rStyle w:val="Hyperlink"/>
@@ -4614,7 +4614,7 @@
                 <w:noProof/>
                 <w:webHidden/>
               </w:rPr>
-              <w:instrText xml:space="preserve"> PAGEREF _Toc241779210 \h </w:instrText>
+              <w:instrText xml:space="preserve"> PAGEREF _Toc241779695 \h </w:instrText>
             </w:r>
             <w:r>
               <w:rPr>
@@ -4659,7 +4659,7 @@
               <w14:ligatures w14:val="standardContextual"/>
             </w:rPr>
           </w:pPr>
-          <w:hyperlink w:anchor="_Toc241779211" w:history="1">
+          <w:hyperlink w:anchor="_Toc241779696" w:history="1">
             <w:r>
               <w:rPr>
                 <w:rStyle w:val="Hyperlink"/>
@@ -4687,7 +4687,7 @@
                 <w:noProof/>
                 <w:webHidden/>
               </w:rPr>
-              <w:instrText xml:space="preserve"> PAGEREF _Toc241779211 \h </w:instrText>
+              <w:instrText xml:space="preserve"> PAGEREF _Toc241779696 \h </w:instrText>
             </w:r>
             <w:r>
               <w:rPr>
@@ -4732,7 +4732,7 @@
               <w14:ligatures w14:val="standardContextual"/>
             </w:rPr>
           </w:pPr>
-          <w:hyperlink w:anchor="_Toc241779212" w:history="1">
+          <w:hyperlink w:anchor="_Toc241779697" w:history="1">
             <w:r>
               <w:rPr>
                 <w:rStyle w:val="Hyperlink"/>
@@ -4760,7 +4760,7 @@
                 <w:noProof/>
                 <w:webHidden/>
               </w:rPr>
-              <w:instrText xml:space="preserve"> PAGEREF _Toc241779212 \h </w:instrText>
+              <w:instrText xml:space="preserve"> PAGEREF _Toc241779697 \h </w:instrText>
             </w:r>
             <w:r>
               <w:rPr>
@@ -4805,7 +4805,7 @@
               <w14:ligatures w14:val="standardContextual"/>
             </w:rPr>
           </w:pPr>
-          <w:hyperlink w:anchor="_Toc241779213" w:history="1">
+          <w:hyperlink w:anchor="_Toc241779698" w:history="1">
             <w:r>
               <w:rPr>
                 <w:rStyle w:val="Hyperlink"/>
@@ -4833,7 +4833,7 @@
                 <w:noProof/>
                 <w:webHidden/>
               </w:rPr>
-              <w:instrText xml:space="preserve"> PAGEREF _Toc241779213 \h </w:instrText>
+              <w:instrText xml:space="preserve"> PAGEREF _Toc241779698 \h </w:instrText>
             </w:r>
             <w:r>
               <w:rPr>
@@ -4878,7 +4878,7 @@
               <w14:ligatures w14:val="standardContextual"/>
             </w:rPr>
           </w:pPr>
-          <w:hyperlink w:anchor="_Toc241779214" w:history="1">
+          <w:hyperlink w:anchor="_Toc241779699" w:history="1">
             <w:r>
               <w:rPr>
                 <w:rStyle w:val="Hyperlink"/>
@@ -4906,7 +4906,7 @@
                 <w:noProof/>
                 <w:webHidden/>
               </w:rPr>
-              <w:instrText xml:space="preserve"> PAGEREF _Toc241779214 \h </w:instrText>
+              <w:instrText xml:space="preserve"> PAGEREF _Toc241779699 \h </w:instrText>
             </w:r>
             <w:r>
               <w:rPr>
@@ -4951,7 +4951,7 @@
               <w14:ligatures w14:val="standardContextual"/>
             </w:rPr>
           </w:pPr>
-          <w:hyperlink w:anchor="_Toc241779215" w:history="1">
+          <w:hyperlink w:anchor="_Toc241779700" w:history="1">
             <w:r>
               <w:rPr>
                 <w:rStyle w:val="Hyperlink"/>
@@ -4979,7 +4979,7 @@
                 <w:noProof/>
                 <w:webHidden/>
               </w:rPr>
-              <w:instrText xml:space="preserve"> PAGEREF _Toc241779215 \h </w:instrText>
+              <w:instrText xml:space="preserve"> PAGEREF _Toc241779700 \h </w:instrText>
             </w:r>
             <w:r>
               <w:rPr>
@@ -5024,7 +5024,7 @@
               <w14:ligatures w14:val="standardContextual"/>
             </w:rPr>
           </w:pPr>
-          <w:hyperlink w:anchor="_Toc241779216" w:history="1">
+          <w:hyperlink w:anchor="_Toc241779701" w:history="1">
             <w:r>
               <w:rPr>
                 <w:rStyle w:val="Hyperlink"/>
@@ -5052,7 +5052,7 @@
                 <w:noProof/>
                 <w:webHidden/>
               </w:rPr>
-              <w:instrText xml:space="preserve"> PAGEREF _Toc241779216 \h </w:instrText>
+              <w:instrText xml:space="preserve"> PAGEREF _Toc241779701 \h </w:instrText>
             </w:r>
             <w:r>
               <w:rPr>
@@ -5097,7 +5097,7 @@
               <w14:ligatures w14:val="standardContextual"/>
             </w:rPr>
           </w:pPr>
-          <w:hyperlink w:anchor="_Toc241779217" w:history="1">
+          <w:hyperlink w:anchor="_Toc241779702" w:history="1">
             <w:r>
               <w:rPr>
                 <w:rStyle w:val="Hyperlink"/>
@@ -5125,7 +5125,7 @@
                 <w:noProof/>
                 <w:webHidden/>
               </w:rPr>
-              <w:instrText xml:space="preserve"> PAGEREF _Toc241779217 \h </w:instrText>
+              <w:instrText xml:space="preserve"> PAGEREF _Toc241779702 \h </w:instrText>
             </w:r>
             <w:r>
               <w:rPr>
@@ -5170,7 +5170,7 @@
               <w14:ligatures w14:val="standardContextual"/>
             </w:rPr>
           </w:pPr>
-          <w:hyperlink w:anchor="_Toc241779218" w:history="1">
+          <w:hyperlink w:anchor="_Toc241779703" w:history="1">
             <w:r>
               <w:rPr>
                 <w:rStyle w:val="Hyperlink"/>
@@ -5198,7 +5198,7 @@
                 <w:noProof/>
                 <w:webHidden/>
               </w:rPr>
-              <w:instrText xml:space="preserve"> PAGEREF _Toc241779218 \h </w:instrText>
+              <w:instrText xml:space="preserve"> PAGEREF _Toc241779703 \h </w:instrText>
             </w:r>
             <w:r>
               <w:rPr>
@@ -5243,7 +5243,7 @@
               <w14:ligatures w14:val="standardContextual"/>
             </w:rPr>
           </w:pPr>
-          <w:hyperlink w:anchor="_Toc241779219" w:history="1">
+          <w:hyperlink w:anchor="_Toc241779704" w:history="1">
             <w:r>
               <w:rPr>
                 <w:rStyle w:val="Hyperlink"/>
@@ -5271,7 +5271,7 @@
                 <w:noProof/>
                 <w:webHidden/>
               </w:rPr>
-              <w:instrText xml:space="preserve"> PAGEREF _Toc241779219 \h </w:instrText>
+              <w:instrText xml:space="preserve"> PAGEREF _Toc241779704 \h </w:instrText>
             </w:r>
             <w:r>
               <w:rPr>
@@ -5316,7 +5316,7 @@
               <w14:ligatures w14:val="standardContextual"/>
             </w:rPr>
           </w:pPr>
-          <w:hyperlink w:anchor="_Toc241779220" w:history="1">
+          <w:hyperlink w:anchor="_Toc241779705" w:history="1">
             <w:r>
               <w:rPr>
                 <w:rStyle w:val="Hyperlink"/>
@@ -5344,7 +5344,7 @@
                 <w:noProof/>
                 <w:webHidden/>
               </w:rPr>
-              <w:instrText xml:space="preserve"> PAGEREF _Toc241779220 \h </w:instrText>
+              <w:instrText xml:space="preserve"> PAGEREF _Toc241779705 \h </w:instrText>
             </w:r>
             <w:r>
               <w:rPr>
@@ -5389,7 +5389,7 @@
               <w14:ligatures w14:val="standardContextual"/>
             </w:rPr>
           </w:pPr>
-          <w:hyperlink w:anchor="_Toc241779221" w:history="1">
+          <w:hyperlink w:anchor="_Toc241779706" w:history="1">
             <w:r>
               <w:rPr>
                 <w:rStyle w:val="Hyperlink"/>
@@ -5417,7 +5417,7 @@
                 <w:noProof/>
                 <w:webHidden/>
               </w:rPr>
-              <w:instrText xml:space="preserve"> PAGEREF _Toc241779221 \h </w:instrText>
+              <w:instrText xml:space="preserve"> PAGEREF _Toc241779706 \h </w:instrText>
             </w:r>
             <w:r>
               <w:rPr>
@@ -5462,7 +5462,7 @@
               <w14:ligatures w14:val="standardContextual"/>
             </w:rPr>
           </w:pPr>
-          <w:hyperlink w:anchor="_Toc241779222" w:history="1">
+          <w:hyperlink w:anchor="_Toc241779707" w:history="1">
             <w:r>
               <w:rPr>
                 <w:rStyle w:val="Hyperlink"/>
@@ -5490,7 +5490,7 @@
                 <w:noProof/>
                 <w:webHidden/>
               </w:rPr>
-              <w:instrText xml:space="preserve"> PAGEREF _Toc241779222 \h </w:instrText>
+              <w:instrText xml:space="preserve"> PAGEREF _Toc241779707 \h </w:instrText>
             </w:r>
             <w:r>
               <w:rPr>
@@ -5535,7 +5535,7 @@
               <w14:ligatures w14:val="standardContextual"/>
             </w:rPr>
           </w:pPr>
-          <w:hyperlink w:anchor="_Toc241779223" w:history="1">
+          <w:hyperlink w:anchor="_Toc241779708" w:history="1">
             <w:r>
               <w:rPr>
                 <w:rStyle w:val="Hyperlink"/>
@@ -5563,7 +5563,7 @@
                 <w:noProof/>
                 <w:webHidden/>
               </w:rPr>
-              <w:instrText xml:space="preserve"> PAGEREF _Toc241779223 \h </w:instrText>
+              <w:instrText xml:space="preserve"> PAGEREF _Toc241779708 \h </w:instrText>
             </w:r>
             <w:r>
               <w:rPr>
@@ -5608,7 +5608,7 @@
               <w14:ligatures w14:val="standardContextual"/>
             </w:rPr>
           </w:pPr>
-          <w:hyperlink w:anchor="_Toc241779224" w:history="1">
+          <w:hyperlink w:anchor="_Toc241779709" w:history="1">
             <w:r>
               <w:rPr>
                 <w:rStyle w:val="Hyperlink"/>
@@ -5636,7 +5636,7 @@
                 <w:noProof/>
                 <w:webHidden/>
               </w:rPr>
-              <w:instrText xml:space="preserve"> PAGEREF _Toc241779224 \h </w:instrText>
+              <w:instrText xml:space="preserve"> PAGEREF _Toc241779709 \h </w:instrText>
             </w:r>
             <w:r>
               <w:rPr>
@@ -5683,7 +5683,7 @@
               <w14:ligatures w14:val="standardContextual"/>
             </w:rPr>
           </w:pPr>
-          <w:hyperlink w:anchor="_Toc241779225" w:history="1">
+          <w:hyperlink w:anchor="_Toc241779710" w:history="1">
             <w:r>
               <w:rPr>
                 <w:rStyle w:val="Hyperlink"/>
@@ -5711,7 +5711,7 @@
                 <w:noProof/>
                 <w:webHidden/>
               </w:rPr>
-              <w:instrText xml:space="preserve"> PAGEREF _Toc241779225 \h </w:instrText>
+              <w:instrText xml:space="preserve"> PAGEREF _Toc241779710 \h </w:instrText>
             </w:r>
             <w:r>
               <w:rPr>
@@ -5756,7 +5756,7 @@
               <w14:ligatures w14:val="standardContextual"/>
             </w:rPr>
           </w:pPr>
-          <w:hyperlink w:anchor="_Toc241779226" w:history="1">
+          <w:hyperlink w:anchor="_Toc241779711" w:history="1">
             <w:r>
               <w:rPr>
                 <w:rStyle w:val="Hyperlink"/>
@@ -5784,7 +5784,7 @@
                 <w:noProof/>
                 <w:webHidden/>
               </w:rPr>
-              <w:instrText xml:space="preserve"> PAGEREF _Toc241779226 \h </w:instrText>
+              <w:instrText xml:space="preserve"> PAGEREF _Toc241779711 \h </w:instrText>
             </w:r>
             <w:r>
               <w:rPr>
@@ -5829,7 +5829,7 @@
               <w14:ligatures w14:val="standardContextual"/>
             </w:rPr>
           </w:pPr>
-          <w:hyperlink w:anchor="_Toc241779227" w:history="1">
+          <w:hyperlink w:anchor="_Toc241779712" w:history="1">
             <w:r>
               <w:rPr>
                 <w:rStyle w:val="Hyperlink"/>
@@ -5857,7 +5857,7 @@
                 <w:noProof/>
                 <w:webHidden/>
               </w:rPr>
-              <w:instrText xml:space="preserve"> PAGEREF _Toc241779227 \h </w:instrText>
+              <w:instrText xml:space="preserve"> PAGEREF _Toc241779712 \h </w:instrText>
             </w:r>
             <w:r>
               <w:rPr>
@@ -5902,7 +5902,7 @@
               <w14:ligatures w14:val="standardContextual"/>
             </w:rPr>
           </w:pPr>
-          <w:hyperlink w:anchor="_Toc241779228" w:history="1">
+          <w:hyperlink w:anchor="_Toc241779713" w:history="1">
             <w:r>
               <w:rPr>
                 <w:rStyle w:val="Hyperlink"/>
@@ -5930,7 +5930,7 @@
                 <w:noProof/>
                 <w:webHidden/>
               </w:rPr>
-              <w:instrText xml:space="preserve"> PAGEREF _Toc241779228 \h </w:instrText>
+              <w:instrText xml:space="preserve"> PAGEREF _Toc241779713 \h </w:instrText>
             </w:r>
             <w:r>
               <w:rPr>
@@ -5975,7 +5975,7 @@
               <w14:ligatures w14:val="standardContextual"/>
             </w:rPr>
           </w:pPr>
-          <w:hyperlink w:anchor="_Toc241779229" w:history="1">
+          <w:hyperlink w:anchor="_Toc241779714" w:history="1">
             <w:r>
               <w:rPr>
                 <w:rStyle w:val="Hyperlink"/>
@@ -6003,7 +6003,7 @@
                 <w:noProof/>
                 <w:webHidden/>
               </w:rPr>
-              <w:instrText xml:space="preserve"> PAGEREF _Toc241779229 \h </w:instrText>
+              <w:instrText xml:space="preserve"> PAGEREF _Toc241779714 \h </w:instrText>
             </w:r>
             <w:r>
               <w:rPr>
@@ -6048,7 +6048,7 @@
               <w14:ligatures w14:val="standardContextual"/>
             </w:rPr>
           </w:pPr>
-          <w:hyperlink w:anchor="_Toc241779230" w:history="1">
+          <w:hyperlink w:anchor="_Toc241779715" w:history="1">
             <w:r>
               <w:rPr>
                 <w:rStyle w:val="Hyperlink"/>
@@ -6076,7 +6076,7 @@
                 <w:noProof/>
                 <w:webHidden/>
               </w:rPr>
-              <w:instrText xml:space="preserve"> PAGEREF _Toc241779230 \h </w:instrText>
+              <w:instrText xml:space="preserve"> PAGEREF _Toc241779715 \h </w:instrText>
             </w:r>
             <w:r>
               <w:rPr>
@@ -6121,7 +6121,7 @@
               <w14:ligatures w14:val="standardContextual"/>
             </w:rPr>
           </w:pPr>
-          <w:hyperlink w:anchor="_Toc241779231" w:history="1">
+          <w:hyperlink w:anchor="_Toc241779716" w:history="1">
             <w:r>
               <w:rPr>
                 <w:rStyle w:val="Hyperlink"/>
@@ -6149,7 +6149,7 @@
                 <w:noProof/>
                 <w:webHidden/>
               </w:rPr>
-              <w:instrText xml:space="preserve"> PAGEREF _Toc241779231 \h </w:instrText>
+              <w:instrText xml:space="preserve"> PAGEREF _Toc241779716 \h </w:instrText>
             </w:r>
             <w:r>
               <w:rPr>
@@ -6196,7 +6196,7 @@
               <w14:ligatures w14:val="standardContextual"/>
             </w:rPr>
           </w:pPr>
-          <w:hyperlink w:anchor="_Toc241779232" w:history="1">
+          <w:hyperlink w:anchor="_Toc241779717" w:history="1">
             <w:r>
               <w:rPr>
                 <w:rStyle w:val="Hyperlink"/>
@@ -6224,7 +6224,7 @@
                 <w:noProof/>
                 <w:webHidden/>
               </w:rPr>
-              <w:instrText xml:space="preserve"> PAGEREF _Toc241779232 \h </w:instrText>
+              <w:instrText xml:space="preserve"> PAGEREF _Toc241779717 \h </w:instrText>
             </w:r>
             <w:r>
               <w:rPr>
@@ -6269,7 +6269,7 @@
               <w14:ligatures w14:val="standardContextual"/>
             </w:rPr>
           </w:pPr>
-          <w:hyperlink w:anchor="_Toc241779233" w:history="1">
+          <w:hyperlink w:anchor="_Toc241779718" w:history="1">
             <w:r>
               <w:rPr>
                 <w:rStyle w:val="Hyperlink"/>
@@ -6297,7 +6297,7 @@
                 <w:noProof/>
                 <w:webHidden/>
               </w:rPr>
-              <w:instrText xml:space="preserve"> PAGEREF _Toc241779233 \h </w:instrText>
+              <w:instrText xml:space="preserve"> PAGEREF _Toc241779718 \h </w:instrText>
             </w:r>
             <w:r>
               <w:rPr>
@@ -6342,7 +6342,7 @@
               <w14:ligatures w14:val="standardContextual"/>
             </w:rPr>
           </w:pPr>
-          <w:hyperlink w:anchor="_Toc241779234" w:history="1">
+          <w:hyperlink w:anchor="_Toc241779719" w:history="1">
             <w:r>
               <w:rPr>
                 <w:rStyle w:val="Hyperlink"/>
@@ -6370,7 +6370,7 @@
                 <w:noProof/>
                 <w:webHidden/>
               </w:rPr>
-              <w:instrText xml:space="preserve"> PAGEREF _Toc241779234 \h </w:instrText>
+              <w:instrText xml:space="preserve"> PAGEREF _Toc241779719 \h </w:instrText>
             </w:r>
             <w:r>
               <w:rPr>
@@ -6415,7 +6415,7 @@
               <w14:ligatures w14:val="standardContextual"/>
             </w:rPr>
           </w:pPr>
-          <w:hyperlink w:anchor="_Toc241779235" w:history="1">
+          <w:hyperlink w:anchor="_Toc241779720" w:history="1">
             <w:r>
               <w:rPr>
                 <w:rStyle w:val="Hyperlink"/>
@@ -6443,7 +6443,7 @@
                 <w:noProof/>
                 <w:webHidden/>
               </w:rPr>
-              <w:instrText xml:space="preserve"> PAGEREF _Toc241779235 \h </w:instrText>
+              <w:instrText xml:space="preserve"> PAGEREF _Toc241779720 \h </w:instrText>
             </w:r>
             <w:r>
               <w:rPr>
@@ -6488,7 +6488,7 @@
               <w14:ligatures w14:val="standardContextual"/>
             </w:rPr>
           </w:pPr>
-          <w:hyperlink w:anchor="_Toc241779236" w:history="1">
+          <w:hyperlink w:anchor="_Toc241779721" w:history="1">
             <w:r>
               <w:rPr>
                 <w:rStyle w:val="Hyperlink"/>
@@ -6516,7 +6516,7 @@
                 <w:noProof/>
                 <w:webHidden/>
               </w:rPr>
-              <w:instrText xml:space="preserve"> PAGEREF _Toc241779236 \h </w:instrText>
+              <w:instrText xml:space="preserve"> PAGEREF _Toc241779721 \h </w:instrText>
             </w:r>
             <w:r>
               <w:rPr>
@@ -6563,7 +6563,7 @@
               <w14:ligatures w14:val="standardContextual"/>
             </w:rPr>
           </w:pPr>
-          <w:hyperlink w:anchor="_Toc241779237" w:history="1">
+          <w:hyperlink w:anchor="_Toc241779722" w:history="1">
             <w:r>
               <w:rPr>
                 <w:rStyle w:val="Hyperlink"/>
@@ -6591,7 +6591,7 @@
                 <w:noProof/>
                 <w:webHidden/>
               </w:rPr>
-              <w:instrText xml:space="preserve"> PAGEREF _Toc241779237 \h </w:instrText>
+              <w:instrText xml:space="preserve"> PAGEREF _Toc241779722 \h </w:instrText>
             </w:r>
             <w:r>
               <w:rPr>
@@ -6636,7 +6636,7 @@
               <w14:ligatures w14:val="standardContextual"/>
             </w:rPr>
           </w:pPr>
-          <w:hyperlink w:anchor="_Toc241779238" w:history="1">
+          <w:hyperlink w:anchor="_Toc241779723" w:history="1">
             <w:r>
               <w:rPr>
                 <w:rStyle w:val="Hyperlink"/>
@@ -6664,7 +6664,7 @@
                 <w:noProof/>
                 <w:webHidden/>
               </w:rPr>
-              <w:instrText xml:space="preserve"> PAGEREF _Toc241779238 \h </w:instrText>
+              <w:instrText xml:space="preserve"> PAGEREF _Toc241779723 \h </w:instrText>
             </w:r>
             <w:r>
               <w:rPr>
@@ -6711,7 +6711,7 @@
               <w14:ligatures w14:val="standardContextual"/>
             </w:rPr>
           </w:pPr>
-          <w:hyperlink w:anchor="_Toc241779239" w:history="1">
+          <w:hyperlink w:anchor="_Toc241779724" w:history="1">
             <w:r>
               <w:rPr>
                 <w:rStyle w:val="Hyperlink"/>
@@ -6739,7 +6739,7 @@
                 <w:noProof/>
                 <w:webHidden/>
               </w:rPr>
-              <w:instrText xml:space="preserve"> PAGEREF _Toc241779239 \h </w:instrText>
+              <w:instrText xml:space="preserve"> PAGEREF _Toc241779724 \h </w:instrText>
             </w:r>
             <w:r>
               <w:rPr>
@@ -6786,7 +6786,7 @@
               <w14:ligatures w14:val="standardContextual"/>
             </w:rPr>
           </w:pPr>
-          <w:hyperlink w:anchor="_Toc241779240" w:history="1">
+          <w:hyperlink w:anchor="_Toc241779725" w:history="1">
             <w:r>
               <w:rPr>
                 <w:rStyle w:val="Hyperlink"/>
@@ -6814,7 +6814,7 @@
                 <w:noProof/>
                 <w:webHidden/>
               </w:rPr>
-              <w:instrText xml:space="preserve"> PAGEREF _Toc241779240 \h </w:instrText>
+              <w:instrText xml:space="preserve"> PAGEREF _Toc241779725 \h </w:instrText>
             </w:r>
             <w:r>
               <w:rPr>
@@ -6861,7 +6861,7 @@
               <w14:ligatures w14:val="standardContextual"/>
             </w:rPr>
           </w:pPr>
-          <w:hyperlink w:anchor="_Toc241779241" w:history="1">
+          <w:hyperlink w:anchor="_Toc241779726" w:history="1">
             <w:r>
               <w:rPr>
                 <w:rStyle w:val="Hyperlink"/>
@@ -6889,7 +6889,7 @@
                 <w:noProof/>
                 <w:webHidden/>
               </w:rPr>
-              <w:instrText xml:space="preserve"> PAGEREF _Toc241779241 \h </w:instrText>
+              <w:instrText xml:space="preserve"> PAGEREF _Toc241779726 \h </w:instrText>
             </w:r>
             <w:r>
               <w:rPr>
@@ -6948,7 +6948,7 @@
           <w:lang w:val="pt-BR"/>
         </w:rPr>
       </w:pPr>
-      <w:bookmarkStart w:id="0" w:name="_Toc241779166"/>
+      <w:bookmarkStart w:id="0" w:name="_Toc241779651"/>
       <w:r>
         <w:rPr>
           <w:lang w:val="pt-BR"/>
@@ -6966,7 +6966,7 @@
           <w:lang w:val="pt-BR"/>
         </w:rPr>
       </w:pPr>
-      <w:bookmarkStart w:id="1" w:name="_Toc241779167"/>
+      <w:bookmarkStart w:id="1" w:name="_Toc241779652"/>
       <w:r>
         <w:rPr>
           <w:lang w:val="pt-BR"/>
@@ -7031,7 +7031,7 @@
           <w:lang w:val="pt-BR"/>
         </w:rPr>
       </w:pPr>
-      <w:bookmarkStart w:id="2" w:name="_Toc241779168"/>
+      <w:bookmarkStart w:id="2" w:name="_Toc241779653"/>
       <w:r>
         <w:rPr>
           <w:lang w:val="pt-BR"/>
@@ -7064,7 +7064,7 @@
           <w:lang w:val="pt-BR"/>
         </w:rPr>
       </w:pPr>
-      <w:bookmarkStart w:id="3" w:name="_Toc241779169"/>
+      <w:bookmarkStart w:id="3" w:name="_Toc241779654"/>
       <w:r>
         <w:rPr>
           <w:lang w:val="pt-BR"/>
@@ -7120,7 +7120,7 @@
           <w:lang w:val="pt-BR"/>
         </w:rPr>
       </w:pPr>
-      <w:bookmarkStart w:id="4" w:name="_Toc241779170"/>
+      <w:bookmarkStart w:id="4" w:name="_Toc241779655"/>
       <w:r>
         <w:rPr>
           <w:lang w:val="pt-BR"/>
@@ -7169,7 +7169,7 @@
           <w:lang w:val="pt-BR"/>
         </w:rPr>
       </w:pPr>
-      <w:bookmarkStart w:id="5" w:name="_Toc241779171"/>
+      <w:bookmarkStart w:id="5" w:name="_Toc241779656"/>
       <w:r>
         <w:rPr>
           <w:lang w:val="pt-BR"/>
@@ -7235,7 +7235,7 @@
           <w:lang w:val="pt-BR"/>
         </w:rPr>
       </w:pPr>
-      <w:bookmarkStart w:id="6" w:name="_Toc241779172"/>
+      <w:bookmarkStart w:id="6" w:name="_Toc241779657"/>
       <w:r>
         <w:rPr>
           <w:lang w:val="pt-BR"/>
@@ -7317,7 +7317,7 @@
           <w:lang w:val="pt-BR"/>
         </w:rPr>
       </w:pPr>
-      <w:bookmarkStart w:id="7" w:name="_Toc241779173"/>
+      <w:bookmarkStart w:id="7" w:name="_Toc241779658"/>
       <w:r>
         <w:rPr>
           <w:lang w:val="pt-BR"/>
@@ -7433,7 +7433,7 @@
           <w:lang w:val="pt-BR"/>
         </w:rPr>
       </w:pPr>
-      <w:bookmarkStart w:id="8" w:name="_Toc241779174"/>
+      <w:bookmarkStart w:id="8" w:name="_Toc241779659"/>
       <w:r>
         <w:rPr>
           <w:lang w:val="pt-BR"/>
@@ -7450,7 +7450,7 @@
           <w:lang w:val="pt-BR"/>
         </w:rPr>
       </w:pPr>
-      <w:bookmarkStart w:id="9" w:name="_Toc241779175"/>
+      <w:bookmarkStart w:id="9" w:name="_Toc241779660"/>
       <w:r>
         <w:rPr>
           <w:lang w:val="pt-BR"/>
@@ -7483,7 +7483,7 @@
           <w:lang w:val="pt-BR"/>
         </w:rPr>
       </w:pPr>
-      <w:bookmarkStart w:id="10" w:name="_Toc241779176"/>
+      <w:bookmarkStart w:id="10" w:name="_Toc241779661"/>
       <w:r>
         <w:rPr>
           <w:lang w:val="pt-BR"/>
@@ -7697,7 +7697,7 @@
           <w:lang w:val="pt-BR"/>
         </w:rPr>
       </w:pPr>
-      <w:bookmarkStart w:id="11" w:name="_Toc241779177"/>
+      <w:bookmarkStart w:id="11" w:name="_Toc241779662"/>
       <w:r>
         <w:rPr>
           <w:lang w:val="pt-BR"/>
@@ -7817,7 +7817,7 @@
           <w:lang w:val="pt-BR"/>
         </w:rPr>
       </w:pPr>
-      <w:bookmarkStart w:id="12" w:name="_Toc241779178"/>
+      <w:bookmarkStart w:id="12" w:name="_Toc241779663"/>
       <w:r>
         <w:rPr>
           <w:lang w:val="pt-BR"/>
@@ -7868,7 +7868,7 @@
           <w:lang w:val="pt-BR"/>
         </w:rPr>
       </w:pPr>
-      <w:bookmarkStart w:id="13" w:name="_Toc241779179"/>
+      <w:bookmarkStart w:id="13" w:name="_Toc241779664"/>
       <w:r>
         <w:rPr>
           <w:lang w:val="pt-BR"/>
@@ -7886,7 +7886,7 @@
           <w:lang w:val="pt-BR"/>
         </w:rPr>
       </w:pPr>
-      <w:bookmarkStart w:id="14" w:name="_Toc241779180"/>
+      <w:bookmarkStart w:id="14" w:name="_Toc241779665"/>
       <w:r>
         <w:rPr>
           <w:lang w:val="pt-BR"/>
@@ -8006,7 +8006,7 @@
           <w:lang w:val="pt-BR"/>
         </w:rPr>
       </w:pPr>
-      <w:bookmarkStart w:id="15" w:name="_Toc241779181"/>
+      <w:bookmarkStart w:id="15" w:name="_Toc241779666"/>
       <w:r>
         <w:rPr>
           <w:lang w:val="pt-BR"/>
@@ -8165,7 +8165,7 @@
           <w:lang w:val="pt-BR"/>
         </w:rPr>
       </w:pPr>
-      <w:bookmarkStart w:id="16" w:name="_Toc241779182"/>
+      <w:bookmarkStart w:id="16" w:name="_Toc241779667"/>
       <w:r>
         <w:rPr>
           <w:lang w:val="pt-BR"/>
@@ -8857,7 +8857,7 @@
           <w:lang w:val="pt-BR"/>
         </w:rPr>
       </w:pPr>
-      <w:bookmarkStart w:id="17" w:name="_Toc241779183"/>
+      <w:bookmarkStart w:id="17" w:name="_Toc241779668"/>
       <w:r>
         <w:rPr>
           <w:lang w:val="pt-BR"/>
@@ -8939,7 +8939,7 @@
           <w:lang w:val="pt-BR"/>
         </w:rPr>
       </w:pPr>
-      <w:bookmarkStart w:id="18" w:name="_Toc241779184"/>
+      <w:bookmarkStart w:id="18" w:name="_Toc241779669"/>
       <w:r>
         <w:rPr>
           <w:lang w:val="pt-BR"/>
@@ -9082,7 +9082,7 @@
           <w:lang w:val="pt-BR"/>
         </w:rPr>
       </w:pPr>
-      <w:bookmarkStart w:id="19" w:name="_Toc241779185"/>
+      <w:bookmarkStart w:id="19" w:name="_Toc241779670"/>
       <w:r>
         <w:rPr>
           <w:lang w:val="pt-BR"/>
@@ -9186,7 +9186,7 @@
           <w:lang w:val="pt-BR"/>
         </w:rPr>
       </w:pPr>
-      <w:bookmarkStart w:id="20" w:name="_Toc241779186"/>
+      <w:bookmarkStart w:id="20" w:name="_Toc241779671"/>
       <w:r>
         <w:rPr>
           <w:lang w:val="pt-BR"/>
@@ -9274,7 +9274,7 @@
           <w:lang w:val="pt-BR"/>
         </w:rPr>
       </w:pPr>
-      <w:bookmarkStart w:id="21" w:name="_Toc241779187"/>
+      <w:bookmarkStart w:id="21" w:name="_Toc241779672"/>
       <w:r>
         <w:rPr>
           <w:lang w:val="pt-BR"/>
@@ -9417,7 +9417,7 @@
           <w:lang w:val="pt-BR"/>
         </w:rPr>
       </w:pPr>
-      <w:bookmarkStart w:id="22" w:name="_Toc241779188"/>
+      <w:bookmarkStart w:id="22" w:name="_Toc241779673"/>
       <w:r>
         <w:rPr>
           <w:lang w:val="pt-BR"/>
@@ -9537,7 +9537,7 @@
           <w:lang w:val="pt-BR"/>
         </w:rPr>
       </w:pPr>
-      <w:bookmarkStart w:id="23" w:name="_Toc241779189"/>
+      <w:bookmarkStart w:id="23" w:name="_Toc241779674"/>
       <w:r>
         <w:rPr>
           <w:lang w:val="pt-BR"/>
@@ -9643,7 +9643,7 @@
           <w:lang w:val="pt-BR"/>
         </w:rPr>
       </w:pPr>
-      <w:bookmarkStart w:id="24" w:name="_Toc241779190"/>
+      <w:bookmarkStart w:id="24" w:name="_Toc241779675"/>
       <w:r>
         <w:rPr>
           <w:lang w:val="pt-BR"/>
@@ -9661,7 +9661,7 @@
           <w:lang w:val="pt-BR"/>
         </w:rPr>
       </w:pPr>
-      <w:bookmarkStart w:id="25" w:name="_Toc241779191"/>
+      <w:bookmarkStart w:id="25" w:name="_Toc241779676"/>
       <w:r>
         <w:rPr>
           <w:lang w:val="pt-BR"/>
@@ -9694,7 +9694,7 @@
           <w:lang w:val="pt-BR"/>
         </w:rPr>
       </w:pPr>
-      <w:bookmarkStart w:id="26" w:name="_Toc241779192"/>
+      <w:bookmarkStart w:id="26" w:name="_Toc241779677"/>
       <w:r>
         <w:rPr>
           <w:lang w:val="pt-BR"/>
@@ -9917,7 +9917,7 @@
           <w:lang w:val="pt-BR"/>
         </w:rPr>
       </w:pPr>
-      <w:bookmarkStart w:id="27" w:name="_Toc241779193"/>
+      <w:bookmarkStart w:id="27" w:name="_Toc241779678"/>
       <w:r>
         <w:rPr>
           <w:lang w:val="pt-BR"/>
@@ -12070,7 +12070,7 @@
           <w:lang w:val="pt-BR"/>
         </w:rPr>
       </w:pPr>
-      <w:bookmarkStart w:id="28" w:name="_Toc241779194"/>
+      <w:bookmarkStart w:id="28" w:name="_Toc241779679"/>
       <w:r>
         <w:rPr>
           <w:lang w:val="pt-BR"/>
@@ -12736,7 +12736,7 @@
           <w:lang w:val="pt-BR"/>
         </w:rPr>
       </w:pPr>
-      <w:bookmarkStart w:id="29" w:name="_Toc241779195"/>
+      <w:bookmarkStart w:id="29" w:name="_Toc241779680"/>
       <w:r>
         <w:rPr>
           <w:lang w:val="pt-BR"/>
@@ -13460,7 +13460,7 @@
           <w:lang w:val="pt-BR"/>
         </w:rPr>
       </w:pPr>
-      <w:bookmarkStart w:id="30" w:name="_Toc241779196"/>
+      <w:bookmarkStart w:id="30" w:name="_Toc241779681"/>
       <w:r>
         <w:rPr>
           <w:lang w:val="pt-BR"/>
@@ -14288,7 +14288,7 @@
           <w:lang w:val="pt-BR"/>
         </w:rPr>
       </w:pPr>
-      <w:bookmarkStart w:id="31" w:name="_Toc241779197"/>
+      <w:bookmarkStart w:id="31" w:name="_Toc241779682"/>
       <w:r>
         <w:rPr>
           <w:lang w:val="pt-BR"/>
@@ -14350,7 +14350,7 @@
           <w:lang w:val="pt-BR"/>
         </w:rPr>
       </w:pPr>
-      <w:bookmarkStart w:id="32" w:name="_Toc241779198"/>
+      <w:bookmarkStart w:id="32" w:name="_Toc241779683"/>
       <w:r>
         <w:rPr>
           <w:lang w:val="pt-BR"/>
@@ -14506,7 +14506,7 @@
           <w:lang w:val="pt-BR"/>
         </w:rPr>
       </w:pPr>
-      <w:bookmarkStart w:id="33" w:name="_Toc241779199"/>
+      <w:bookmarkStart w:id="33" w:name="_Toc241779684"/>
       <w:r>
         <w:rPr>
           <w:lang w:val="pt-BR"/>
@@ -14630,7 +14630,7 @@
           <w:lang w:val="pt-BR"/>
         </w:rPr>
       </w:pPr>
-      <w:bookmarkStart w:id="34" w:name="_Toc241779200"/>
+      <w:bookmarkStart w:id="34" w:name="_Toc241779685"/>
       <w:r>
         <w:rPr>
           <w:lang w:val="pt-BR"/>
@@ -14644,7 +14644,7 @@
         <w:pStyle w:val="Heading3"/>
         <w:spacing w:before="320" w:after="200" w:line="360" w:lineRule="auto"/>
       </w:pPr>
-      <w:bookmarkStart w:id="35" w:name="_Toc241779201"/>
+      <w:bookmarkStart w:id="35" w:name="_Toc241779686"/>
       <w:r>
         <w:rPr>
           <w:lang w:val="pt-BR"/>
@@ -14758,7 +14758,7 @@
         <w:pStyle w:val="Heading3"/>
         <w:spacing w:before="320" w:after="200" w:line="360" w:lineRule="auto"/>
       </w:pPr>
-      <w:bookmarkStart w:id="36" w:name="_Toc241779202"/>
+      <w:bookmarkStart w:id="36" w:name="_Toc241779687"/>
       <w:r>
         <w:rPr>
           <w:lang w:val="pt-BR"/>
@@ -14887,7 +14887,7 @@
           <w:lang w:val="pt-BR"/>
         </w:rPr>
       </w:pPr>
-      <w:bookmarkStart w:id="37" w:name="_Toc241779203"/>
+      <w:bookmarkStart w:id="37" w:name="_Toc241779688"/>
       <w:r>
         <w:rPr>
           <w:lang w:val="pt-BR"/>
@@ -15041,7 +15041,7 @@
           <w:lang w:val="pt-BR"/>
         </w:rPr>
       </w:pPr>
-      <w:bookmarkStart w:id="38" w:name="_Toc241779204"/>
+      <w:bookmarkStart w:id="38" w:name="_Toc241779689"/>
       <w:r>
         <w:rPr>
           <w:lang w:val="pt-BR"/>
@@ -15822,7 +15822,7 @@
           <w:lang w:val="pt-BR"/>
         </w:rPr>
       </w:pPr>
-      <w:bookmarkStart w:id="39" w:name="_Toc241779205"/>
+      <w:bookmarkStart w:id="39" w:name="_Toc241779690"/>
       <w:r>
         <w:rPr>
           <w:lang w:val="pt-BR"/>
@@ -16372,7 +16372,7 @@
           <w:lang w:val="pt-BR"/>
         </w:rPr>
       </w:pPr>
-      <w:bookmarkStart w:id="40" w:name="_Toc241779206"/>
+      <w:bookmarkStart w:id="40" w:name="_Toc241779691"/>
       <w:r>
         <w:rPr>
           <w:lang w:val="pt-BR"/>
@@ -16553,14 +16553,14 @@
         <w:rPr>
           <w:lang w:val="pt-BR"/>
         </w:rPr>
-        <w:t xml:space="preserve">Um último confronto trata só da forma da resposta, com dado real de resolução sub-horária. São oito noites reais da série de 15 min de Zurique (3.6), do ano de teste, de quatro pontos sorteados, e três concorrentes com a mesma previsão e as mesmas regras: a inferência nebulosa, a tabela em degraus e uma tabela com histerese de descida, que sobe de faixa no tercil, na hora, e só desce quando o volume cai 0,05 abaixo dele — a correção simples que se aplicaria à tabela. Conta-se o número de passos do ciclo em que o nível emitido varia ao menos 6 % em relação ao anterior, valor acima do qual um aumento de iluminância é percebido por observador atento (SHIKAKURA; MORIKAWA; NAKAMURA, 2003), e, como limiar mais largo, ao menos </w:t>
+        <w:t xml:space="preserve">Um último confronto trata só da forma da resposta, com dado real de resolução sub-horária. São oito noites reais da série de 15 min de Zurique (3.6), do ano de teste, de quatro pontos sorteados, e três concorrentes com a mesma previsão e as mesmas regras: a inferência nebulosa, a tabela em degraus e uma tabela com histerese de descida, que sobe de faixa no tercil, na hora, e só desce quando o volume cai 0,05 abaixo dele — a correção simples que se aplicaria à tabela. Conta-se o número de passos do ciclo em que o nível emitido varia, em relação ao anterior, ao menos um limiar de percepção. O protocolo fixou dois limiares, de 15 % e de 6 %. Conferidas as fontes depois da execução, só o de 6 % tem apoio direto na literatura: é o valor acima </w:t>
       </w:r>
       <w:r>
         <w:rPr>
           <w:lang w:val="pt-BR"/>
         </w:rPr>
         <w:lastRenderedPageBreak/>
-        <w:t>15 %, valor adotado pelos autores. O estudo de referência foi conduzido em ambiente de escritório, com iluminâncias muito superiores às de uma via; não se localizou valor medido para via pública. O critério, fixado antes da execução, considera a inferência nebulosa não substituível se apresentar ao menos 20 % menos mudanças perceptíveis que a melhor das tabelas, nos dois limiares, sem consumir mais de 2 pontos percentuais de energia além dela e sem mais minutos abaixo do nível pedido. Nesses cenários a previsão é a do modelo em operação, treinado com a série de Melbourne; sua precisão sobre os dados de Zurique não é avaliada, e ela é a mesma para os três concorrentes.</w:t>
+        <w:t>do qual um aumento de iluminância é percebido por observador atento (SHIKAKURA; MORIKAWA; NAKAMURA, 2003). Reporta-se também, como conferência posterior, o de 30 %, que a mesma fonte indica para observador ocupado em tarefa. O estudo foi conduzido em ambiente de escritório, com iluminâncias muito superiores às de uma via; não se localizou valor medido para via pública. O critério, fixado antes da execução, considera a inferência nebulosa não substituível se apresentar ao menos 20 % menos mudanças perceptíveis que a melhor das tabelas, nos dois limiares, sem consumir mais de 2 pontos percentuais de energia além dela e sem mais minutos abaixo do nível pedido. Nesses cenários a previsão é a do modelo em operação, treinado com a série de Melbourne; sua precisão sobre os dados de Zurique não é avaliada, e ela é a mesma para os três concorrentes.</w:t>
       </w:r>
     </w:p>
     <w:p>
@@ -16616,7 +16616,7 @@
           <w:lang w:val="pt-BR"/>
         </w:rPr>
       </w:pPr>
-      <w:bookmarkStart w:id="41" w:name="_Toc241779207"/>
+      <w:bookmarkStart w:id="41" w:name="_Toc241779692"/>
       <w:r>
         <w:rPr>
           <w:lang w:val="pt-BR"/>
@@ -16635,6 +16635,7 @@
         <w:rPr>
           <w:lang w:val="pt-BR"/>
         </w:rPr>
+        <w:lastRenderedPageBreak/>
         <w:t xml:space="preserve">O sistema não captura, não processa e não armazena imagem, som ou qualquer dado que permita identificar pessoa. </w:t>
       </w:r>
       <w:r>
@@ -16658,7 +16659,6 @@
         <w:rPr>
           <w:lang w:val="pt-BR"/>
         </w:rPr>
-        <w:lastRenderedPageBreak/>
         <w:t>A interface de dados urbanos publica apenas descritores agregados do estado da via — média de pessoas presentes no trecho num período, ocorrência reportada —, sem referência a indivíduo: contagem, e não identificação.</w:t>
       </w:r>
     </w:p>
@@ -16751,7 +16751,14 @@
         <w:rPr>
           <w:lang w:val="pt-BR"/>
         </w:rPr>
-        <w:t>O risco de desvio de finalidade não é hipotético, e há caso documentado que convém registrar. Em San Diego, nos Estados Unidos, cerca de três mil e trezentos postes receberam sensores e câmeras com finalidade declarada de planejamento urbano e de mobilidade, expressamente não policial. A partir de 2018 o departamento de polícia passou a acessar as imagens, chegando a cerca de quatrocentos acessos até 2020, inicialmente sob alegação de crimes graves e depois também de vandalismo e descarte irregular de resíduos; a reação pública levou à desativação do programa em 2020 e à edição de norma municipal de vigilância (PERRY, 2020). O episódio é a razão pela qual a fronteira entre dado agregado e dado de identificação, neste trabalho, é requisito de interface e não recomendação de uso.</w:t>
+        <w:t xml:space="preserve">O risco de desvio de finalidade não é hipotético, e há caso documentado que convém registrar. Em San Diego, nos Estados Unidos, cerca de três mil e trezentos postes receberam sensores e câmeras com finalidade declarada de planejamento urbano e de mobilidade, expressamente não policial. A partir de 2018 o departamento de polícia passou a acessar as imagens, chegando a cerca de quatrocentos acessos até 2020, inicialmente sob alegação de crimes graves e depois também de vandalismo e descarte irregular de resíduos; a reação pública levou à desativação do programa em 2020 e à edição de norma municipal de vigilância (PERRY, 2020). O episódio é a </w:t>
+      </w:r>
+      <w:r>
+        <w:rPr>
+          <w:lang w:val="pt-BR"/>
+        </w:rPr>
+        <w:lastRenderedPageBreak/>
+        <w:t>razão pela qual a fronteira entre dado agregado e dado de identificação, neste trabalho, é requisito de interface e não recomendação de uso.</w:t>
       </w:r>
     </w:p>
     <w:p>
@@ -16767,7 +16774,6 @@
         <w:rPr>
           <w:lang w:val="pt-BR"/>
         </w:rPr>
-        <w:lastRenderedPageBreak/>
         <w:t>A ressalva merece registro explícito, e não nota de rodapé. A literatura acadêmica que examina a plataforma municipal de videomonitoramento concentra-se justamente sobre o reconhecimento facial e seus efeitos discriminatórios, apontando identificação desproporcional de pessoas negras como suspeitas (OLIVEIRA; FAGUNDES; SPOLLE, 2025). Propor que outro serviço municipal consuma dados dessa plataforma sem enfrentar essa crítica seria metodologicamente frágil. A resposta deste trabalho é de projeto, e não de discurso: a especificação de integração produzida como resultado define, como requisito, que a interface publique exclusivamente descritores agregados do estado da via, e que identificadores biométricos, imagens e placas não componham o contrato de dados. A camada de decisão aqui construída não teria como consumi-los ainda que fossem oferecidos, porque suas variáveis de entrada são grandezas de via e não atributos de pessoa.</w:t>
       </w:r>
     </w:p>
@@ -16779,7 +16785,7 @@
           <w:lang w:val="pt-BR"/>
         </w:rPr>
       </w:pPr>
-      <w:bookmarkStart w:id="42" w:name="_Toc241779208"/>
+      <w:bookmarkStart w:id="42" w:name="_Toc241779693"/>
       <w:r>
         <w:rPr>
           <w:lang w:val="pt-BR"/>
@@ -16817,7 +16823,14 @@
         <w:rPr>
           <w:lang w:val="pt-BR"/>
         </w:rPr>
-        <w:t>A hipótese que sustenta o cálculo é a proporcionalidade entre o ciclo de trabalho e a potência média consumida, e ela é adequada ao arranjo adotado: a modulação por largura de pulso chaveia a corrente plena do segmento, de modo que a potência média é o produto da potência em condução pela fração de tempo em que há condução. A mesma proporcionalidade vale, aproximadamente, para o fluxo luminoso, o que oferece verificação cruzada útil — a estimativa derivada do ciclo comandado pode ser confrontada com a derivada da iluminância medida, e a divergência entre as duas é reportada junto ao resultado. A comparação entre as duas estimativas é também exibida em tempo real no painel, calculada pelo mesmo módulo que produz os resultados do Capítulo 5.</w:t>
+        <w:t xml:space="preserve">A hipótese que sustenta o cálculo é a proporcionalidade entre o ciclo de trabalho e a potência média consumida, e ela é adequada ao arranjo adotado: a modulação por largura de pulso chaveia a corrente plena do segmento, de modo que a potência média é o produto da potência em condução pela fração de tempo em que há condução. A mesma proporcionalidade vale, aproximadamente, para o fluxo luminoso, o que oferece verificação cruzada útil — a estimativa derivada do ciclo comandado pode ser confrontada com a derivada da iluminância medida, e a divergência entre as duas é reportada junto ao resultado. A comparação entre as duas </w:t>
+      </w:r>
+      <w:r>
+        <w:rPr>
+          <w:lang w:val="pt-BR"/>
+        </w:rPr>
+        <w:lastRenderedPageBreak/>
+        <w:t>estimativas é também exibida em tempo real no painel, calculada pelo mesmo módulo que produz os resultados do Capítulo 5.</w:t>
       </w:r>
     </w:p>
     <w:p>
@@ -16833,7 +16846,6 @@
         <w:rPr>
           <w:lang w:val="pt-BR"/>
         </w:rPr>
-        <w:lastRenderedPageBreak/>
         <w:t>A potência do segmento de bancada, da ordem de um watt, não tem significado para quem raciocina em termos do parque municipal. A estimativa é, por isso, expressa também para uma luminária de referência. A projeção é legítima pela propriedade estabelecida em 3.3: a camada de decisão emite um nível adimensional, e a mesma trajetória de níveis que comanda a bancada comandaria uma luminária viária. A luminária de referência não é um modelo comercial — o modelo instalado nas vias de pedestres do município não é informação divulgada. Ela é derivada dos parâmetros que o Caderno de Encargos da concessão impõe a toda luminária do parque (SÃO PAULO, 2015), e adota a potência mínima da faixa contratual, conforme o Quadro 9.</w:t>
       </w:r>
     </w:p>
@@ -17338,14 +17350,14 @@
         <w:rPr>
           <w:lang w:val="pt-BR"/>
         </w:rPr>
-        <w:t xml:space="preserve">Com a luminária de referência, a energia não precisa ser inferida da telemetria da bancada: decorre do próprio registro de decisões. Entre duas decisões consecutivas, o nível emitido segue trajetória linear por partes, imposta pela camada de verificação — a elevação é imediata, e a atenuação é rampeada à taxa máxima de um décimo do fluxo pleno por minuto até atingir o novo nível, no qual permanece. A integral dessa trajetória tem forma fechada. Sejam a e b os níveis anterior e novo, expressos como fração do fluxo pleno, P a potência nominal em watts e Δt o intervalo até a decisão seguinte, em minutos. Numa atenuação, a rampa dura d = (a − b)/0,1 minutos, e a energia consumida no intervalo, em watt-hora, é E = P × [(a + b)/2 × d + b × (Δt − d)] / 60. Numa elevação, E = P × b × Δt / 60. Quando a decisão seguinte chega antes do fim da rampa, integra-se apenas o trecho percorrido. Cada decisão registrada produz, assim, um valor de energia, e a energia de um cenário é a soma </w:t>
+        <w:t xml:space="preserve">Com a luminária de referência, a energia não precisa ser inferida da telemetria da bancada: decorre do próprio registro de decisões. Entre duas decisões consecutivas, o nível emitido segue trajetória linear por partes, imposta pela camada de verificação — a elevação é imediata, e a atenuação é rampeada à taxa máxima de um décimo do fluxo pleno por minuto até atingir o novo nível, no qual permanece. A integral dessa trajetória tem forma fechada. Sejam a e b os níveis anterior e novo, expressos como fração do fluxo pleno, P a potência nominal em watts e Δt o intervalo até a decisão seguinte, em minutos. Numa atenuação, a rampa dura d = (a − b)/0,1 minutos, e a energia consumida no intervalo, em watt-hora, é E = P × [(a + b)/2 × d + b × (Δt − d)] / 60. Numa elevação, E = P × b × Δt / 60. Quando a decisão seguinte </w:t>
       </w:r>
       <w:r>
         <w:rPr>
           <w:lang w:val="pt-BR"/>
         </w:rPr>
         <w:lastRenderedPageBreak/>
-        <w:t>desses valores. A título de ordem de grandeza, a descida completa de P3 a P5, que a norma obriga a durar ao menos cinco minutos, consome 2,50 Wh na luminária de referência, contra 3,33 Wh no mesmo intervalo em fluxo pleno.</w:t>
+        <w:t>chega antes do fim da rampa, integra-se apenas o trecho percorrido. Cada decisão registrada produz, assim, um valor de energia, e a energia de um cenário é a soma desses valores. A título de ordem de grandeza, a descida completa de P3 a P5, que a norma obriga a durar ao menos cinco minutos, consome 2,50 Wh na luminária de referência, contra 3,33 Wh no mesmo intervalo em fluxo pleno.</w:t>
       </w:r>
     </w:p>
     <w:p>
@@ -17406,14 +17418,14 @@
         <w:rPr>
           <w:lang w:val="pt-BR"/>
         </w:rPr>
-        <w:t xml:space="preserve">Uma advertência metodológica precede o resultado. Consumo, isoladamente, não é critério de mérito em iluminação pública: o regime de menor consumo é o de luz apagada, e qualquer comparação que premie apenas a redução premiará o regime menos seguro. A avaliação é, por isso, conjunta, e reporta dois valores para cada regime — a energia estimada e a aderência da iluminação à demanda observada, </w:t>
+        <w:t xml:space="preserve">Uma advertência metodológica precede o resultado. Consumo, isoladamente, não é critério de mérito em iluminação pública: o regime de menor consumo é o de luz apagada, e qualquer comparação que premie apenas a redução premiará o regime </w:t>
       </w:r>
       <w:r>
         <w:rPr>
           <w:lang w:val="pt-BR"/>
         </w:rPr>
         <w:lastRenderedPageBreak/>
-        <w:t>medida como a fração dos ciclos em que o nível entregue se situou dentro do envelope esperado do cenário, nos termos de 3.9. O que o trabalho busca estabelecer não é o consumo mínimo, e sim o consumo aderente à condição observada, sem que em nenhum momento os limites da norma sejam transgredidos.</w:t>
+        <w:t>menos seguro. A avaliação é, por isso, conjunta, e reporta dois valores para cada regime — a energia estimada e a aderência da iluminação à demanda observada, medida como a fração dos ciclos em que o nível entregue se situou dentro do envelope esperado do cenário, nos termos de 3.9. O que o trabalho busca estabelecer não é o consumo mínimo, e sim o consumo aderente à condição observada, sem que em nenhum momento os limites da norma sejam transgredidos.</w:t>
       </w:r>
     </w:p>
     <w:p>
@@ -17441,7 +17453,7 @@
           <w:lang w:val="pt-BR"/>
         </w:rPr>
       </w:pPr>
-      <w:bookmarkStart w:id="43" w:name="_Toc241779209"/>
+      <w:bookmarkStart w:id="43" w:name="_Toc241779694"/>
       <w:r>
         <w:rPr>
           <w:lang w:val="pt-BR"/>
@@ -17475,7 +17487,7 @@
           <w:lang w:val="pt-BR"/>
         </w:rPr>
       </w:pPr>
-      <w:bookmarkStart w:id="44" w:name="_Toc241779210"/>
+      <w:bookmarkStart w:id="44" w:name="_Toc241779695"/>
       <w:r>
         <w:rPr>
           <w:lang w:val="pt-BR"/>
@@ -17509,7 +17521,7 @@
           <w:lang w:val="pt-BR"/>
         </w:rPr>
       </w:pPr>
-      <w:bookmarkStart w:id="45" w:name="_Toc241779211"/>
+      <w:bookmarkStart w:id="45" w:name="_Toc241779696"/>
       <w:r>
         <w:rPr>
           <w:lang w:val="pt-BR"/>
@@ -17543,7 +17555,7 @@
           <w:lang w:val="pt-BR"/>
         </w:rPr>
       </w:pPr>
-      <w:bookmarkStart w:id="46" w:name="_Toc241779212"/>
+      <w:bookmarkStart w:id="46" w:name="_Toc241779697"/>
       <w:r>
         <w:rPr>
           <w:lang w:val="pt-BR"/>
@@ -18523,7 +18535,7 @@
           <w:lang w:val="pt-BR"/>
         </w:rPr>
       </w:pPr>
-      <w:bookmarkStart w:id="47" w:name="_Toc241779213"/>
+      <w:bookmarkStart w:id="47" w:name="_Toc241779698"/>
       <w:r>
         <w:rPr>
           <w:lang w:val="pt-BR"/>
@@ -19573,7 +19585,7 @@
           <w:lang w:val="pt-BR"/>
         </w:rPr>
       </w:pPr>
-      <w:bookmarkStart w:id="48" w:name="_Toc241779214"/>
+      <w:bookmarkStart w:id="48" w:name="_Toc241779699"/>
       <w:r>
         <w:rPr>
           <w:lang w:val="pt-BR"/>
@@ -19608,7 +19620,7 @@
           <w:lang w:val="pt-BR"/>
         </w:rPr>
       </w:pPr>
-      <w:bookmarkStart w:id="49" w:name="_Toc241779215"/>
+      <w:bookmarkStart w:id="49" w:name="_Toc241779700"/>
       <w:r>
         <w:rPr>
           <w:lang w:val="pt-BR"/>
@@ -21156,7 +21168,7 @@
           <w:lang w:val="pt-BR"/>
         </w:rPr>
       </w:pPr>
-      <w:bookmarkStart w:id="50" w:name="_Toc241779216"/>
+      <w:bookmarkStart w:id="50" w:name="_Toc241779701"/>
       <w:r>
         <w:rPr>
           <w:lang w:val="pt-BR"/>
@@ -21329,7 +21341,7 @@
           <w:lang w:val="pt-BR"/>
         </w:rPr>
       </w:pPr>
-      <w:bookmarkStart w:id="51" w:name="_Toc241779217"/>
+      <w:bookmarkStart w:id="51" w:name="_Toc241779702"/>
       <w:r>
         <w:rPr>
           <w:lang w:val="pt-BR"/>
@@ -22347,7 +22359,7 @@
           <w:lang w:val="pt-BR"/>
         </w:rPr>
       </w:pPr>
-      <w:bookmarkStart w:id="52" w:name="_Toc241779218"/>
+      <w:bookmarkStart w:id="52" w:name="_Toc241779703"/>
       <w:r>
         <w:rPr>
           <w:lang w:val="pt-BR"/>
@@ -22364,7 +22376,7 @@
           <w:lang w:val="pt-BR"/>
         </w:rPr>
       </w:pPr>
-      <w:bookmarkStart w:id="53" w:name="_Toc241779219"/>
+      <w:bookmarkStart w:id="53" w:name="_Toc241779704"/>
       <w:r>
         <w:rPr>
           <w:lang w:val="pt-BR"/>
@@ -23581,7 +23593,7 @@
           <w:lang w:val="pt-BR"/>
         </w:rPr>
       </w:pPr>
-      <w:bookmarkStart w:id="54" w:name="_Toc241779220"/>
+      <w:bookmarkStart w:id="54" w:name="_Toc241779705"/>
       <w:r>
         <w:rPr>
           <w:lang w:val="pt-BR"/>
@@ -23752,7 +23764,7 @@
           <w:lang w:val="pt-BR"/>
         </w:rPr>
       </w:pPr>
-      <w:bookmarkStart w:id="55" w:name="_Toc241779221"/>
+      <w:bookmarkStart w:id="55" w:name="_Toc241779706"/>
       <w:r>
         <w:rPr>
           <w:lang w:val="pt-BR"/>
@@ -24889,7 +24901,7 @@
           <w:lang w:val="pt-BR"/>
         </w:rPr>
       </w:pPr>
-      <w:bookmarkStart w:id="56" w:name="_Toc241779222"/>
+      <w:bookmarkStart w:id="56" w:name="_Toc241779707"/>
       <w:r>
         <w:rPr>
           <w:lang w:val="pt-BR"/>
@@ -26762,7 +26774,7 @@
           <w:lang w:val="pt-BR"/>
         </w:rPr>
       </w:pPr>
-      <w:bookmarkStart w:id="57" w:name="_Toc241779223"/>
+      <w:bookmarkStart w:id="57" w:name="_Toc241779708"/>
       <w:r>
         <w:rPr>
           <w:lang w:val="pt-BR"/>
@@ -26796,7 +26808,7 @@
           <w:lang w:val="pt-BR"/>
         </w:rPr>
       </w:pPr>
-      <w:bookmarkStart w:id="58" w:name="_Toc241779224"/>
+      <w:bookmarkStart w:id="58" w:name="_Toc241779709"/>
       <w:r>
         <w:rPr>
           <w:lang w:val="pt-BR"/>
@@ -26831,7 +26843,7 @@
           <w:lang w:val="pt-BR"/>
         </w:rPr>
       </w:pPr>
-      <w:bookmarkStart w:id="59" w:name="_Toc241779225"/>
+      <w:bookmarkStart w:id="59" w:name="_Toc241779710"/>
       <w:r>
         <w:rPr>
           <w:lang w:val="pt-BR"/>
@@ -26866,7 +26878,7 @@
           <w:lang w:val="pt-BR"/>
         </w:rPr>
       </w:pPr>
-      <w:bookmarkStart w:id="60" w:name="_Toc241779226"/>
+      <w:bookmarkStart w:id="60" w:name="_Toc241779711"/>
       <w:r>
         <w:rPr>
           <w:lang w:val="pt-BR"/>
@@ -26914,7 +26926,7 @@
           <w:lang w:val="pt-BR"/>
         </w:rPr>
       </w:pPr>
-      <w:bookmarkStart w:id="61" w:name="_Toc241779227"/>
+      <w:bookmarkStart w:id="61" w:name="_Toc241779712"/>
       <w:r>
         <w:rPr>
           <w:lang w:val="pt-BR"/>
@@ -26948,7 +26960,7 @@
           <w:lang w:val="pt-BR"/>
         </w:rPr>
       </w:pPr>
-      <w:bookmarkStart w:id="62" w:name="_Toc241779228"/>
+      <w:bookmarkStart w:id="62" w:name="_Toc241779713"/>
       <w:r>
         <w:rPr>
           <w:lang w:val="pt-BR"/>
@@ -26983,7 +26995,7 @@
           <w:lang w:val="pt-BR"/>
         </w:rPr>
       </w:pPr>
-      <w:bookmarkStart w:id="63" w:name="_Toc241779229"/>
+      <w:bookmarkStart w:id="63" w:name="_Toc241779714"/>
       <w:r>
         <w:rPr>
           <w:lang w:val="pt-BR"/>
@@ -27533,7 +27545,7 @@
           <w:lang w:val="pt-BR"/>
         </w:rPr>
       </w:pPr>
-      <w:bookmarkStart w:id="64" w:name="_Toc241779230"/>
+      <w:bookmarkStart w:id="64" w:name="_Toc241779715"/>
       <w:r>
         <w:rPr>
           <w:lang w:val="pt-BR"/>
@@ -27564,7 +27576,7 @@
         <w:pStyle w:val="Heading2"/>
         <w:spacing w:before="360" w:after="240" w:line="360" w:lineRule="auto"/>
       </w:pPr>
-      <w:bookmarkStart w:id="65" w:name="_Toc241779231"/>
+      <w:bookmarkStart w:id="65" w:name="_Toc241779716"/>
       <w:r>
         <w:rPr>
           <w:lang w:val="pt-BR"/>
@@ -28142,7 +28154,7 @@
                 <w:szCs w:val="20"/>
                 <w:lang w:val="pt-BR"/>
               </w:rPr>
-              <w:t>Mudanças perceptíveis de ao menos 15 %: 7, 4 e 4; de ao menos 6 %: 24, 5 e 5; inversões de sentido: 63, 7 e 7; energia de 61,8 %, 61,7 % e 62,4 % do pleno; nenhum minuto 2 lux abaixo do nível pedido nos três; atraso médio até a classe mínima de 63,8 min, 45,5 min e 44,0 min</w:t>
+              <w:t>Mudanças perceptíveis de ao menos 6 %: 24, 5 e 5; de ao menos 15 %: 7, 4 e 4; de ao menos 30 %, em conferência posterior: 2, 3 e 3; inversões de sentido: 63, 7 e 7; energia de 61,8 %, 61,7 % e 62,4 % do pleno; nenhum minuto 2 lux abaixo do nível pedido nos três; atraso médio até a classe mínima de 63,8 min, 45,5 min e 44,0 min</w:t>
             </w:r>
           </w:p>
         </w:tc>
@@ -28171,14 +28183,14 @@
         <w:rPr>
           <w:lang w:val="pt-BR"/>
         </w:rPr>
-        <w:t xml:space="preserve">Pelas regras de leitura fixadas antes das execuções, três constatações decorrem do Quadro 19. Retirar a inferência por regras tem custo medido: a programação por horário fixo deixa a via uma classe inteira abaixo do nível que a situação pede durante centenas de minutos, inclusive sob ocorrência. Retirar a previsão tem custo medido quando a contagem falha em horário movimentado, e nenhum efeito na madrugada, em que o histórico também indica pouca movimentação. Já o modelo treinado e a pertinência parcial mostraram-se substituíveis no sistema: com a série horária, a média sazonal iguala o modelo no déficit e o supera no acerto da contenção, e a tabela em degraus iguala a inferência nebulosa em energia, com menos inversões de sentido e saltos maiores. O acerto da contenção apoia-se em poucas horas e é indício, e não estimativa firme. No confronto com noites reais de 15 min, a inferência nebulosa produziu mais mudanças perceptíveis que as duas tabelas, nos dois limiares: nessas noites o volume cruzou os tercis poucas vezes, a tabela quase não trocou de classe, e a saída contínua </w:t>
+        <w:t xml:space="preserve">Pelas regras de leitura fixadas antes das execuções, três constatações decorrem do Quadro 19. Retirar a inferência por regras tem custo medido: a programação por horário fixo deixa a via uma classe inteira abaixo do nível que a situação pede durante centenas de minutos, inclusive sob ocorrência. Retirar a previsão tem custo medido quando a contagem falha em horário movimentado, e nenhum efeito na madrugada, em que o histórico também indica pouca movimentação. Já o modelo treinado e a pertinência parcial mostraram-se substituíveis no sistema: com a série horária, a média sazonal iguala o modelo no déficit e o supera no acerto da contenção, e a tabela em degraus iguala a inferência nebulosa em energia, com menos inversões de sentido e saltos maiores. O acerto da contenção apoia-se em poucas horas e é indício, e não estimativa firme. No confronto com noites reais de 15 min, a inferência nebulosa produziu mais mudanças perceptíveis que as duas tabelas, nos dois limiares: nessas noites o volume cruzou os </w:t>
       </w:r>
       <w:r>
         <w:rPr>
           <w:lang w:val="pt-BR"/>
         </w:rPr>
         <w:lastRenderedPageBreak/>
-        <w:t>acompanhou cada variação do volume. Em conferência posterior ao protocolo, com limiares de 20 % e de 30 % — este último o valor acima do qual, no mesmo estudo, o aumento é percebido também por observador ocupado em tarefa —, as contagens são de 3, 3 e 3 e de 2, 3 e 3; as maiores elevações da tabela são de 50 %, e as da inferência nebulosa, de 42 %.</w:t>
+        <w:t>tercis poucas vezes, a tabela quase não trocou de classe, e a saída contínua acompanhou cada variação do volume. No limiar de 30 %, reportado depois de conferidas as fontes, a inferência nebulosa tem uma mudança a menos que as tabelas (2, contra 3 e 3), e as suas maiores elevações são de 42 %, contra 50 % das tabelas; a 20 %, as três empatam em 3. A diferença a 30 % é de um único evento em oito noites e não altera a leitura: nos dois limiares fixados no protocolo, a inferência nebulosa não apresentou a vantagem exigida.</w:t>
       </w:r>
     </w:p>
     <w:p>
@@ -28592,7 +28604,7 @@
           <w:lang w:val="pt-BR"/>
         </w:rPr>
       </w:pPr>
-      <w:bookmarkStart w:id="66" w:name="_Toc241779232"/>
+      <w:bookmarkStart w:id="66" w:name="_Toc241779717"/>
       <w:r>
         <w:rPr>
           <w:lang w:val="pt-BR"/>
@@ -28610,7 +28622,7 @@
           <w:lang w:val="pt-BR"/>
         </w:rPr>
       </w:pPr>
-      <w:bookmarkStart w:id="67" w:name="_Toc241779233"/>
+      <w:bookmarkStart w:id="67" w:name="_Toc241779718"/>
       <w:r>
         <w:rPr>
           <w:lang w:val="pt-BR"/>
@@ -28644,7 +28656,7 @@
           <w:lang w:val="pt-BR"/>
         </w:rPr>
       </w:pPr>
-      <w:bookmarkStart w:id="68" w:name="_Toc241779234"/>
+      <w:bookmarkStart w:id="68" w:name="_Toc241779719"/>
       <w:r>
         <w:rPr>
           <w:lang w:val="pt-BR"/>
@@ -28678,7 +28690,7 @@
           <w:lang w:val="pt-BR"/>
         </w:rPr>
       </w:pPr>
-      <w:bookmarkStart w:id="69" w:name="_Toc241779235"/>
+      <w:bookmarkStart w:id="69" w:name="_Toc241779720"/>
       <w:r>
         <w:rPr>
           <w:lang w:val="pt-BR"/>
@@ -29280,7 +29292,7 @@
           <w:lang w:val="pt-BR"/>
         </w:rPr>
       </w:pPr>
-      <w:bookmarkStart w:id="70" w:name="_Toc241779236"/>
+      <w:bookmarkStart w:id="70" w:name="_Toc241779721"/>
       <w:r>
         <w:rPr>
           <w:lang w:val="pt-BR"/>
@@ -29315,7 +29327,7 @@
           <w:lang w:val="pt-BR"/>
         </w:rPr>
       </w:pPr>
-      <w:bookmarkStart w:id="71" w:name="_Toc241779237"/>
+      <w:bookmarkStart w:id="71" w:name="_Toc241779722"/>
       <w:r>
         <w:rPr>
           <w:lang w:val="pt-BR"/>
@@ -29350,7 +29362,7 @@
           <w:lang w:val="pt-BR"/>
         </w:rPr>
       </w:pPr>
-      <w:bookmarkStart w:id="72" w:name="_Toc241779238"/>
+      <w:bookmarkStart w:id="72" w:name="_Toc241779723"/>
       <w:r>
         <w:rPr>
           <w:lang w:val="pt-BR"/>
@@ -29600,7 +29612,7 @@
           <w:lang w:val="pt-BR"/>
         </w:rPr>
       </w:pPr>
-      <w:bookmarkStart w:id="73" w:name="_Toc241779239"/>
+      <w:bookmarkStart w:id="73" w:name="_Toc241779724"/>
       <w:r>
         <w:rPr>
           <w:lang w:val="pt-BR"/>
@@ -30896,7 +30908,7 @@
           <w:lang w:val="pt-BR"/>
         </w:rPr>
       </w:pPr>
-      <w:bookmarkStart w:id="74" w:name="_Toc241779240"/>
+      <w:bookmarkStart w:id="74" w:name="_Toc241779725"/>
       <w:r>
         <w:rPr>
           <w:lang w:val="pt-BR"/>
@@ -32399,7 +32411,7 @@
         <w:spacing w:before="480" w:after="280" w:line="360" w:lineRule="auto"/>
         <w:jc w:val="center"/>
       </w:pPr>
-      <w:bookmarkStart w:id="75" w:name="_Toc241779241"/>
+      <w:bookmarkStart w:id="75" w:name="_Toc241779726"/>
       <w:r>
         <w:rPr>
           <w:lang w:val="pt-BR"/>

</xml_diff>